<commit_message>
Report: match Figure 2 caption to the stacks' actual status
</commit_message>
<xml_diff>
--- a/report/RestoreCheck_DA3_Report.docx
+++ b/report/RestoreCheck_DA3_Report.docx
@@ -962,7 +962,7 @@
       <w:r>
         <w:t xml:space="preserve"> </w:t>
       </w:r>
-      <w:hyperlink w:history="1" r:id="rIdoeyzjkc7pqt2vnvx-w-rl">
+      <w:hyperlink w:history="1" r:id="rIdqgf-bxu_ewzbm4zsorjxf">
         <w:r>
           <w:rPr>
             <w:color w:val="0563C1"/>
@@ -1011,7 +1011,7 @@
       <w:r>
         <w:t xml:space="preserve"> </w:t>
       </w:r>
-      <w:hyperlink w:history="1" r:id="rIdqs8fckymwvhp_1opkuu8a">
+      <w:hyperlink w:history="1" r:id="rIdr8owcpmdbg0hal5sm5wkp">
         <w:r>
           <w:rPr>
             <w:color w:val="0563C1"/>
@@ -1036,7 +1036,7 @@
       <w:r>
         <w:t xml:space="preserve"> [Team member names], [Faculty name], "RestoreCheck: Automated Backup Recoverability Verification and Disaster-Recovery Testing on AWS," GitHub repository, 2026. [Online]. Available: </w:t>
       </w:r>
-      <w:hyperlink w:history="1" r:id="rIdimm0yiz0ns-jbiai6bkt4">
+      <w:hyperlink w:history="1" r:id="rIdzylq0-vyc4v4l-xm4jdkb">
         <w:r>
           <w:rPr>
             <w:color w:val="0563C1"/>
@@ -2950,7 +2950,7 @@
           <w:iCs/>
           <w:color w:val="6B7280"/>
         </w:rPr>
-        <w:t xml:space="preserve">[ Insert screenshot: CloudFormation: the restorecheck and restorecheck-demo-db stacks (CREATE_COMPLETE) ]</w:t>
+        <w:t xml:space="preserve">[ Insert screenshot: CloudFormation: the deployed restorecheck and restorecheck-demo-db stacks ]</w:t>
       </w:r>
     </w:p>
     <w:p>
@@ -2965,7 +2965,7 @@
           <w:sz w:val="20"/>
           <w:szCs w:val="20"/>
         </w:rPr>
-        <w:t xml:space="preserve">Figure 2. CloudFormation: the restorecheck and restorecheck-demo-db stacks (CREATE_COMPLETE)</w:t>
+        <w:t xml:space="preserve">Figure 2. CloudFormation: the deployed restorecheck and restorecheck-demo-db stacks</w:t>
       </w:r>
     </w:p>
     <w:p>
@@ -5051,7 +5051,7 @@
       <w:r>
         <w:t xml:space="preserve">Amazon Web Services, "Data protection in Amazon S3," Amazon S3 User Guide. [Online]. Available: </w:t>
       </w:r>
-      <w:hyperlink w:history="1" r:id="rIdeqptmpii8hwcywjgd_qq2">
+      <w:hyperlink w:history="1" r:id="rIdaqgajb6hgwtpjaa6velx-">
         <w:r>
           <w:rPr>
             <w:color w:val="0563C1"/>
@@ -5072,7 +5072,7 @@
       <w:r>
         <w:t xml:space="preserve">Cybersecurity and Infrastructure Security Agency, "#StopRansomware guide." [Online]. Available: </w:t>
       </w:r>
-      <w:hyperlink w:history="1" r:id="rIds6sxjwa9lzsxunnghmfti">
+      <w:hyperlink w:history="1" r:id="rIdvvop93vqty46osonaehbf">
         <w:r>
           <w:rPr>
             <w:color w:val="0563C1"/>
@@ -5103,7 +5103,7 @@
       <w:r>
         <w:t xml:space="preserve">, 2003. [Online]. Available: </w:t>
       </w:r>
-      <w:hyperlink w:history="1" r:id="rIdye-p-mp8qkz-xzpkpg-pe">
+      <w:hyperlink w:history="1" r:id="rId5w4kovmf9ozjroy6sjoev">
         <w:r>
           <w:rPr>
             <w:color w:val="0563C1"/>
@@ -5124,7 +5124,7 @@
       <w:r>
         <w:t xml:space="preserve">Amazon Web Services, "Shared responsibility model." [Online]. Available: </w:t>
       </w:r>
-      <w:hyperlink w:history="1" r:id="rIddbcwmgao-yynngd66_245">
+      <w:hyperlink w:history="1" r:id="rId_gtxgugsyxbsmsvcadpka">
         <w:r>
           <w:rPr>
             <w:color w:val="0563C1"/>
@@ -5158,7 +5158,7 @@
       <w:r>
         <w:t xml:space="preserve">doi: </w:t>
       </w:r>
-      <w:hyperlink w:history="1" r:id="rIdflemx9ygbosfwgjn6f3qm">
+      <w:hyperlink w:history="1" r:id="rIdvtuvw2ksfrh4fags8jh4m">
         <w:r>
           <w:rPr>
             <w:color w:val="0563C1"/>
@@ -5173,7 +5173,7 @@
       <w:r>
         <w:t xml:space="preserve"> Free conference version: </w:t>
       </w:r>
-      <w:hyperlink w:history="1" r:id="rIdm8qvd6hkmclwcjwh5_hqv">
+      <w:hyperlink w:history="1" r:id="rId1ktvg62hqbikeprhbao84">
         <w:r>
           <w:rPr>
             <w:color w:val="0563C1"/>
@@ -5194,7 +5194,7 @@
       <w:r>
         <w:t xml:space="preserve">Amazon Web Services, "Encrypting Amazon RDS resources," Amazon RDS User Guide. [Online]. Available: </w:t>
       </w:r>
-      <w:hyperlink w:history="1" r:id="rIdk-iycmpbd5er5hfct28bs">
+      <w:hyperlink w:history="1" r:id="rId-lmaqcp-3juf5o3odtpp-">
         <w:r>
           <w:rPr>
             <w:color w:val="0563C1"/>
@@ -5215,7 +5215,7 @@
       <w:r>
         <w:t xml:space="preserve">GitLab Inc., "Postmortem of database outage of January 31," GitLab Blog, Feb. 2017. [Online]. Available: </w:t>
       </w:r>
-      <w:hyperlink w:history="1" r:id="rIdzs9unuy6pcx_bjkep_dsg">
+      <w:hyperlink w:history="1" r:id="rId7rtrtrxqukuvnx1r91apa">
         <w:r>
           <w:rPr>
             <w:color w:val="0563C1"/>
@@ -5236,7 +5236,7 @@
       <w:r>
         <w:t xml:space="preserve">Amazon Web Services, "REL09-BP04 Perform periodic recovery of the data to verify backup integrity and processes," AWS Well-Architected Framework. [Online]. Available: </w:t>
       </w:r>
-      <w:hyperlink w:history="1" r:id="rIdcgj_7t5wyfwlmfvdldius">
+      <w:hyperlink w:history="1" r:id="rId7t12xf6n5hnev207dekn7">
         <w:r>
           <w:rPr>
             <w:color w:val="0563C1"/>
@@ -5257,7 +5257,7 @@
       <w:r>
         <w:t xml:space="preserve">Amazon Web Services, "Reliability pillar," AWS Well-Architected Framework. [Online]. Available: </w:t>
       </w:r>
-      <w:hyperlink w:history="1" r:id="rIdf8tpe6agy4totbwsaifxt">
+      <w:hyperlink w:history="1" r:id="rIdvbwjvbl5iwfovih8rywb2">
         <w:r>
           <w:rPr>
             <w:color w:val="0563C1"/>
@@ -5281,7 +5281,7 @@
       <w:r>
         <w:t xml:space="preserve">doi: </w:t>
       </w:r>
-      <w:hyperlink w:history="1" r:id="rIdbstqiqsvaadby74aoeihj">
+      <w:hyperlink w:history="1" r:id="rIdajxcelhr8zgm7cdkbzgvv">
         <w:r>
           <w:rPr>
             <w:color w:val="0563C1"/>
@@ -5308,7 +5308,7 @@
       <w:r>
         <w:t xml:space="preserve">doi: </w:t>
       </w:r>
-      <w:hyperlink w:history="1" r:id="rId8ldqvrpgmemtif1cskwdx">
+      <w:hyperlink w:history="1" r:id="rIdz81spxxbrrrhtlwldy1xe">
         <w:r>
           <w:rPr>
             <w:color w:val="0563C1"/>
@@ -5339,7 +5339,7 @@
       <w:r>
         <w:t xml:space="preserve">, ISO/IEC 27031:2011. [Online]. Available: </w:t>
       </w:r>
-      <w:hyperlink w:history="1" r:id="rIdu0fjmeb7etvndf2-6myno">
+      <w:hyperlink w:history="1" r:id="rId5auw9vf-uzj3l0uqnhfad">
         <w:r>
           <w:rPr>
             <w:color w:val="0563C1"/>
@@ -5360,7 +5360,7 @@
       <w:r>
         <w:t xml:space="preserve">Amazon Web Services, "Lambda quotas," AWS Lambda Developer Guide. [Online]. Available: </w:t>
       </w:r>
-      <w:hyperlink w:history="1" r:id="rIdsuce-d1bep3hbmjyi-_-h">
+      <w:hyperlink w:history="1" r:id="rIdlcs_pai-d_lmmzvuf74d5">
         <w:r>
           <w:rPr>
             <w:color w:val="0563C1"/>
@@ -5381,7 +5381,7 @@
       <w:r>
         <w:t xml:space="preserve">Amazon Web Services, "What is Step Functions?," AWS Step Functions Developer Guide. [Online]. Available: </w:t>
       </w:r>
-      <w:hyperlink w:history="1" r:id="rIdbf3wfbswew-z6b6rm0qzq">
+      <w:hyperlink w:history="1" r:id="rIdb4fnkv1uxsfnke5shrrce">
         <w:r>
           <w:rPr>
             <w:color w:val="0563C1"/>
@@ -5402,7 +5402,7 @@
       <w:r>
         <w:t xml:space="preserve">Amazon Web Services, "Handling errors in Step Functions workflows," AWS Step Functions Developer Guide. [Online]. Available: </w:t>
       </w:r>
-      <w:hyperlink w:history="1" r:id="rIdzdsx8743vli8h-eqwwojs">
+      <w:hyperlink w:history="1" r:id="rIdaljceztpx0fp7ifujx5hu">
         <w:r>
           <w:rPr>
             <w:color w:val="0563C1"/>
@@ -5423,7 +5423,7 @@
       <w:r>
         <w:t xml:space="preserve">Amazon Web Services, "Security best practices in IAM," AWS IAM User Guide. [Online]. Available: </w:t>
       </w:r>
-      <w:hyperlink w:history="1" r:id="rId9onvrfjvocrvc9g3zoyd0">
+      <w:hyperlink w:history="1" r:id="rIdmthectt48vm4rmrenqzmw">
         <w:r>
           <w:rPr>
             <w:color w:val="0563C1"/>
@@ -5444,7 +5444,7 @@
       <w:r>
         <w:t xml:space="preserve">Amazon Web Services, "IAM JSON policy reference," AWS IAM User Guide. [Online]. Available: </w:t>
       </w:r>
-      <w:hyperlink w:history="1" r:id="rIdhmvdzzz1xxatmudcevbgj">
+      <w:hyperlink w:history="1" r:id="rIdcrc0ebf8kqorrrcprm8w-">
         <w:r>
           <w:rPr>
             <w:color w:val="0563C1"/>
@@ -5465,7 +5465,7 @@
       <w:r>
         <w:t xml:space="preserve">Amazon Web Services, "IAM database authentication for MariaDB, MySQL, and PostgreSQL," Amazon RDS User Guide. [Online]. Available: </w:t>
       </w:r>
-      <w:hyperlink w:history="1" r:id="rIdjoy3m5hbewicwpljrbfhm">
+      <w:hyperlink w:history="1" r:id="rIdegcbereytbq1tsbzcog45">
         <w:r>
           <w:rPr>
             <w:color w:val="0563C1"/>
@@ -5486,7 +5486,7 @@
       <w:r>
         <w:t xml:space="preserve">Amazon Web Services, "Using SSL/TLS to encrypt a connection to a DB instance or cluster," Amazon RDS User Guide. [Online]. Available: </w:t>
       </w:r>
-      <w:hyperlink w:history="1" r:id="rIdt79_z-gq86_rxzy6udsen">
+      <w:hyperlink w:history="1" r:id="rIdmhh3akesjmshphonjfwo5">
         <w:r>
           <w:rPr>
             <w:color w:val="0563C1"/>
@@ -5507,7 +5507,7 @@
       <w:r>
         <w:t xml:space="preserve">Amazon Web Services, "Control traffic to your AWS resources using security groups," Amazon VPC User Guide. [Online]. Available: </w:t>
       </w:r>
-      <w:hyperlink w:history="1" r:id="rIdrmorkclyabsmtqahfq4c0">
+      <w:hyperlink w:history="1" r:id="rId1juw503gq59twiwqzbbn7">
         <w:r>
           <w:rPr>
             <w:color w:val="0563C1"/>
@@ -5528,7 +5528,7 @@
       <w:r>
         <w:t xml:space="preserve">Amazon Web Services, "Giving Lambda event functions access to resources in an Amazon VPC," AWS Lambda Developer Guide. [Online]. Available: </w:t>
       </w:r>
-      <w:hyperlink w:history="1" r:id="rIdzwsbpacocz1heobj8uacc">
+      <w:hyperlink w:history="1" r:id="rIdtpnxeadphwmxmgap492t8">
         <w:r>
           <w:rPr>
             <w:color w:val="0563C1"/>
@@ -5549,7 +5549,7 @@
       <w:r>
         <w:t xml:space="preserve">Amazon Web Services, "What is the AWS Serverless Application Model (AWS SAM)?," AWS SAM Developer Guide. [Online]. Available: </w:t>
       </w:r>
-      <w:hyperlink w:history="1" r:id="rId1efzyd2yccb98iaidbxy2">
+      <w:hyperlink w:history="1" r:id="rIdkmfp7frcgefzaylp2vqgs">
         <w:r>
           <w:rPr>
             <w:color w:val="0563C1"/>
@@ -5570,7 +5570,7 @@
       <w:r>
         <w:t xml:space="preserve">Amazon Web Services, "What is CloudFormation?," AWS CloudFormation User Guide. [Online]. Available: </w:t>
       </w:r>
-      <w:hyperlink w:history="1" r:id="rIduaiidp2zsyh72sudw8jm_">
+      <w:hyperlink w:history="1" r:id="rIdm9lkapydhjsrguufpfdhb">
         <w:r>
           <w:rPr>
             <w:color w:val="0563C1"/>
@@ -5591,7 +5591,7 @@
       <w:r>
         <w:t xml:space="preserve">United Nations, "Goal 9: Build resilient infrastructure, promote inclusive and sustainable industrialization and foster innovation." [Online]. Available: </w:t>
       </w:r>
-      <w:hyperlink w:history="1" r:id="rIddbxuemuslf7sny5iezkx8">
+      <w:hyperlink w:history="1" r:id="rIdupaw51_7rukasvo5oqzan">
         <w:r>
           <w:rPr>
             <w:color w:val="0563C1"/>
@@ -5612,7 +5612,7 @@
       <w:r>
         <w:t xml:space="preserve">United Nations, "Goal 11: Make cities and human settlements inclusive, safe, resilient and sustainable." [Online]. Available: </w:t>
       </w:r>
-      <w:hyperlink w:history="1" r:id="rIdpobe-_cndp7uzghnfryf3">
+      <w:hyperlink w:history="1" r:id="rId3a8kqgbdp6iyojng_keca">
         <w:r>
           <w:rPr>
             <w:color w:val="0563C1"/>
@@ -5643,7 +5643,7 @@
       <w:r>
         <w:t xml:space="preserve">, 2010. [Online]. Available: </w:t>
       </w:r>
-      <w:hyperlink w:history="1" r:id="rId0vgzlkxkc3swftrgetk-u">
+      <w:hyperlink w:history="1" r:id="rIdcdozjbqpttupijbzqvd89">
         <w:r>
           <w:rPr>
             <w:color w:val="0563C1"/>
@@ -5677,7 +5677,7 @@
       <w:r>
         <w:t xml:space="preserve">doi: </w:t>
       </w:r>
-      <w:hyperlink w:history="1" r:id="rIdkzi2rka8ys7l-xbjunkzg">
+      <w:hyperlink w:history="1" r:id="rIdunw_55r3lg6lpv9dke2i2">
         <w:r>
           <w:rPr>
             <w:color w:val="0563C1"/>
@@ -5714,7 +5714,7 @@
       <w:r>
         <w:t xml:space="preserve">doi: </w:t>
       </w:r>
-      <w:hyperlink w:history="1" r:id="rIdfzitrifrpx0mhzamxfbli">
+      <w:hyperlink w:history="1" r:id="rIdkzvdfl4ufheabkrumulvs">
         <w:r>
           <w:rPr>
             <w:color w:val="0563C1"/>
@@ -5751,7 +5751,7 @@
       <w:r>
         <w:t xml:space="preserve">doi: </w:t>
       </w:r>
-      <w:hyperlink w:history="1" r:id="rId998me0oifctyubfsxiz8n">
+      <w:hyperlink w:history="1" r:id="rIddcav2sfrizpvsukki5guw">
         <w:r>
           <w:rPr>
             <w:color w:val="0563C1"/>
@@ -5785,7 +5785,7 @@
       <w:r>
         <w:t xml:space="preserve">, 2008. [Online]. Available: </w:t>
       </w:r>
-      <w:hyperlink w:history="1" r:id="rIdq12b4d6zz4x05o8ef3lfc">
+      <w:hyperlink w:history="1" r:id="rId-vvr9fpl_pvd3kd62g7gv">
         <w:r>
           <w:rPr>
             <w:color w:val="0563C1"/>
@@ -5816,7 +5816,7 @@
       <w:r>
         <w:t xml:space="preserve">, 2007. [Online]. Available: </w:t>
       </w:r>
-      <w:hyperlink w:history="1" r:id="rId1nfkjd8njmvmauqvlofn3">
+      <w:hyperlink w:history="1" r:id="rIdsj6w75quj1edeb_he43qi">
         <w:r>
           <w:rPr>
             <w:color w:val="0563C1"/>
@@ -5850,7 +5850,7 @@
       <w:r>
         <w:t xml:space="preserve">doi: </w:t>
       </w:r>
-      <w:hyperlink w:history="1" r:id="rIdsdxnvnbghu7orwldmm38i">
+      <w:hyperlink w:history="1" r:id="rId9fliivjq-si_h4nhlbpnl">
         <w:r>
           <w:rPr>
             <w:color w:val="0563C1"/>
@@ -5884,7 +5884,7 @@
       <w:r>
         <w:t xml:space="preserve">, 2014. [Online]. Available: </w:t>
       </w:r>
-      <w:hyperlink w:history="1" r:id="rIden6x3mvgmijzvnmw_kovs">
+      <w:hyperlink w:history="1" r:id="rId8ibdtdch4zzd49licmnzr">
         <w:r>
           <w:rPr>
             <w:color w:val="0563C1"/>
@@ -5918,7 +5918,7 @@
       <w:r>
         <w:t xml:space="preserve">doi: </w:t>
       </w:r>
-      <w:hyperlink w:history="1" r:id="rId3tndu-i4ojukosguyfakh">
+      <w:hyperlink w:history="1" r:id="rIdi1gc2cdb4e_m2mklexfux">
         <w:r>
           <w:rPr>
             <w:color w:val="0563C1"/>
@@ -5955,7 +5955,7 @@
       <w:r>
         <w:t xml:space="preserve">doi: </w:t>
       </w:r>
-      <w:hyperlink w:history="1" r:id="rIdybnet1si8swvv0dosqy9d">
+      <w:hyperlink w:history="1" r:id="rIdnn-l3el6qi9lhupcrj48f">
         <w:r>
           <w:rPr>
             <w:color w:val="0563C1"/>
@@ -5989,7 +5989,7 @@
       <w:r>
         <w:t xml:space="preserve">, B. Beyer, C. Jones, J. Petoff, and N. R. Murphy, Eds. Sebastopol, CA, USA: O'Reilly Media, 2016, ch. 26. [Online]. Available: </w:t>
       </w:r>
-      <w:hyperlink w:history="1" r:id="rIdmm-qqncwjg8hccfgld8my">
+      <w:hyperlink w:history="1" r:id="rIdmci070ngawxyl3ftab0yz">
         <w:r>
           <w:rPr>
             <w:color w:val="0563C1"/>
@@ -6010,7 +6010,7 @@
       <w:r>
         <w:t xml:space="preserve">Amazon Web Services, "Restore testing," AWS Backup Developer Guide. [Online]. Available: </w:t>
       </w:r>
-      <w:hyperlink w:history="1" r:id="rIdz9cl6bcprw09jvrwujdu0">
+      <w:hyperlink w:history="1" r:id="rId19idqjxp876t59g6ghmt5">
         <w:r>
           <w:rPr>
             <w:color w:val="0563C1"/>
@@ -6031,7 +6031,7 @@
       <w:r>
         <w:t xml:space="preserve">Amazon Web Services, "What is AWS Backup?," AWS Backup Developer Guide. [Online]. Available: </w:t>
       </w:r>
-      <w:hyperlink w:history="1" r:id="rIdivdxui_9hnc0r1lbdge09">
+      <w:hyperlink w:history="1" r:id="rIdl4oiher5om7jfjsrjomlt">
         <w:r>
           <w:rPr>
             <w:color w:val="0563C1"/>
@@ -6052,7 +6052,7 @@
       <w:r>
         <w:t xml:space="preserve">Amazon Web Services, "Amazon States Language." [Online]. Available: </w:t>
       </w:r>
-      <w:hyperlink w:history="1" r:id="rIdttvvmlxnccdfq-bw9t1po">
+      <w:hyperlink w:history="1" r:id="rIduyd91wbexw1tsf8djo70t">
         <w:r>
           <w:rPr>
             <w:color w:val="0563C1"/>
@@ -6073,7 +6073,7 @@
       <w:r>
         <w:t xml:space="preserve">Amazon Web Services, "Creating a scheduled rule (legacy) in Amazon EventBridge," Amazon EventBridge User Guide. [Online]. Available: </w:t>
       </w:r>
-      <w:hyperlink w:history="1" r:id="rIdpis6r43cs300tjdtkfrxv">
+      <w:hyperlink w:history="1" r:id="rIdsbeiyb5eypepkurav4k9p">
         <w:r>
           <w:rPr>
             <w:color w:val="0563C1"/>
@@ -6094,7 +6094,7 @@
       <w:r>
         <w:t xml:space="preserve">Amazon Web Services, "Introduction to backups," Amazon RDS User Guide. [Online]. Available: </w:t>
       </w:r>
-      <w:hyperlink w:history="1" r:id="rIdra-__sbb1agcfmx_xyfzm">
+      <w:hyperlink w:history="1" r:id="rIdcvazzsikpf3eiltbh7sks">
         <w:r>
           <w:rPr>
             <w:color w:val="0563C1"/>
@@ -6115,7 +6115,7 @@
       <w:r>
         <w:t xml:space="preserve">Amazon Web Services, "Restoring to a DB instance," Amazon RDS User Guide. [Online]. Available: </w:t>
       </w:r>
-      <w:hyperlink w:history="1" r:id="rIdtztob-bbn9dre_hhhel8f">
+      <w:hyperlink w:history="1" r:id="rId2irmpd-pfioz2fb0nldcj">
         <w:r>
           <w:rPr>
             <w:color w:val="0563C1"/>
@@ -6136,7 +6136,7 @@
       <w:r>
         <w:t xml:space="preserve">Amazon Web Services, "Viewing instance status," Amazon RDS User Guide. [Online]. Available: </w:t>
       </w:r>
-      <w:hyperlink w:history="1" r:id="rIdz6mbwq_1mu0tntbdvwp7i">
+      <w:hyperlink w:history="1" r:id="rIdekfjr_xsvly6wv4rqxbzw">
         <w:r>
           <w:rPr>
             <w:color w:val="0563C1"/>
@@ -6157,7 +6157,7 @@
       <w:r>
         <w:t xml:space="preserve">Amazon Web Services, "Core components of Amazon DynamoDB," Amazon DynamoDB Developer Guide. [Online]. Available: </w:t>
       </w:r>
-      <w:hyperlink w:history="1" r:id="rIdrps-y_ri9nq0f4809ic1b">
+      <w:hyperlink w:history="1" r:id="rIdb1o3fcbwp5feuhuabsazk">
         <w:r>
           <w:rPr>
             <w:color w:val="0563C1"/>
@@ -6178,7 +6178,7 @@
       <w:r>
         <w:t xml:space="preserve">Amazon Web Services, "Publish custom metrics (PutMetricData / EMF)," Amazon CloudWatch User Guide. [Online]. Available: </w:t>
       </w:r>
-      <w:hyperlink w:history="1" r:id="rIdww6rw2rbd0jljoc-jcln8">
+      <w:hyperlink w:history="1" r:id="rIdacmktthhi4pgmf5ni1gph">
         <w:r>
           <w:rPr>
             <w:color w:val="0563C1"/>
@@ -6199,7 +6199,7 @@
       <w:r>
         <w:t xml:space="preserve">Amazon Web Services, "Amazon SNS email subscription setup and management," Amazon SNS Developer Guide. [Online]. Available: </w:t>
       </w:r>
-      <w:hyperlink w:history="1" r:id="rIdqrhj40cfvvbjaqlh999wk">
+      <w:hyperlink w:history="1" r:id="rIdnvlgmbmabsqpx4xqwezfy">
         <w:r>
           <w:rPr>
             <w:color w:val="0563C1"/>
@@ -6220,7 +6220,7 @@
       <w:r>
         <w:t xml:space="preserve">Amazon Web Services, "Using Amazon CloudWatch dashboards," Amazon CloudWatch User Guide. [Online]. Available: </w:t>
       </w:r>
-      <w:hyperlink w:history="1" r:id="rIdfx8fdxdkq7in5dkmw0r6l">
+      <w:hyperlink w:history="1" r:id="rIdepjnshljy6355saudygyq">
         <w:r>
           <w:rPr>
             <w:color w:val="0563C1"/>
@@ -6241,7 +6241,7 @@
       <w:r>
         <w:t xml:space="preserve">Amazon Web Services, "Service control policies (SCPs)," AWS Organizations User Guide. [Online]. Available: </w:t>
       </w:r>
-      <w:hyperlink w:history="1" r:id="rIdw3ucffzow361tpkuc4fpg">
+      <w:hyperlink w:history="1" r:id="rIdntvjb8io7qqe-ggesbpb_">
         <w:r>
           <w:rPr>
             <w:color w:val="0563C1"/>
@@ -6262,7 +6262,7 @@
       <w:r>
         <w:t xml:space="preserve">Amazon Web Services, "Disaster recovery (DR) objectives," AWS Well-Architected Framework. [Online]. Available: </w:t>
       </w:r>
-      <w:hyperlink w:history="1" r:id="rIdrermkjht5pmgeapog94l5">
+      <w:hyperlink w:history="1" r:id="rIdhvtszla511xpwnl6ctlag">
         <w:r>
           <w:rPr>
             <w:color w:val="0563C1"/>
@@ -6283,7 +6283,7 @@
       <w:r>
         <w:t xml:space="preserve">Moto contributors, "Moto: Mock AWS services." [Online]. Available: </w:t>
       </w:r>
-      <w:hyperlink w:history="1" r:id="rIdwzv_fyto9tifgph-5wpk9">
+      <w:hyperlink w:history="1" r:id="rId8x-82r56pbfv7v3n3esuy">
         <w:r>
           <w:rPr>
             <w:color w:val="0563C1"/>
@@ -6307,7 +6307,7 @@
       <w:r>
         <w:t xml:space="preserve">doi: </w:t>
       </w:r>
-      <w:hyperlink w:history="1" r:id="rIdzuy0pa2ahzoqthvsr6rgt">
+      <w:hyperlink w:history="1" r:id="rIdd2ggwcws3l6iq-53i4phz">
         <w:r>
           <w:rPr>
             <w:color w:val="0563C1"/>
@@ -6331,7 +6331,7 @@
       <w:r>
         <w:t xml:space="preserve">Amazon Web Services, "Disaster recovery of workloads on AWS: Recovery in the cloud," AWS Whitepaper. [Online]. Available: </w:t>
       </w:r>
-      <w:hyperlink w:history="1" r:id="rIdh1mwlkxur6nezwi_tbswz">
+      <w:hyperlink w:history="1" r:id="rIdvkllmwdpxmyryhqta8qfm">
         <w:r>
           <w:rPr>
             <w:color w:val="0563C1"/>
@@ -6352,7 +6352,7 @@
       <w:r>
         <w:t xml:space="preserve">Amazon Web Services, "Boto3 documentation," AWS SDK for Python. [Online]. Available: </w:t>
       </w:r>
-      <w:hyperlink w:history="1" r:id="rIddywulrthpkwjkfe9agl-r">
+      <w:hyperlink w:history="1" r:id="rId2offpm-aifp9ibsjt6okr">
         <w:r>
           <w:rPr>
             <w:color w:val="0563C1"/>
@@ -6373,7 +6373,7 @@
       <w:r>
         <w:t xml:space="preserve">The PostgreSQL Global Development Group, "Backup and restore," PostgreSQL Documentation. [Online]. Available: </w:t>
       </w:r>
-      <w:hyperlink w:history="1" r:id="rIdwnlxq61vgjkhjnzn2c3ug">
+      <w:hyperlink w:history="1" r:id="rIdd-rppgcltiiqxgnzgkmig">
         <w:r>
           <w:rPr>
             <w:color w:val="0563C1"/>
@@ -6404,7 +6404,7 @@
       <w:r>
         <w:t xml:space="preserve">, "pg8000: A pure-Python PostgreSQL driver," Python Package Index. [Online]. Available: </w:t>
       </w:r>
-      <w:hyperlink w:history="1" r:id="rId4iozi60gydpu8rknxmxbv">
+      <w:hyperlink w:history="1" r:id="rId70yy61aaaniuatrrgmohx">
         <w:r>
           <w:rPr>
             <w:color w:val="0563C1"/>
@@ -6425,7 +6425,7 @@
       <w:r>
         <w:t xml:space="preserve">LocalStack, "LocalStack documentation." [Online]. Available: </w:t>
       </w:r>
-      <w:hyperlink w:history="1" r:id="rIdk26u5cim_kxcw64m9bdal">
+      <w:hyperlink w:history="1" r:id="rIdg1ly-bgac5dq9doh9jfqz">
         <w:r>
           <w:rPr>
             <w:color w:val="0563C1"/>

</xml_diff>

<commit_message>
Report generator: embed screenshots from report/figures
WITH_FIGURES=1 inserts the console screenshots (scaled to the text
width, multi-part figures side by side in height) and writes
RestoreCheck_DA3_Report_with_figures.docx. Both the screenshots and that
file are git-ignored because they show account details; the committed
report keeps placeholders. Figures are numbered automatically, adding a
live-run graph, the failed run's check output and the checker policy.

Co-Authored-By: Claude Opus 5.5 <noreply@anthropic.com>
</commit_message>
<xml_diff>
--- a/report/RestoreCheck_DA3_Report.docx
+++ b/report/RestoreCheck_DA3_Report.docx
@@ -962,7 +962,7 @@
       <w:r>
         <w:t xml:space="preserve"> </w:t>
       </w:r>
-      <w:hyperlink w:history="1" r:id="rIdqgf-bxu_ewzbm4zsorjxf">
+      <w:hyperlink w:history="1" r:id="rIdgtc26zr2xuvexrx6ujend">
         <w:r>
           <w:rPr>
             <w:color w:val="0563C1"/>
@@ -1011,7 +1011,7 @@
       <w:r>
         <w:t xml:space="preserve"> </w:t>
       </w:r>
-      <w:hyperlink w:history="1" r:id="rIdr8owcpmdbg0hal5sm5wkp">
+      <w:hyperlink w:history="1" r:id="rIdu2q1trdk_b1gqb5c1ll1o">
         <w:r>
           <w:rPr>
             <w:color w:val="0563C1"/>
@@ -1036,7 +1036,7 @@
       <w:r>
         <w:t xml:space="preserve"> [Team member names], [Faculty name], "RestoreCheck: Automated Backup Recoverability Verification and Disaster-Recovery Testing on AWS," GitHub repository, 2026. [Online]. Available: </w:t>
       </w:r>
-      <w:hyperlink w:history="1" r:id="rIdzylq0-vyc4v4l-xm4jdkb">
+      <w:hyperlink w:history="1" r:id="rIdggcolakbdhtmryuusn1th">
         <w:r>
           <w:rPr>
             <w:color w:val="0563C1"/>
@@ -2929,7 +2929,7 @@
         <w:jc w:val="both"/>
       </w:pPr>
       <w:r>
-        <w:t xml:space="preserve">Screenshots taken from the deployed system on AWS (ap-southeast-2).</w:t>
+        <w:t xml:space="preserve">Screenshots taken from the deployed system on AWS (ap-southeast-2) on 21–22 October 2026.</w:t>
       </w:r>
     </w:p>
     <w:p>
@@ -2986,7 +2986,7 @@
           <w:iCs/>
           <w:color w:val="6B7280"/>
         </w:rPr>
-        <w:t xml:space="preserve">[ Insert screenshot: Step Functions: graph view of a PASSED execution ]</w:t>
+        <w:t xml:space="preserve">[ Insert screenshot: Step Functions: graph view of a PASSED execution, every step green and ending in BackupVerified ]</w:t>
       </w:r>
     </w:p>
     <w:p>
@@ -3001,7 +3001,7 @@
           <w:sz w:val="20"/>
           <w:szCs w:val="20"/>
         </w:rPr>
-        <w:t xml:space="preserve">Figure 3. Step Functions: graph view of a PASSED execution</w:t>
+        <w:t xml:space="preserve">Figure 3. Step Functions: graph view of a PASSED execution, every step green and ending in BackupVerified</w:t>
       </w:r>
     </w:p>
     <w:p>
@@ -3022,7 +3022,7 @@
           <w:iCs/>
           <w:color w:val="6B7280"/>
         </w:rPr>
-        <w:t xml:space="preserve">[ Insert screenshot: Step Functions: graph view of a FAILED execution (ending in BackupNotVerified) ]</w:t>
+        <w:t xml:space="preserve">[ Insert screenshot: Step Functions: a run in progress, looping through WaitForRestore and CheckRestoreStatus until the restored instance is available ]</w:t>
       </w:r>
     </w:p>
     <w:p>
@@ -3037,7 +3037,7 @@
           <w:sz w:val="20"/>
           <w:szCs w:val="20"/>
         </w:rPr>
-        <w:t xml:space="preserve">Figure 4. Step Functions: graph view of a FAILED execution (ending in BackupNotVerified)</w:t>
+        <w:t xml:space="preserve">Figure 4. Step Functions: a run in progress, looping through WaitForRestore and CheckRestoreStatus until the restored instance is available</w:t>
       </w:r>
     </w:p>
     <w:p>
@@ -3058,7 +3058,7 @@
           <w:iCs/>
           <w:color w:val="6B7280"/>
         </w:rPr>
-        <w:t xml:space="preserve">[ Insert screenshot: RDS console during a run: the temporary restorecheck-tmp-* instance beside the source database ]</w:t>
+        <w:t xml:space="preserve">[ Insert screenshot: Step Functions: the FAILED corrupt-data execution, ending in the red BackupNotVerified state ]</w:t>
       </w:r>
     </w:p>
     <w:p>
@@ -3073,7 +3073,7 @@
           <w:sz w:val="20"/>
           <w:szCs w:val="20"/>
         </w:rPr>
-        <w:t xml:space="preserve">Figure 5. RDS console during a run: the temporary restorecheck-tmp-* instance beside the source database</w:t>
+        <w:t xml:space="preserve">Figure 5. Step Functions: the FAILED corrupt-data execution, ending in the red BackupNotVerified state</w:t>
       </w:r>
     </w:p>
     <w:p>
@@ -3094,7 +3094,7 @@
           <w:iCs/>
           <w:color w:val="6B7280"/>
         </w:rPr>
-        <w:t xml:space="preserve">[ Insert screenshot: The SNS alert email (RestoreCheck FAILED) received for a broken backup ]</w:t>
+        <w:t xml:space="preserve">[ Insert screenshot: Output of the RunIntegrityChecks step in the corrupt-data run: canary_checksum failed while every other check passed ]</w:t>
       </w:r>
     </w:p>
     <w:p>
@@ -3109,7 +3109,7 @@
           <w:sz w:val="20"/>
           <w:szCs w:val="20"/>
         </w:rPr>
-        <w:t xml:space="preserve">Figure 6. The SNS alert email (RestoreCheck FAILED) received for a broken backup</w:t>
+        <w:t xml:space="preserve">Figure 6. Output of the RunIntegrityChecks step in the corrupt-data run: canary_checksum failed while every other check passed</w:t>
       </w:r>
     </w:p>
     <w:p>
@@ -3130,7 +3130,7 @@
           <w:iCs/>
           <w:color w:val="6B7280"/>
         </w:rPr>
-        <w:t xml:space="preserve">[ Insert screenshot: DynamoDB: run history items ]</w:t>
+        <w:t xml:space="preserve">[ Insert screenshot: RDS console during a run: the temporary restorecheck-tmp-* instance beside the source database ]</w:t>
       </w:r>
     </w:p>
     <w:p>
@@ -3145,7 +3145,7 @@
           <w:sz w:val="20"/>
           <w:szCs w:val="20"/>
         </w:rPr>
-        <w:t xml:space="preserve">Figure 7. DynamoDB: run history items</w:t>
+        <w:t xml:space="preserve">Figure 7. RDS console during a run: the temporary restorecheck-tmp-* instance beside the source database</w:t>
       </w:r>
     </w:p>
     <w:p>
@@ -3166,7 +3166,7 @@
           <w:iCs/>
           <w:color w:val="6B7280"/>
         </w:rPr>
-        <w:t xml:space="preserve">[ Insert screenshot: S3: a detailed JSON verification report ]</w:t>
+        <w:t xml:space="preserve">[ Insert screenshot: The SNS alert email received for the corrupt-data backup, naming the failed check ]</w:t>
       </w:r>
     </w:p>
     <w:p>
@@ -3181,7 +3181,7 @@
           <w:sz w:val="20"/>
           <w:szCs w:val="20"/>
         </w:rPr>
-        <w:t xml:space="preserve">Figure 8. S3: a detailed JSON verification report</w:t>
+        <w:t xml:space="preserve">Figure 8. The SNS alert email received for the corrupt-data backup, naming the failed check</w:t>
       </w:r>
     </w:p>
     <w:p>
@@ -3202,7 +3202,7 @@
           <w:iCs/>
           <w:color w:val="6B7280"/>
         </w:rPr>
-        <w:t xml:space="preserve">[ Insert screenshot: CloudWatch: the restorecheck-backup-health dashboard ]</w:t>
+        <w:t xml:space="preserve">[ Insert screenshot: DynamoDB: run history with PASSED, FAILED and ERROR runs ]</w:t>
       </w:r>
     </w:p>
     <w:p>
@@ -3217,7 +3217,7 @@
           <w:sz w:val="20"/>
           <w:szCs w:val="20"/>
         </w:rPr>
-        <w:t xml:space="preserve">Figure 9. CloudWatch: the restorecheck-backup-health dashboard</w:t>
+        <w:t xml:space="preserve">Figure 9. DynamoDB: run history with PASSED, FAILED and ERROR runs</w:t>
       </w:r>
     </w:p>
     <w:p>
@@ -3238,7 +3238,7 @@
           <w:iCs/>
           <w:color w:val="6B7280"/>
         </w:rPr>
-        <w:t xml:space="preserve">[ Insert screenshot: IAM: the verifier's custom least-privilege JSON policy ]</w:t>
+        <w:t xml:space="preserve">[ Insert screenshot: S3: the detailed JSON verification report of the corrupt-data run ]</w:t>
       </w:r>
     </w:p>
     <w:p>
@@ -3253,7 +3253,7 @@
           <w:sz w:val="20"/>
           <w:szCs w:val="20"/>
         </w:rPr>
-        <w:t xml:space="preserve">Figure 10. IAM: the verifier's custom least-privilege JSON policy</w:t>
+        <w:t xml:space="preserve">Figure 10. S3: the detailed JSON verification report of the corrupt-data run</w:t>
       </w:r>
     </w:p>
     <w:p>
@@ -3274,7 +3274,7 @@
           <w:iCs/>
           <w:color w:val="6B7280"/>
         </w:rPr>
-        <w:t xml:space="preserve">[ Insert screenshot: The results site on GitHub Pages ]</w:t>
+        <w:t xml:space="preserve">[ Insert screenshot: CloudWatch: the restorecheck-backup-health dashboard ]</w:t>
       </w:r>
     </w:p>
     <w:p>
@@ -3289,7 +3289,7 @@
           <w:sz w:val="20"/>
           <w:szCs w:val="20"/>
         </w:rPr>
-        <w:t xml:space="preserve">Figure 11. The results site on GitHub Pages</w:t>
+        <w:t xml:space="preserve">Figure 11. CloudWatch: the restorecheck-backup-health dashboard</w:t>
       </w:r>
     </w:p>
     <w:p>
@@ -3310,7 +3310,7 @@
           <w:iCs/>
           <w:color w:val="6B7280"/>
         </w:rPr>
-        <w:t xml:space="preserve">[ Insert screenshot: Automated test suite output (pytest) ]</w:t>
+        <w:t xml:space="preserve">[ Insert screenshot: IAM: the verifier's custom least-privilege JSON policy ]</w:t>
       </w:r>
     </w:p>
     <w:p>
@@ -3325,7 +3325,115 @@
           <w:sz w:val="20"/>
           <w:szCs w:val="20"/>
         </w:rPr>
-        <w:t xml:space="preserve">Figure 12. Automated test suite output (pytest)</w:t>
+        <w:t xml:space="preserve">Figure 12. IAM: the verifier's custom least-privilege JSON policy</w:t>
+      </w:r>
+    </w:p>
+    <w:p>
+      <w:pPr>
+        <w:pBdr>
+          <w:top w:val="dashed" w:color="9CA3AF" w:sz="8" w:space="10"/>
+          <w:left w:val="dashed" w:color="9CA3AF" w:sz="8" w:space="10"/>
+          <w:bottom w:val="dashed" w:color="9CA3AF" w:sz="8" w:space="10"/>
+          <w:right w:val="dashed" w:color="9CA3AF" w:sz="8" w:space="10"/>
+        </w:pBdr>
+        <w:shd w:fill="F3F4F6" w:color="auto" w:val="clear"/>
+        <w:spacing w:after="120" w:before="240" w:line="360"/>
+        <w:jc w:val="center"/>
+      </w:pPr>
+      <w:r>
+        <w:rPr>
+          <w:i/>
+          <w:iCs/>
+          <w:color w:val="6B7280"/>
+        </w:rPr>
+        <w:t xml:space="preserve">[ Insert screenshot: IAM: the checker's custom JSON policy, allowing database login as one user only ]</w:t>
+      </w:r>
+    </w:p>
+    <w:p>
+      <w:pPr>
+        <w:spacing w:after="240"/>
+        <w:jc w:val="center"/>
+      </w:pPr>
+      <w:r>
+        <w:rPr>
+          <w:i/>
+          <w:iCs/>
+          <w:sz w:val="20"/>
+          <w:szCs w:val="20"/>
+        </w:rPr>
+        <w:t xml:space="preserve">Figure 13. IAM: the checker's custom JSON policy, allowing database login as one user only</w:t>
+      </w:r>
+    </w:p>
+    <w:p>
+      <w:pPr>
+        <w:pBdr>
+          <w:top w:val="dashed" w:color="9CA3AF" w:sz="8" w:space="10"/>
+          <w:left w:val="dashed" w:color="9CA3AF" w:sz="8" w:space="10"/>
+          <w:bottom w:val="dashed" w:color="9CA3AF" w:sz="8" w:space="10"/>
+          <w:right w:val="dashed" w:color="9CA3AF" w:sz="8" w:space="10"/>
+        </w:pBdr>
+        <w:shd w:fill="F3F4F6" w:color="auto" w:val="clear"/>
+        <w:spacing w:after="120" w:before="240" w:line="360"/>
+        <w:jc w:val="center"/>
+      </w:pPr>
+      <w:r>
+        <w:rPr>
+          <w:i/>
+          <w:iCs/>
+          <w:color w:val="6B7280"/>
+        </w:rPr>
+        <w:t xml:space="preserve">[ Insert screenshot: The results site on GitHub Pages ]</w:t>
+      </w:r>
+    </w:p>
+    <w:p>
+      <w:pPr>
+        <w:spacing w:after="240"/>
+        <w:jc w:val="center"/>
+      </w:pPr>
+      <w:r>
+        <w:rPr>
+          <w:i/>
+          <w:iCs/>
+          <w:sz w:val="20"/>
+          <w:szCs w:val="20"/>
+        </w:rPr>
+        <w:t xml:space="preserve">Figure 14. The results site on GitHub Pages</w:t>
+      </w:r>
+    </w:p>
+    <w:p>
+      <w:pPr>
+        <w:pBdr>
+          <w:top w:val="dashed" w:color="9CA3AF" w:sz="8" w:space="10"/>
+          <w:left w:val="dashed" w:color="9CA3AF" w:sz="8" w:space="10"/>
+          <w:bottom w:val="dashed" w:color="9CA3AF" w:sz="8" w:space="10"/>
+          <w:right w:val="dashed" w:color="9CA3AF" w:sz="8" w:space="10"/>
+        </w:pBdr>
+        <w:shd w:fill="F3F4F6" w:color="auto" w:val="clear"/>
+        <w:spacing w:after="120" w:before="240" w:line="360"/>
+        <w:jc w:val="center"/>
+      </w:pPr>
+      <w:r>
+        <w:rPr>
+          <w:i/>
+          <w:iCs/>
+          <w:color w:val="6B7280"/>
+        </w:rPr>
+        <w:t xml:space="preserve">[ Insert screenshot: Automated test suite output (pytest): 76 tests passed ]</w:t>
+      </w:r>
+    </w:p>
+    <w:p>
+      <w:pPr>
+        <w:spacing w:after="240"/>
+        <w:jc w:val="center"/>
+      </w:pPr>
+      <w:r>
+        <w:rPr>
+          <w:i/>
+          <w:iCs/>
+          <w:sz w:val="20"/>
+          <w:szCs w:val="20"/>
+        </w:rPr>
+        <w:t xml:space="preserve">Figure 15. Automated test suite output (pytest): 76 tests passed</w:t>
       </w:r>
     </w:p>
     <w:p>
@@ -5051,7 +5159,7 @@
       <w:r>
         <w:t xml:space="preserve">Amazon Web Services, "Data protection in Amazon S3," Amazon S3 User Guide. [Online]. Available: </w:t>
       </w:r>
-      <w:hyperlink w:history="1" r:id="rIdaqgajb6hgwtpjaa6velx-">
+      <w:hyperlink w:history="1" r:id="rId2e_yrijrcyinpg44wyn1o">
         <w:r>
           <w:rPr>
             <w:color w:val="0563C1"/>
@@ -5072,7 +5180,7 @@
       <w:r>
         <w:t xml:space="preserve">Cybersecurity and Infrastructure Security Agency, "#StopRansomware guide." [Online]. Available: </w:t>
       </w:r>
-      <w:hyperlink w:history="1" r:id="rIdvvop93vqty46osonaehbf">
+      <w:hyperlink w:history="1" r:id="rIdpqxvvhsy5vhl5jky8rhch">
         <w:r>
           <w:rPr>
             <w:color w:val="0563C1"/>
@@ -5103,7 +5211,7 @@
       <w:r>
         <w:t xml:space="preserve">, 2003. [Online]. Available: </w:t>
       </w:r>
-      <w:hyperlink w:history="1" r:id="rId5w4kovmf9ozjroy6sjoev">
+      <w:hyperlink w:history="1" r:id="rIdtx1vly5kwmdidi704zvpb">
         <w:r>
           <w:rPr>
             <w:color w:val="0563C1"/>
@@ -5124,7 +5232,7 @@
       <w:r>
         <w:t xml:space="preserve">Amazon Web Services, "Shared responsibility model." [Online]. Available: </w:t>
       </w:r>
-      <w:hyperlink w:history="1" r:id="rId_gtxgugsyxbsmsvcadpka">
+      <w:hyperlink w:history="1" r:id="rIdbb2hhdz3ttxzyepwcvilb">
         <w:r>
           <w:rPr>
             <w:color w:val="0563C1"/>
@@ -5158,7 +5266,7 @@
       <w:r>
         <w:t xml:space="preserve">doi: </w:t>
       </w:r>
-      <w:hyperlink w:history="1" r:id="rIdvtuvw2ksfrh4fags8jh4m">
+      <w:hyperlink w:history="1" r:id="rIdfsjrr42xze4pns82_xlex">
         <w:r>
           <w:rPr>
             <w:color w:val="0563C1"/>
@@ -5173,7 +5281,7 @@
       <w:r>
         <w:t xml:space="preserve"> Free conference version: </w:t>
       </w:r>
-      <w:hyperlink w:history="1" r:id="rId1ktvg62hqbikeprhbao84">
+      <w:hyperlink w:history="1" r:id="rIdzyucgljtr4snxyvtv4tus">
         <w:r>
           <w:rPr>
             <w:color w:val="0563C1"/>
@@ -5194,7 +5302,7 @@
       <w:r>
         <w:t xml:space="preserve">Amazon Web Services, "Encrypting Amazon RDS resources," Amazon RDS User Guide. [Online]. Available: </w:t>
       </w:r>
-      <w:hyperlink w:history="1" r:id="rId-lmaqcp-3juf5o3odtpp-">
+      <w:hyperlink w:history="1" r:id="rIdpuicij4eu6t-pg5uzjtkx">
         <w:r>
           <w:rPr>
             <w:color w:val="0563C1"/>
@@ -5215,7 +5323,7 @@
       <w:r>
         <w:t xml:space="preserve">GitLab Inc., "Postmortem of database outage of January 31," GitLab Blog, Feb. 2017. [Online]. Available: </w:t>
       </w:r>
-      <w:hyperlink w:history="1" r:id="rId7rtrtrxqukuvnx1r91apa">
+      <w:hyperlink w:history="1" r:id="rIdjn95eqnf6nmydb6b2lc0u">
         <w:r>
           <w:rPr>
             <w:color w:val="0563C1"/>
@@ -5236,7 +5344,7 @@
       <w:r>
         <w:t xml:space="preserve">Amazon Web Services, "REL09-BP04 Perform periodic recovery of the data to verify backup integrity and processes," AWS Well-Architected Framework. [Online]. Available: </w:t>
       </w:r>
-      <w:hyperlink w:history="1" r:id="rId7t12xf6n5hnev207dekn7">
+      <w:hyperlink w:history="1" r:id="rId-srrxswqinetyq1yquxdl">
         <w:r>
           <w:rPr>
             <w:color w:val="0563C1"/>
@@ -5257,7 +5365,7 @@
       <w:r>
         <w:t xml:space="preserve">Amazon Web Services, "Reliability pillar," AWS Well-Architected Framework. [Online]. Available: </w:t>
       </w:r>
-      <w:hyperlink w:history="1" r:id="rIdvbwjvbl5iwfovih8rywb2">
+      <w:hyperlink w:history="1" r:id="rIdrb32s7jagu08wbhyjat1r">
         <w:r>
           <w:rPr>
             <w:color w:val="0563C1"/>
@@ -5281,7 +5389,7 @@
       <w:r>
         <w:t xml:space="preserve">doi: </w:t>
       </w:r>
-      <w:hyperlink w:history="1" r:id="rIdajxcelhr8zgm7cdkbzgvv">
+      <w:hyperlink w:history="1" r:id="rIdpgeltf8gsc4uqofljsnr1">
         <w:r>
           <w:rPr>
             <w:color w:val="0563C1"/>
@@ -5308,7 +5416,7 @@
       <w:r>
         <w:t xml:space="preserve">doi: </w:t>
       </w:r>
-      <w:hyperlink w:history="1" r:id="rIdz81spxxbrrrhtlwldy1xe">
+      <w:hyperlink w:history="1" r:id="rIdopv4d3neiot4mv6tbmfmu">
         <w:r>
           <w:rPr>
             <w:color w:val="0563C1"/>
@@ -5339,7 +5447,7 @@
       <w:r>
         <w:t xml:space="preserve">, ISO/IEC 27031:2011. [Online]. Available: </w:t>
       </w:r>
-      <w:hyperlink w:history="1" r:id="rId5auw9vf-uzj3l0uqnhfad">
+      <w:hyperlink w:history="1" r:id="rId5csfhdye3eylo1fcpxswi">
         <w:r>
           <w:rPr>
             <w:color w:val="0563C1"/>
@@ -5360,7 +5468,7 @@
       <w:r>
         <w:t xml:space="preserve">Amazon Web Services, "Lambda quotas," AWS Lambda Developer Guide. [Online]. Available: </w:t>
       </w:r>
-      <w:hyperlink w:history="1" r:id="rIdlcs_pai-d_lmmzvuf74d5">
+      <w:hyperlink w:history="1" r:id="rIdxdqlctjnpzvxnuoqvoidc">
         <w:r>
           <w:rPr>
             <w:color w:val="0563C1"/>
@@ -5381,7 +5489,7 @@
       <w:r>
         <w:t xml:space="preserve">Amazon Web Services, "What is Step Functions?," AWS Step Functions Developer Guide. [Online]. Available: </w:t>
       </w:r>
-      <w:hyperlink w:history="1" r:id="rIdb4fnkv1uxsfnke5shrrce">
+      <w:hyperlink w:history="1" r:id="rId_l6dyqek_ehrrmmsn9niz">
         <w:r>
           <w:rPr>
             <w:color w:val="0563C1"/>
@@ -5402,7 +5510,7 @@
       <w:r>
         <w:t xml:space="preserve">Amazon Web Services, "Handling errors in Step Functions workflows," AWS Step Functions Developer Guide. [Online]. Available: </w:t>
       </w:r>
-      <w:hyperlink w:history="1" r:id="rIdaljceztpx0fp7ifujx5hu">
+      <w:hyperlink w:history="1" r:id="rIdxtzugji_f8j9cwicfic9c">
         <w:r>
           <w:rPr>
             <w:color w:val="0563C1"/>
@@ -5423,7 +5531,7 @@
       <w:r>
         <w:t xml:space="preserve">Amazon Web Services, "Security best practices in IAM," AWS IAM User Guide. [Online]. Available: </w:t>
       </w:r>
-      <w:hyperlink w:history="1" r:id="rIdmthectt48vm4rmrenqzmw">
+      <w:hyperlink w:history="1" r:id="rIdoeshtexvf_8pm0m9p9rbo">
         <w:r>
           <w:rPr>
             <w:color w:val="0563C1"/>
@@ -5444,7 +5552,7 @@
       <w:r>
         <w:t xml:space="preserve">Amazon Web Services, "IAM JSON policy reference," AWS IAM User Guide. [Online]. Available: </w:t>
       </w:r>
-      <w:hyperlink w:history="1" r:id="rIdcrc0ebf8kqorrrcprm8w-">
+      <w:hyperlink w:history="1" r:id="rIdcaqqt_7ctsbnob_r11apc">
         <w:r>
           <w:rPr>
             <w:color w:val="0563C1"/>
@@ -5465,7 +5573,7 @@
       <w:r>
         <w:t xml:space="preserve">Amazon Web Services, "IAM database authentication for MariaDB, MySQL, and PostgreSQL," Amazon RDS User Guide. [Online]. Available: </w:t>
       </w:r>
-      <w:hyperlink w:history="1" r:id="rIdegcbereytbq1tsbzcog45">
+      <w:hyperlink w:history="1" r:id="rIdpaj1cft0ux1ohvx9car65">
         <w:r>
           <w:rPr>
             <w:color w:val="0563C1"/>
@@ -5486,7 +5594,7 @@
       <w:r>
         <w:t xml:space="preserve">Amazon Web Services, "Using SSL/TLS to encrypt a connection to a DB instance or cluster," Amazon RDS User Guide. [Online]. Available: </w:t>
       </w:r>
-      <w:hyperlink w:history="1" r:id="rIdmhh3akesjmshphonjfwo5">
+      <w:hyperlink w:history="1" r:id="rIdvqibjtsrmvqgaeryqzuyz">
         <w:r>
           <w:rPr>
             <w:color w:val="0563C1"/>
@@ -5507,7 +5615,7 @@
       <w:r>
         <w:t xml:space="preserve">Amazon Web Services, "Control traffic to your AWS resources using security groups," Amazon VPC User Guide. [Online]. Available: </w:t>
       </w:r>
-      <w:hyperlink w:history="1" r:id="rId1juw503gq59twiwqzbbn7">
+      <w:hyperlink w:history="1" r:id="rIdxgxvugviybk7ugctfw47k">
         <w:r>
           <w:rPr>
             <w:color w:val="0563C1"/>
@@ -5528,7 +5636,7 @@
       <w:r>
         <w:t xml:space="preserve">Amazon Web Services, "Giving Lambda event functions access to resources in an Amazon VPC," AWS Lambda Developer Guide. [Online]. Available: </w:t>
       </w:r>
-      <w:hyperlink w:history="1" r:id="rIdtpnxeadphwmxmgap492t8">
+      <w:hyperlink w:history="1" r:id="rIds2jveidoszlfyhxtofwvp">
         <w:r>
           <w:rPr>
             <w:color w:val="0563C1"/>
@@ -5549,7 +5657,7 @@
       <w:r>
         <w:t xml:space="preserve">Amazon Web Services, "What is the AWS Serverless Application Model (AWS SAM)?," AWS SAM Developer Guide. [Online]. Available: </w:t>
       </w:r>
-      <w:hyperlink w:history="1" r:id="rIdkmfp7frcgefzaylp2vqgs">
+      <w:hyperlink w:history="1" r:id="rIdcweaxo_xtrenzzawkxaiu">
         <w:r>
           <w:rPr>
             <w:color w:val="0563C1"/>
@@ -5570,7 +5678,7 @@
       <w:r>
         <w:t xml:space="preserve">Amazon Web Services, "What is CloudFormation?," AWS CloudFormation User Guide. [Online]. Available: </w:t>
       </w:r>
-      <w:hyperlink w:history="1" r:id="rIdm9lkapydhjsrguufpfdhb">
+      <w:hyperlink w:history="1" r:id="rIdjqbzezweiby1dkugyrnnj">
         <w:r>
           <w:rPr>
             <w:color w:val="0563C1"/>
@@ -5591,7 +5699,7 @@
       <w:r>
         <w:t xml:space="preserve">United Nations, "Goal 9: Build resilient infrastructure, promote inclusive and sustainable industrialization and foster innovation." [Online]. Available: </w:t>
       </w:r>
-      <w:hyperlink w:history="1" r:id="rIdupaw51_7rukasvo5oqzan">
+      <w:hyperlink w:history="1" r:id="rIdkbyzaa3otsldnj-lkd30b">
         <w:r>
           <w:rPr>
             <w:color w:val="0563C1"/>
@@ -5612,7 +5720,7 @@
       <w:r>
         <w:t xml:space="preserve">United Nations, "Goal 11: Make cities and human settlements inclusive, safe, resilient and sustainable." [Online]. Available: </w:t>
       </w:r>
-      <w:hyperlink w:history="1" r:id="rId3a8kqgbdp6iyojng_keca">
+      <w:hyperlink w:history="1" r:id="rIdnt99kz1wialiorti0hxnr">
         <w:r>
           <w:rPr>
             <w:color w:val="0563C1"/>
@@ -5643,7 +5751,7 @@
       <w:r>
         <w:t xml:space="preserve">, 2010. [Online]. Available: </w:t>
       </w:r>
-      <w:hyperlink w:history="1" r:id="rIdcdozjbqpttupijbzqvd89">
+      <w:hyperlink w:history="1" r:id="rIdhbzsogjeqmr3jwbrdarjr">
         <w:r>
           <w:rPr>
             <w:color w:val="0563C1"/>
@@ -5677,7 +5785,7 @@
       <w:r>
         <w:t xml:space="preserve">doi: </w:t>
       </w:r>
-      <w:hyperlink w:history="1" r:id="rIdunw_55r3lg6lpv9dke2i2">
+      <w:hyperlink w:history="1" r:id="rIdrzxgtzbyxm8d9v2q-wath">
         <w:r>
           <w:rPr>
             <w:color w:val="0563C1"/>
@@ -5714,7 +5822,7 @@
       <w:r>
         <w:t xml:space="preserve">doi: </w:t>
       </w:r>
-      <w:hyperlink w:history="1" r:id="rIdkzvdfl4ufheabkrumulvs">
+      <w:hyperlink w:history="1" r:id="rIdotgwisc4dwjkqupq5p9fv">
         <w:r>
           <w:rPr>
             <w:color w:val="0563C1"/>
@@ -5751,7 +5859,7 @@
       <w:r>
         <w:t xml:space="preserve">doi: </w:t>
       </w:r>
-      <w:hyperlink w:history="1" r:id="rIddcav2sfrizpvsukki5guw">
+      <w:hyperlink w:history="1" r:id="rId4appbf1vvabwyv4iy24ff">
         <w:r>
           <w:rPr>
             <w:color w:val="0563C1"/>
@@ -5785,7 +5893,7 @@
       <w:r>
         <w:t xml:space="preserve">, 2008. [Online]. Available: </w:t>
       </w:r>
-      <w:hyperlink w:history="1" r:id="rId-vvr9fpl_pvd3kd62g7gv">
+      <w:hyperlink w:history="1" r:id="rIdbn98htxcpmqkhnf0g1o1a">
         <w:r>
           <w:rPr>
             <w:color w:val="0563C1"/>
@@ -5816,7 +5924,7 @@
       <w:r>
         <w:t xml:space="preserve">, 2007. [Online]. Available: </w:t>
       </w:r>
-      <w:hyperlink w:history="1" r:id="rIdsj6w75quj1edeb_he43qi">
+      <w:hyperlink w:history="1" r:id="rIdypeh51did7qbhq203vygf">
         <w:r>
           <w:rPr>
             <w:color w:val="0563C1"/>
@@ -5850,7 +5958,7 @@
       <w:r>
         <w:t xml:space="preserve">doi: </w:t>
       </w:r>
-      <w:hyperlink w:history="1" r:id="rId9fliivjq-si_h4nhlbpnl">
+      <w:hyperlink w:history="1" r:id="rIdnv0gtkqmny3ws7kfh7smb">
         <w:r>
           <w:rPr>
             <w:color w:val="0563C1"/>
@@ -5884,7 +5992,7 @@
       <w:r>
         <w:t xml:space="preserve">, 2014. [Online]. Available: </w:t>
       </w:r>
-      <w:hyperlink w:history="1" r:id="rId8ibdtdch4zzd49licmnzr">
+      <w:hyperlink w:history="1" r:id="rIdflm-h7cyu8n16fevsxryk">
         <w:r>
           <w:rPr>
             <w:color w:val="0563C1"/>
@@ -5918,7 +6026,7 @@
       <w:r>
         <w:t xml:space="preserve">doi: </w:t>
       </w:r>
-      <w:hyperlink w:history="1" r:id="rIdi1gc2cdb4e_m2mklexfux">
+      <w:hyperlink w:history="1" r:id="rIdk9layz2gvl_-gqot1j1e-">
         <w:r>
           <w:rPr>
             <w:color w:val="0563C1"/>
@@ -5955,7 +6063,7 @@
       <w:r>
         <w:t xml:space="preserve">doi: </w:t>
       </w:r>
-      <w:hyperlink w:history="1" r:id="rIdnn-l3el6qi9lhupcrj48f">
+      <w:hyperlink w:history="1" r:id="rIds0u-8vde7ukdtwhmgu4s1">
         <w:r>
           <w:rPr>
             <w:color w:val="0563C1"/>
@@ -5989,7 +6097,7 @@
       <w:r>
         <w:t xml:space="preserve">, B. Beyer, C. Jones, J. Petoff, and N. R. Murphy, Eds. Sebastopol, CA, USA: O'Reilly Media, 2016, ch. 26. [Online]. Available: </w:t>
       </w:r>
-      <w:hyperlink w:history="1" r:id="rIdmci070ngawxyl3ftab0yz">
+      <w:hyperlink w:history="1" r:id="rId_jo6hpofv8xauwxbztys_">
         <w:r>
           <w:rPr>
             <w:color w:val="0563C1"/>
@@ -6010,7 +6118,7 @@
       <w:r>
         <w:t xml:space="preserve">Amazon Web Services, "Restore testing," AWS Backup Developer Guide. [Online]. Available: </w:t>
       </w:r>
-      <w:hyperlink w:history="1" r:id="rId19idqjxp876t59g6ghmt5">
+      <w:hyperlink w:history="1" r:id="rIdw1-bfea1rvsnta72f7x5u">
         <w:r>
           <w:rPr>
             <w:color w:val="0563C1"/>
@@ -6031,7 +6139,7 @@
       <w:r>
         <w:t xml:space="preserve">Amazon Web Services, "What is AWS Backup?," AWS Backup Developer Guide. [Online]. Available: </w:t>
       </w:r>
-      <w:hyperlink w:history="1" r:id="rIdl4oiher5om7jfjsrjomlt">
+      <w:hyperlink w:history="1" r:id="rIdy80kxdlxtzabgkmkxkw_l">
         <w:r>
           <w:rPr>
             <w:color w:val="0563C1"/>
@@ -6052,7 +6160,7 @@
       <w:r>
         <w:t xml:space="preserve">Amazon Web Services, "Amazon States Language." [Online]. Available: </w:t>
       </w:r>
-      <w:hyperlink w:history="1" r:id="rIduyd91wbexw1tsf8djo70t">
+      <w:hyperlink w:history="1" r:id="rId77xdkprww7mfempmcaqkg">
         <w:r>
           <w:rPr>
             <w:color w:val="0563C1"/>
@@ -6073,7 +6181,7 @@
       <w:r>
         <w:t xml:space="preserve">Amazon Web Services, "Creating a scheduled rule (legacy) in Amazon EventBridge," Amazon EventBridge User Guide. [Online]. Available: </w:t>
       </w:r>
-      <w:hyperlink w:history="1" r:id="rIdsbeiyb5eypepkurav4k9p">
+      <w:hyperlink w:history="1" r:id="rIdrmdexowtynfdfksis8nvx">
         <w:r>
           <w:rPr>
             <w:color w:val="0563C1"/>
@@ -6094,7 +6202,7 @@
       <w:r>
         <w:t xml:space="preserve">Amazon Web Services, "Introduction to backups," Amazon RDS User Guide. [Online]. Available: </w:t>
       </w:r>
-      <w:hyperlink w:history="1" r:id="rIdcvazzsikpf3eiltbh7sks">
+      <w:hyperlink w:history="1" r:id="rIdzmy_euhbdhk7rhewsvpar">
         <w:r>
           <w:rPr>
             <w:color w:val="0563C1"/>
@@ -6115,7 +6223,7 @@
       <w:r>
         <w:t xml:space="preserve">Amazon Web Services, "Restoring to a DB instance," Amazon RDS User Guide. [Online]. Available: </w:t>
       </w:r>
-      <w:hyperlink w:history="1" r:id="rId2irmpd-pfioz2fb0nldcj">
+      <w:hyperlink w:history="1" r:id="rIdbtiu7nypdggg-sbafcb5b">
         <w:r>
           <w:rPr>
             <w:color w:val="0563C1"/>
@@ -6136,7 +6244,7 @@
       <w:r>
         <w:t xml:space="preserve">Amazon Web Services, "Viewing instance status," Amazon RDS User Guide. [Online]. Available: </w:t>
       </w:r>
-      <w:hyperlink w:history="1" r:id="rIdekfjr_xsvly6wv4rqxbzw">
+      <w:hyperlink w:history="1" r:id="rIduxyxoqqkpn7cqfhujdzct">
         <w:r>
           <w:rPr>
             <w:color w:val="0563C1"/>
@@ -6157,7 +6265,7 @@
       <w:r>
         <w:t xml:space="preserve">Amazon Web Services, "Core components of Amazon DynamoDB," Amazon DynamoDB Developer Guide. [Online]. Available: </w:t>
       </w:r>
-      <w:hyperlink w:history="1" r:id="rIdb1o3fcbwp5feuhuabsazk">
+      <w:hyperlink w:history="1" r:id="rIdagpljmz2idlvc6milxcrt">
         <w:r>
           <w:rPr>
             <w:color w:val="0563C1"/>
@@ -6178,7 +6286,7 @@
       <w:r>
         <w:t xml:space="preserve">Amazon Web Services, "Publish custom metrics (PutMetricData / EMF)," Amazon CloudWatch User Guide. [Online]. Available: </w:t>
       </w:r>
-      <w:hyperlink w:history="1" r:id="rIdacmktthhi4pgmf5ni1gph">
+      <w:hyperlink w:history="1" r:id="rIdmqbocn1nzjz74a8yqmnfj">
         <w:r>
           <w:rPr>
             <w:color w:val="0563C1"/>
@@ -6199,7 +6307,7 @@
       <w:r>
         <w:t xml:space="preserve">Amazon Web Services, "Amazon SNS email subscription setup and management," Amazon SNS Developer Guide. [Online]. Available: </w:t>
       </w:r>
-      <w:hyperlink w:history="1" r:id="rIdnvlgmbmabsqpx4xqwezfy">
+      <w:hyperlink w:history="1" r:id="rIdewxotqvahc9gwt18qf_go">
         <w:r>
           <w:rPr>
             <w:color w:val="0563C1"/>
@@ -6220,7 +6328,7 @@
       <w:r>
         <w:t xml:space="preserve">Amazon Web Services, "Using Amazon CloudWatch dashboards," Amazon CloudWatch User Guide. [Online]. Available: </w:t>
       </w:r>
-      <w:hyperlink w:history="1" r:id="rIdepjnshljy6355saudygyq">
+      <w:hyperlink w:history="1" r:id="rIdyqhz1qmta9filwo68xote">
         <w:r>
           <w:rPr>
             <w:color w:val="0563C1"/>
@@ -6241,7 +6349,7 @@
       <w:r>
         <w:t xml:space="preserve">Amazon Web Services, "Service control policies (SCPs)," AWS Organizations User Guide. [Online]. Available: </w:t>
       </w:r>
-      <w:hyperlink w:history="1" r:id="rIdntvjb8io7qqe-ggesbpb_">
+      <w:hyperlink w:history="1" r:id="rId5fat4kc0dfwf0nb4nyle5">
         <w:r>
           <w:rPr>
             <w:color w:val="0563C1"/>
@@ -6262,7 +6370,7 @@
       <w:r>
         <w:t xml:space="preserve">Amazon Web Services, "Disaster recovery (DR) objectives," AWS Well-Architected Framework. [Online]. Available: </w:t>
       </w:r>
-      <w:hyperlink w:history="1" r:id="rIdhvtszla511xpwnl6ctlag">
+      <w:hyperlink w:history="1" r:id="rIddrokmftcmtpsmlrw8b2_y">
         <w:r>
           <w:rPr>
             <w:color w:val="0563C1"/>
@@ -6283,7 +6391,7 @@
       <w:r>
         <w:t xml:space="preserve">Moto contributors, "Moto: Mock AWS services." [Online]. Available: </w:t>
       </w:r>
-      <w:hyperlink w:history="1" r:id="rId8x-82r56pbfv7v3n3esuy">
+      <w:hyperlink w:history="1" r:id="rIduk9a8xudu0i-xdjk0vddk">
         <w:r>
           <w:rPr>
             <w:color w:val="0563C1"/>
@@ -6307,7 +6415,7 @@
       <w:r>
         <w:t xml:space="preserve">doi: </w:t>
       </w:r>
-      <w:hyperlink w:history="1" r:id="rIdd2ggwcws3l6iq-53i4phz">
+      <w:hyperlink w:history="1" r:id="rIdsumqtdwp6tww8hsnc1ja9">
         <w:r>
           <w:rPr>
             <w:color w:val="0563C1"/>
@@ -6331,7 +6439,7 @@
       <w:r>
         <w:t xml:space="preserve">Amazon Web Services, "Disaster recovery of workloads on AWS: Recovery in the cloud," AWS Whitepaper. [Online]. Available: </w:t>
       </w:r>
-      <w:hyperlink w:history="1" r:id="rIdvkllmwdpxmyryhqta8qfm">
+      <w:hyperlink w:history="1" r:id="rIds5ata51tz9ddyrd2dwxwn">
         <w:r>
           <w:rPr>
             <w:color w:val="0563C1"/>
@@ -6352,7 +6460,7 @@
       <w:r>
         <w:t xml:space="preserve">Amazon Web Services, "Boto3 documentation," AWS SDK for Python. [Online]. Available: </w:t>
       </w:r>
-      <w:hyperlink w:history="1" r:id="rId2offpm-aifp9ibsjt6okr">
+      <w:hyperlink w:history="1" r:id="rId0wplkcwiexeqoxivtrybf">
         <w:r>
           <w:rPr>
             <w:color w:val="0563C1"/>
@@ -6373,7 +6481,7 @@
       <w:r>
         <w:t xml:space="preserve">The PostgreSQL Global Development Group, "Backup and restore," PostgreSQL Documentation. [Online]. Available: </w:t>
       </w:r>
-      <w:hyperlink w:history="1" r:id="rIdd-rppgcltiiqxgnzgkmig">
+      <w:hyperlink w:history="1" r:id="rIdnw1rkidl2aclr_wi-velh">
         <w:r>
           <w:rPr>
             <w:color w:val="0563C1"/>
@@ -6404,7 +6512,7 @@
       <w:r>
         <w:t xml:space="preserve">, "pg8000: A pure-Python PostgreSQL driver," Python Package Index. [Online]. Available: </w:t>
       </w:r>
-      <w:hyperlink w:history="1" r:id="rId70yy61aaaniuatrrgmohx">
+      <w:hyperlink w:history="1" r:id="rIdfzakle2tiygaqt6qnutow">
         <w:r>
           <w:rPr>
             <w:color w:val="0563C1"/>
@@ -6425,7 +6533,7 @@
       <w:r>
         <w:t xml:space="preserve">LocalStack, "LocalStack documentation." [Online]. Available: </w:t>
       </w:r>
-      <w:hyperlink w:history="1" r:id="rIdg1ly-bgac5dq9doh9jfqz">
+      <w:hyperlink w:history="1" r:id="rIdmgyc6r76gyox1yw42gpdq">
         <w:r>
           <w:rPr>
             <w:color w:val="0563C1"/>

</xml_diff>

<commit_message>
Add team and faculty details, CITATION.cff and dataset authors
Fill in the team (Ranen Abner, Sai Charan) and faculty (S. Vigneshwari)
in the report header and in the dataset and repository citations, add
CITATION.cff so GitHub offers "Cite this repository", and add authors
and a citation to the dataset README. The report build can now place the
VIT logo from report/figures (kept local).

Co-Authored-By: Claude Opus 5.5 <noreply@anthropic.com>
</commit_message>
<xml_diff>
--- a/report/RestoreCheck_DA3_Report.docx
+++ b/report/RestoreCheck_DA3_Report.docx
@@ -212,7 +212,7 @@
                 <w:sz w:val="20"/>
                 <w:szCs w:val="20"/>
               </w:rPr>
-              <w:t xml:space="preserve">[Reg. No.]</w:t>
+              <w:t xml:space="preserve">24BCE1185</w:t>
             </w:r>
           </w:p>
         </w:tc>
@@ -240,7 +240,7 @@
                 <w:sz w:val="20"/>
                 <w:szCs w:val="20"/>
               </w:rPr>
-              <w:t xml:space="preserve">[Name]</w:t>
+              <w:t xml:space="preserve">Ranen Abner</w:t>
             </w:r>
           </w:p>
         </w:tc>
@@ -274,7 +274,7 @@
                 <w:sz w:val="20"/>
                 <w:szCs w:val="20"/>
               </w:rPr>
-              <w:t xml:space="preserve">[Reg. No.]</w:t>
+              <w:t xml:space="preserve">24BAI1001</w:t>
             </w:r>
           </w:p>
         </w:tc>
@@ -302,69 +302,7 @@
                 <w:sz w:val="20"/>
                 <w:szCs w:val="20"/>
               </w:rPr>
-              <w:t xml:space="preserve">[Name]</w:t>
-            </w:r>
-          </w:p>
-        </w:tc>
-      </w:tr>
-      <w:tr>
-        <w:trPr>
-          <w:cantSplit/>
-          <w:tblHeader w:val="off"/>
-        </w:trPr>
-        <w:tc>
-          <w:tcPr>
-            <w:tcW w:type="dxa" w:w="3000"/>
-            <w:tcBorders>
-              <w:top w:val="single" w:color="A0A7AE" w:sz="4"/>
-              <w:left w:val="single" w:color="A0A7AE" w:sz="4"/>
-              <w:bottom w:val="single" w:color="A0A7AE" w:sz="4"/>
-              <w:right w:val="single" w:color="A0A7AE" w:sz="4"/>
-            </w:tcBorders>
-            <w:tcMar>
-              <w:top w:type="dxa" w:w="60"/>
-              <w:left w:type="dxa" w:w="100"/>
-              <w:bottom w:type="dxa" w:w="60"/>
-              <w:right w:type="dxa" w:w="100"/>
-            </w:tcMar>
-          </w:tcPr>
-          <w:p>
-            <w:r>
-              <w:rPr>
-                <w:b w:val="false"/>
-                <w:bCs w:val="false"/>
-                <w:sz w:val="20"/>
-                <w:szCs w:val="20"/>
-              </w:rPr>
-              <w:t xml:space="preserve">[Reg. No.]</w:t>
-            </w:r>
-          </w:p>
-        </w:tc>
-        <w:tc>
-          <w:tcPr>
-            <w:tcW w:type="dxa" w:w="6026"/>
-            <w:tcBorders>
-              <w:top w:val="single" w:color="A0A7AE" w:sz="4"/>
-              <w:left w:val="single" w:color="A0A7AE" w:sz="4"/>
-              <w:bottom w:val="single" w:color="A0A7AE" w:sz="4"/>
-              <w:right w:val="single" w:color="A0A7AE" w:sz="4"/>
-            </w:tcBorders>
-            <w:tcMar>
-              <w:top w:type="dxa" w:w="60"/>
-              <w:left w:type="dxa" w:w="100"/>
-              <w:bottom w:type="dxa" w:w="60"/>
-              <w:right w:type="dxa" w:w="100"/>
-            </w:tcMar>
-          </w:tcPr>
-          <w:p>
-            <w:r>
-              <w:rPr>
-                <w:b w:val="false"/>
-                <w:bCs w:val="false"/>
-                <w:sz w:val="20"/>
-                <w:szCs w:val="20"/>
-              </w:rPr>
-              <w:t xml:space="preserve">[Name]</w:t>
+              <w:t xml:space="preserve">Sai Charan</w:t>
             </w:r>
           </w:p>
         </w:tc>
@@ -383,7 +321,7 @@
         <w:t xml:space="preserve">Faculty:</w:t>
       </w:r>
       <w:r>
-        <w:t xml:space="preserve"> [Faculty name]</w:t>
+        <w:t xml:space="preserve"> S. Vigneshwari</w:t>
       </w:r>
     </w:p>
     <w:p>
@@ -936,7 +874,7 @@
         <w:t xml:space="preserve">Citation:</w:t>
       </w:r>
       <w:r>
-        <w:t xml:space="preserve"> [Team member names], [Faculty name], "RestoreCheck demo dataset: synthetic shop database and backup-verification scenario results," Zenodo, 2026, doi: [DOI].</w:t>
+        <w:t xml:space="preserve"> Ranen Abner, Sai Charan, and S. Vigneshwari, "RestoreCheck demo dataset: synthetic shop database and backup-verification scenario results," Zenodo, 2026, doi: [DOI].</w:t>
       </w:r>
     </w:p>
     <w:p>
@@ -962,7 +900,7 @@
       <w:r>
         <w:t xml:space="preserve"> </w:t>
       </w:r>
-      <w:hyperlink w:history="1" r:id="rIdgtc26zr2xuvexrx6ujend">
+      <w:hyperlink w:history="1" r:id="rIdal9jvbo6pcqckkapksq2g">
         <w:r>
           <w:rPr>
             <w:color w:val="0563C1"/>
@@ -1011,7 +949,7 @@
       <w:r>
         <w:t xml:space="preserve"> </w:t>
       </w:r>
-      <w:hyperlink w:history="1" r:id="rIdu2q1trdk_b1gqb5c1ll1o">
+      <w:hyperlink w:history="1" r:id="rIdn1bh_bah9ptmsur9_k7bi">
         <w:r>
           <w:rPr>
             <w:color w:val="0563C1"/>
@@ -1034,9 +972,9 @@
         <w:t xml:space="preserve">Citation:</w:t>
       </w:r>
       <w:r>
-        <w:t xml:space="preserve"> [Team member names], [Faculty name], "RestoreCheck: Automated Backup Recoverability Verification and Disaster-Recovery Testing on AWS," GitHub repository, 2026. [Online]. Available: </w:t>
-      </w:r>
-      <w:hyperlink w:history="1" r:id="rIdggcolakbdhtmryuusn1th">
+        <w:t xml:space="preserve"> Ranen Abner, Sai Charan, and S. Vigneshwari, "RestoreCheck: Automated Backup Recoverability Verification and Disaster-Recovery Testing on AWS," GitHub repository, 2026. [Online]. Available: </w:t>
+      </w:r>
+      <w:hyperlink w:history="1" r:id="rIdm3fblhvqfgkdd3_nvit23">
         <w:r>
           <w:rPr>
             <w:color w:val="0563C1"/>
@@ -3274,7 +3212,7 @@
           <w:iCs/>
           <w:color w:val="6B7280"/>
         </w:rPr>
-        <w:t xml:space="preserve">[ Insert screenshot: CloudWatch: the restorecheck-backup-health dashboard ]</w:t>
+        <w:t xml:space="preserve">[ Insert screenshot: CloudWatch: the restorecheck-backup-health dashboard over the scenario runs (21 October, UTC). The single verifier Lambda error near 13:00 is the expected "no snapshot" error of the no-backup scenario, which is how that ERROR is detected ]</w:t>
       </w:r>
     </w:p>
     <w:p>
@@ -3289,7 +3227,7 @@
           <w:sz w:val="20"/>
           <w:szCs w:val="20"/>
         </w:rPr>
-        <w:t xml:space="preserve">Figure 11. CloudWatch: the restorecheck-backup-health dashboard</w:t>
+        <w:t xml:space="preserve">Figure 11. CloudWatch: the restorecheck-backup-health dashboard over the scenario runs (21 October, UTC). The single verifier Lambda error near 13:00 is the expected "no snapshot" error of the no-backup scenario, which is how that ERROR is detected</w:t>
       </w:r>
     </w:p>
     <w:p>
@@ -5159,7 +5097,7 @@
       <w:r>
         <w:t xml:space="preserve">Amazon Web Services, "Data protection in Amazon S3," Amazon S3 User Guide. [Online]. Available: </w:t>
       </w:r>
-      <w:hyperlink w:history="1" r:id="rId2e_yrijrcyinpg44wyn1o">
+      <w:hyperlink w:history="1" r:id="rIdtk01j_epbu_8saj8hh1k5">
         <w:r>
           <w:rPr>
             <w:color w:val="0563C1"/>
@@ -5180,7 +5118,7 @@
       <w:r>
         <w:t xml:space="preserve">Cybersecurity and Infrastructure Security Agency, "#StopRansomware guide." [Online]. Available: </w:t>
       </w:r>
-      <w:hyperlink w:history="1" r:id="rIdpqxvvhsy5vhl5jky8rhch">
+      <w:hyperlink w:history="1" r:id="rId4yt_luulhws09xt095pzp">
         <w:r>
           <w:rPr>
             <w:color w:val="0563C1"/>
@@ -5211,7 +5149,7 @@
       <w:r>
         <w:t xml:space="preserve">, 2003. [Online]. Available: </w:t>
       </w:r>
-      <w:hyperlink w:history="1" r:id="rIdtx1vly5kwmdidi704zvpb">
+      <w:hyperlink w:history="1" r:id="rIddrtocxmlcqhhrf-zkvvpy">
         <w:r>
           <w:rPr>
             <w:color w:val="0563C1"/>
@@ -5232,7 +5170,7 @@
       <w:r>
         <w:t xml:space="preserve">Amazon Web Services, "Shared responsibility model." [Online]. Available: </w:t>
       </w:r>
-      <w:hyperlink w:history="1" r:id="rIdbb2hhdz3ttxzyepwcvilb">
+      <w:hyperlink w:history="1" r:id="rIddrfqeqetys-rq_gykkpio">
         <w:r>
           <w:rPr>
             <w:color w:val="0563C1"/>
@@ -5266,7 +5204,7 @@
       <w:r>
         <w:t xml:space="preserve">doi: </w:t>
       </w:r>
-      <w:hyperlink w:history="1" r:id="rIdfsjrr42xze4pns82_xlex">
+      <w:hyperlink w:history="1" r:id="rIdou9es6qjndsadn_pe4bew">
         <w:r>
           <w:rPr>
             <w:color w:val="0563C1"/>
@@ -5281,7 +5219,7 @@
       <w:r>
         <w:t xml:space="preserve"> Free conference version: </w:t>
       </w:r>
-      <w:hyperlink w:history="1" r:id="rIdzyucgljtr4snxyvtv4tus">
+      <w:hyperlink w:history="1" r:id="rIdzyqs3so2i6kj2mpzm3qh1">
         <w:r>
           <w:rPr>
             <w:color w:val="0563C1"/>
@@ -5302,7 +5240,7 @@
       <w:r>
         <w:t xml:space="preserve">Amazon Web Services, "Encrypting Amazon RDS resources," Amazon RDS User Guide. [Online]. Available: </w:t>
       </w:r>
-      <w:hyperlink w:history="1" r:id="rIdpuicij4eu6t-pg5uzjtkx">
+      <w:hyperlink w:history="1" r:id="rIdyssrw903p1gaznzi5xklq">
         <w:r>
           <w:rPr>
             <w:color w:val="0563C1"/>
@@ -5323,7 +5261,7 @@
       <w:r>
         <w:t xml:space="preserve">GitLab Inc., "Postmortem of database outage of January 31," GitLab Blog, Feb. 2017. [Online]. Available: </w:t>
       </w:r>
-      <w:hyperlink w:history="1" r:id="rIdjn95eqnf6nmydb6b2lc0u">
+      <w:hyperlink w:history="1" r:id="rIdodhgsjjax25gtjfu6yo4e">
         <w:r>
           <w:rPr>
             <w:color w:val="0563C1"/>
@@ -5344,7 +5282,7 @@
       <w:r>
         <w:t xml:space="preserve">Amazon Web Services, "REL09-BP04 Perform periodic recovery of the data to verify backup integrity and processes," AWS Well-Architected Framework. [Online]. Available: </w:t>
       </w:r>
-      <w:hyperlink w:history="1" r:id="rId-srrxswqinetyq1yquxdl">
+      <w:hyperlink w:history="1" r:id="rIdzqvl6bkpdgubz-oasmn_h">
         <w:r>
           <w:rPr>
             <w:color w:val="0563C1"/>
@@ -5365,7 +5303,7 @@
       <w:r>
         <w:t xml:space="preserve">Amazon Web Services, "Reliability pillar," AWS Well-Architected Framework. [Online]. Available: </w:t>
       </w:r>
-      <w:hyperlink w:history="1" r:id="rIdrb32s7jagu08wbhyjat1r">
+      <w:hyperlink w:history="1" r:id="rIdebd4ptkzx48ippf0nf3-u">
         <w:r>
           <w:rPr>
             <w:color w:val="0563C1"/>
@@ -5389,7 +5327,7 @@
       <w:r>
         <w:t xml:space="preserve">doi: </w:t>
       </w:r>
-      <w:hyperlink w:history="1" r:id="rIdpgeltf8gsc4uqofljsnr1">
+      <w:hyperlink w:history="1" r:id="rIdn6rw2dq6c2pogvjg5u8tu">
         <w:r>
           <w:rPr>
             <w:color w:val="0563C1"/>
@@ -5416,7 +5354,7 @@
       <w:r>
         <w:t xml:space="preserve">doi: </w:t>
       </w:r>
-      <w:hyperlink w:history="1" r:id="rIdopv4d3neiot4mv6tbmfmu">
+      <w:hyperlink w:history="1" r:id="rId_uib45lp3j43alab5hits">
         <w:r>
           <w:rPr>
             <w:color w:val="0563C1"/>
@@ -5447,7 +5385,7 @@
       <w:r>
         <w:t xml:space="preserve">, ISO/IEC 27031:2011. [Online]. Available: </w:t>
       </w:r>
-      <w:hyperlink w:history="1" r:id="rId5csfhdye3eylo1fcpxswi">
+      <w:hyperlink w:history="1" r:id="rIdqwe89tdlhjf0uamvoxoxb">
         <w:r>
           <w:rPr>
             <w:color w:val="0563C1"/>
@@ -5468,7 +5406,7 @@
       <w:r>
         <w:t xml:space="preserve">Amazon Web Services, "Lambda quotas," AWS Lambda Developer Guide. [Online]. Available: </w:t>
       </w:r>
-      <w:hyperlink w:history="1" r:id="rIdxdqlctjnpzvxnuoqvoidc">
+      <w:hyperlink w:history="1" r:id="rIdenhqywksn8rbl1sg3r1uf">
         <w:r>
           <w:rPr>
             <w:color w:val="0563C1"/>
@@ -5489,7 +5427,7 @@
       <w:r>
         <w:t xml:space="preserve">Amazon Web Services, "What is Step Functions?," AWS Step Functions Developer Guide. [Online]. Available: </w:t>
       </w:r>
-      <w:hyperlink w:history="1" r:id="rId_l6dyqek_ehrrmmsn9niz">
+      <w:hyperlink w:history="1" r:id="rIdp_d0gxaywxssn6bi_kzea">
         <w:r>
           <w:rPr>
             <w:color w:val="0563C1"/>
@@ -5510,7 +5448,7 @@
       <w:r>
         <w:t xml:space="preserve">Amazon Web Services, "Handling errors in Step Functions workflows," AWS Step Functions Developer Guide. [Online]. Available: </w:t>
       </w:r>
-      <w:hyperlink w:history="1" r:id="rIdxtzugji_f8j9cwicfic9c">
+      <w:hyperlink w:history="1" r:id="rIdnfdztarouizw1z8cdfk0t">
         <w:r>
           <w:rPr>
             <w:color w:val="0563C1"/>
@@ -5531,7 +5469,7 @@
       <w:r>
         <w:t xml:space="preserve">Amazon Web Services, "Security best practices in IAM," AWS IAM User Guide. [Online]. Available: </w:t>
       </w:r>
-      <w:hyperlink w:history="1" r:id="rIdoeshtexvf_8pm0m9p9rbo">
+      <w:hyperlink w:history="1" r:id="rIdgo6zfdvtjt1w0tde2msmx">
         <w:r>
           <w:rPr>
             <w:color w:val="0563C1"/>
@@ -5552,7 +5490,7 @@
       <w:r>
         <w:t xml:space="preserve">Amazon Web Services, "IAM JSON policy reference," AWS IAM User Guide. [Online]. Available: </w:t>
       </w:r>
-      <w:hyperlink w:history="1" r:id="rIdcaqqt_7ctsbnob_r11apc">
+      <w:hyperlink w:history="1" r:id="rIdxslexkwa0eyjg9s8zexlt">
         <w:r>
           <w:rPr>
             <w:color w:val="0563C1"/>
@@ -5573,7 +5511,7 @@
       <w:r>
         <w:t xml:space="preserve">Amazon Web Services, "IAM database authentication for MariaDB, MySQL, and PostgreSQL," Amazon RDS User Guide. [Online]. Available: </w:t>
       </w:r>
-      <w:hyperlink w:history="1" r:id="rIdpaj1cft0ux1ohvx9car65">
+      <w:hyperlink w:history="1" r:id="rId_i353kdslniqhtxoa8s5g">
         <w:r>
           <w:rPr>
             <w:color w:val="0563C1"/>
@@ -5594,7 +5532,7 @@
       <w:r>
         <w:t xml:space="preserve">Amazon Web Services, "Using SSL/TLS to encrypt a connection to a DB instance or cluster," Amazon RDS User Guide. [Online]. Available: </w:t>
       </w:r>
-      <w:hyperlink w:history="1" r:id="rIdvqibjtsrmvqgaeryqzuyz">
+      <w:hyperlink w:history="1" r:id="rIdoj4t8wlzv3kfslx1tdejp">
         <w:r>
           <w:rPr>
             <w:color w:val="0563C1"/>
@@ -5615,7 +5553,7 @@
       <w:r>
         <w:t xml:space="preserve">Amazon Web Services, "Control traffic to your AWS resources using security groups," Amazon VPC User Guide. [Online]. Available: </w:t>
       </w:r>
-      <w:hyperlink w:history="1" r:id="rIdxgxvugviybk7ugctfw47k">
+      <w:hyperlink w:history="1" r:id="rId8wzuakakrckgmmaatbbsu">
         <w:r>
           <w:rPr>
             <w:color w:val="0563C1"/>
@@ -5636,7 +5574,7 @@
       <w:r>
         <w:t xml:space="preserve">Amazon Web Services, "Giving Lambda event functions access to resources in an Amazon VPC," AWS Lambda Developer Guide. [Online]. Available: </w:t>
       </w:r>
-      <w:hyperlink w:history="1" r:id="rIds2jveidoszlfyhxtofwvp">
+      <w:hyperlink w:history="1" r:id="rIdmuxyfzqe11mrimdzpg_hg">
         <w:r>
           <w:rPr>
             <w:color w:val="0563C1"/>
@@ -5657,7 +5595,7 @@
       <w:r>
         <w:t xml:space="preserve">Amazon Web Services, "What is the AWS Serverless Application Model (AWS SAM)?," AWS SAM Developer Guide. [Online]. Available: </w:t>
       </w:r>
-      <w:hyperlink w:history="1" r:id="rIdcweaxo_xtrenzzawkxaiu">
+      <w:hyperlink w:history="1" r:id="rIdbwrycwgju87i1fflrtayu">
         <w:r>
           <w:rPr>
             <w:color w:val="0563C1"/>
@@ -5678,7 +5616,7 @@
       <w:r>
         <w:t xml:space="preserve">Amazon Web Services, "What is CloudFormation?," AWS CloudFormation User Guide. [Online]. Available: </w:t>
       </w:r>
-      <w:hyperlink w:history="1" r:id="rIdjqbzezweiby1dkugyrnnj">
+      <w:hyperlink w:history="1" r:id="rIdpkvvgmfqbvc6ddg2gemcw">
         <w:r>
           <w:rPr>
             <w:color w:val="0563C1"/>
@@ -5699,7 +5637,7 @@
       <w:r>
         <w:t xml:space="preserve">United Nations, "Goal 9: Build resilient infrastructure, promote inclusive and sustainable industrialization and foster innovation." [Online]. Available: </w:t>
       </w:r>
-      <w:hyperlink w:history="1" r:id="rIdkbyzaa3otsldnj-lkd30b">
+      <w:hyperlink w:history="1" r:id="rIdma0mar-kmlxdhznl1oru0">
         <w:r>
           <w:rPr>
             <w:color w:val="0563C1"/>
@@ -5720,7 +5658,7 @@
       <w:r>
         <w:t xml:space="preserve">United Nations, "Goal 11: Make cities and human settlements inclusive, safe, resilient and sustainable." [Online]. Available: </w:t>
       </w:r>
-      <w:hyperlink w:history="1" r:id="rIdnt99kz1wialiorti0hxnr">
+      <w:hyperlink w:history="1" r:id="rId5ckbyrm8wrnovvhpsccqn">
         <w:r>
           <w:rPr>
             <w:color w:val="0563C1"/>
@@ -5751,7 +5689,7 @@
       <w:r>
         <w:t xml:space="preserve">, 2010. [Online]. Available: </w:t>
       </w:r>
-      <w:hyperlink w:history="1" r:id="rIdhbzsogjeqmr3jwbrdarjr">
+      <w:hyperlink w:history="1" r:id="rIduy0jwjv3xub2c-trtnrz7">
         <w:r>
           <w:rPr>
             <w:color w:val="0563C1"/>
@@ -5785,7 +5723,7 @@
       <w:r>
         <w:t xml:space="preserve">doi: </w:t>
       </w:r>
-      <w:hyperlink w:history="1" r:id="rIdrzxgtzbyxm8d9v2q-wath">
+      <w:hyperlink w:history="1" r:id="rIdw2v2yungsggrebnodnags">
         <w:r>
           <w:rPr>
             <w:color w:val="0563C1"/>
@@ -5822,7 +5760,7 @@
       <w:r>
         <w:t xml:space="preserve">doi: </w:t>
       </w:r>
-      <w:hyperlink w:history="1" r:id="rIdotgwisc4dwjkqupq5p9fv">
+      <w:hyperlink w:history="1" r:id="rIdbzouz8aaj44p6xi-inlaf">
         <w:r>
           <w:rPr>
             <w:color w:val="0563C1"/>
@@ -5859,7 +5797,7 @@
       <w:r>
         <w:t xml:space="preserve">doi: </w:t>
       </w:r>
-      <w:hyperlink w:history="1" r:id="rId4appbf1vvabwyv4iy24ff">
+      <w:hyperlink w:history="1" r:id="rIdcsy4fw_jgn7b4vpbsy8ky">
         <w:r>
           <w:rPr>
             <w:color w:val="0563C1"/>
@@ -5893,7 +5831,7 @@
       <w:r>
         <w:t xml:space="preserve">, 2008. [Online]. Available: </w:t>
       </w:r>
-      <w:hyperlink w:history="1" r:id="rIdbn98htxcpmqkhnf0g1o1a">
+      <w:hyperlink w:history="1" r:id="rIddbywanqa1xi7g5_gzjrtq">
         <w:r>
           <w:rPr>
             <w:color w:val="0563C1"/>
@@ -5924,7 +5862,7 @@
       <w:r>
         <w:t xml:space="preserve">, 2007. [Online]. Available: </w:t>
       </w:r>
-      <w:hyperlink w:history="1" r:id="rIdypeh51did7qbhq203vygf">
+      <w:hyperlink w:history="1" r:id="rIddotqbexgovjiz2vfoaimm">
         <w:r>
           <w:rPr>
             <w:color w:val="0563C1"/>
@@ -5958,7 +5896,7 @@
       <w:r>
         <w:t xml:space="preserve">doi: </w:t>
       </w:r>
-      <w:hyperlink w:history="1" r:id="rIdnv0gtkqmny3ws7kfh7smb">
+      <w:hyperlink w:history="1" r:id="rIdgc5yy-t7wvkzlv0vqrk4p">
         <w:r>
           <w:rPr>
             <w:color w:val="0563C1"/>
@@ -5992,7 +5930,7 @@
       <w:r>
         <w:t xml:space="preserve">, 2014. [Online]. Available: </w:t>
       </w:r>
-      <w:hyperlink w:history="1" r:id="rIdflm-h7cyu8n16fevsxryk">
+      <w:hyperlink w:history="1" r:id="rIdoq95t0hkopoofhxvwrsd8">
         <w:r>
           <w:rPr>
             <w:color w:val="0563C1"/>
@@ -6026,7 +5964,7 @@
       <w:r>
         <w:t xml:space="preserve">doi: </w:t>
       </w:r>
-      <w:hyperlink w:history="1" r:id="rIdk9layz2gvl_-gqot1j1e-">
+      <w:hyperlink w:history="1" r:id="rId_csp_yyhqmsjtawmc6rhs">
         <w:r>
           <w:rPr>
             <w:color w:val="0563C1"/>
@@ -6063,7 +6001,7 @@
       <w:r>
         <w:t xml:space="preserve">doi: </w:t>
       </w:r>
-      <w:hyperlink w:history="1" r:id="rIds0u-8vde7ukdtwhmgu4s1">
+      <w:hyperlink w:history="1" r:id="rIdosf7pom3pfaqgcq519k7x">
         <w:r>
           <w:rPr>
             <w:color w:val="0563C1"/>
@@ -6097,7 +6035,7 @@
       <w:r>
         <w:t xml:space="preserve">, B. Beyer, C. Jones, J. Petoff, and N. R. Murphy, Eds. Sebastopol, CA, USA: O'Reilly Media, 2016, ch. 26. [Online]. Available: </w:t>
       </w:r>
-      <w:hyperlink w:history="1" r:id="rId_jo6hpofv8xauwxbztys_">
+      <w:hyperlink w:history="1" r:id="rId-um0dt4aapvast0adejt-">
         <w:r>
           <w:rPr>
             <w:color w:val="0563C1"/>
@@ -6118,7 +6056,7 @@
       <w:r>
         <w:t xml:space="preserve">Amazon Web Services, "Restore testing," AWS Backup Developer Guide. [Online]. Available: </w:t>
       </w:r>
-      <w:hyperlink w:history="1" r:id="rIdw1-bfea1rvsnta72f7x5u">
+      <w:hyperlink w:history="1" r:id="rIdytu9iotyy7rwex1wouqm_">
         <w:r>
           <w:rPr>
             <w:color w:val="0563C1"/>
@@ -6139,7 +6077,7 @@
       <w:r>
         <w:t xml:space="preserve">Amazon Web Services, "What is AWS Backup?," AWS Backup Developer Guide. [Online]. Available: </w:t>
       </w:r>
-      <w:hyperlink w:history="1" r:id="rIdy80kxdlxtzabgkmkxkw_l">
+      <w:hyperlink w:history="1" r:id="rIdvgdu2bqna-qlgkjqpi_ao">
         <w:r>
           <w:rPr>
             <w:color w:val="0563C1"/>
@@ -6160,7 +6098,7 @@
       <w:r>
         <w:t xml:space="preserve">Amazon Web Services, "Amazon States Language." [Online]. Available: </w:t>
       </w:r>
-      <w:hyperlink w:history="1" r:id="rId77xdkprww7mfempmcaqkg">
+      <w:hyperlink w:history="1" r:id="rIdokbbdps3scz_n6mwofw6t">
         <w:r>
           <w:rPr>
             <w:color w:val="0563C1"/>
@@ -6181,7 +6119,7 @@
       <w:r>
         <w:t xml:space="preserve">Amazon Web Services, "Creating a scheduled rule (legacy) in Amazon EventBridge," Amazon EventBridge User Guide. [Online]. Available: </w:t>
       </w:r>
-      <w:hyperlink w:history="1" r:id="rIdrmdexowtynfdfksis8nvx">
+      <w:hyperlink w:history="1" r:id="rIdhyexj0kmhcoxfu8yxrsrk">
         <w:r>
           <w:rPr>
             <w:color w:val="0563C1"/>
@@ -6202,7 +6140,7 @@
       <w:r>
         <w:t xml:space="preserve">Amazon Web Services, "Introduction to backups," Amazon RDS User Guide. [Online]. Available: </w:t>
       </w:r>
-      <w:hyperlink w:history="1" r:id="rIdzmy_euhbdhk7rhewsvpar">
+      <w:hyperlink w:history="1" r:id="rIdxftyfhauw456seqorb3-e">
         <w:r>
           <w:rPr>
             <w:color w:val="0563C1"/>
@@ -6223,7 +6161,7 @@
       <w:r>
         <w:t xml:space="preserve">Amazon Web Services, "Restoring to a DB instance," Amazon RDS User Guide. [Online]. Available: </w:t>
       </w:r>
-      <w:hyperlink w:history="1" r:id="rIdbtiu7nypdggg-sbafcb5b">
+      <w:hyperlink w:history="1" r:id="rIdceshtrae4doy4svvxtpy_">
         <w:r>
           <w:rPr>
             <w:color w:val="0563C1"/>
@@ -6244,7 +6182,7 @@
       <w:r>
         <w:t xml:space="preserve">Amazon Web Services, "Viewing instance status," Amazon RDS User Guide. [Online]. Available: </w:t>
       </w:r>
-      <w:hyperlink w:history="1" r:id="rIduxyxoqqkpn7cqfhujdzct">
+      <w:hyperlink w:history="1" r:id="rId71scpczocpavxyobw5h8x">
         <w:r>
           <w:rPr>
             <w:color w:val="0563C1"/>
@@ -6265,7 +6203,7 @@
       <w:r>
         <w:t xml:space="preserve">Amazon Web Services, "Core components of Amazon DynamoDB," Amazon DynamoDB Developer Guide. [Online]. Available: </w:t>
       </w:r>
-      <w:hyperlink w:history="1" r:id="rIdagpljmz2idlvc6milxcrt">
+      <w:hyperlink w:history="1" r:id="rIdpymt1naizy54ktkuacyvc">
         <w:r>
           <w:rPr>
             <w:color w:val="0563C1"/>
@@ -6286,7 +6224,7 @@
       <w:r>
         <w:t xml:space="preserve">Amazon Web Services, "Publish custom metrics (PutMetricData / EMF)," Amazon CloudWatch User Guide. [Online]. Available: </w:t>
       </w:r>
-      <w:hyperlink w:history="1" r:id="rIdmqbocn1nzjz74a8yqmnfj">
+      <w:hyperlink w:history="1" r:id="rIdjvjvemwggyif2snoigano">
         <w:r>
           <w:rPr>
             <w:color w:val="0563C1"/>
@@ -6307,7 +6245,7 @@
       <w:r>
         <w:t xml:space="preserve">Amazon Web Services, "Amazon SNS email subscription setup and management," Amazon SNS Developer Guide. [Online]. Available: </w:t>
       </w:r>
-      <w:hyperlink w:history="1" r:id="rIdewxotqvahc9gwt18qf_go">
+      <w:hyperlink w:history="1" r:id="rIdpgrrlbup0qy2jdshckl3u">
         <w:r>
           <w:rPr>
             <w:color w:val="0563C1"/>
@@ -6328,7 +6266,7 @@
       <w:r>
         <w:t xml:space="preserve">Amazon Web Services, "Using Amazon CloudWatch dashboards," Amazon CloudWatch User Guide. [Online]. Available: </w:t>
       </w:r>
-      <w:hyperlink w:history="1" r:id="rIdyqhz1qmta9filwo68xote">
+      <w:hyperlink w:history="1" r:id="rId2r-r2gvldgly98xllhidu">
         <w:r>
           <w:rPr>
             <w:color w:val="0563C1"/>
@@ -6349,7 +6287,7 @@
       <w:r>
         <w:t xml:space="preserve">Amazon Web Services, "Service control policies (SCPs)," AWS Organizations User Guide. [Online]. Available: </w:t>
       </w:r>
-      <w:hyperlink w:history="1" r:id="rId5fat4kc0dfwf0nb4nyle5">
+      <w:hyperlink w:history="1" r:id="rIdgmcy92jdlsryfgjkj_f1f">
         <w:r>
           <w:rPr>
             <w:color w:val="0563C1"/>
@@ -6370,7 +6308,7 @@
       <w:r>
         <w:t xml:space="preserve">Amazon Web Services, "Disaster recovery (DR) objectives," AWS Well-Architected Framework. [Online]. Available: </w:t>
       </w:r>
-      <w:hyperlink w:history="1" r:id="rIddrokmftcmtpsmlrw8b2_y">
+      <w:hyperlink w:history="1" r:id="rIdznuez3lftnaua7fjsv114">
         <w:r>
           <w:rPr>
             <w:color w:val="0563C1"/>
@@ -6391,7 +6329,7 @@
       <w:r>
         <w:t xml:space="preserve">Moto contributors, "Moto: Mock AWS services." [Online]. Available: </w:t>
       </w:r>
-      <w:hyperlink w:history="1" r:id="rIduk9a8xudu0i-xdjk0vddk">
+      <w:hyperlink w:history="1" r:id="rIdniv7hucclt9xioisw9ckx">
         <w:r>
           <w:rPr>
             <w:color w:val="0563C1"/>
@@ -6415,7 +6353,7 @@
       <w:r>
         <w:t xml:space="preserve">doi: </w:t>
       </w:r>
-      <w:hyperlink w:history="1" r:id="rIdsumqtdwp6tww8hsnc1ja9">
+      <w:hyperlink w:history="1" r:id="rIdqzxqv-np_16khqvtwprky">
         <w:r>
           <w:rPr>
             <w:color w:val="0563C1"/>
@@ -6439,7 +6377,7 @@
       <w:r>
         <w:t xml:space="preserve">Amazon Web Services, "Disaster recovery of workloads on AWS: Recovery in the cloud," AWS Whitepaper. [Online]. Available: </w:t>
       </w:r>
-      <w:hyperlink w:history="1" r:id="rIds5ata51tz9ddyrd2dwxwn">
+      <w:hyperlink w:history="1" r:id="rIdrp9ysr6idhv-thlnqoe1f">
         <w:r>
           <w:rPr>
             <w:color w:val="0563C1"/>
@@ -6460,7 +6398,7 @@
       <w:r>
         <w:t xml:space="preserve">Amazon Web Services, "Boto3 documentation," AWS SDK for Python. [Online]. Available: </w:t>
       </w:r>
-      <w:hyperlink w:history="1" r:id="rId0wplkcwiexeqoxivtrybf">
+      <w:hyperlink w:history="1" r:id="rIde6wzzqjmirz1tpo6kv9o0">
         <w:r>
           <w:rPr>
             <w:color w:val="0563C1"/>
@@ -6481,7 +6419,7 @@
       <w:r>
         <w:t xml:space="preserve">The PostgreSQL Global Development Group, "Backup and restore," PostgreSQL Documentation. [Online]. Available: </w:t>
       </w:r>
-      <w:hyperlink w:history="1" r:id="rIdnw1rkidl2aclr_wi-velh">
+      <w:hyperlink w:history="1" r:id="rIdfggusszzfmd3iec7vprc3">
         <w:r>
           <w:rPr>
             <w:color w:val="0563C1"/>
@@ -6512,7 +6450,7 @@
       <w:r>
         <w:t xml:space="preserve">, "pg8000: A pure-Python PostgreSQL driver," Python Package Index. [Online]. Available: </w:t>
       </w:r>
-      <w:hyperlink w:history="1" r:id="rIdfzakle2tiygaqt6qnutow">
+      <w:hyperlink w:history="1" r:id="rId3cnqzhqw7xxdcl-tf1rfo">
         <w:r>
           <w:rPr>
             <w:color w:val="0563C1"/>
@@ -6533,7 +6471,7 @@
       <w:r>
         <w:t xml:space="preserve">LocalStack, "LocalStack documentation." [Online]. Available: </w:t>
       </w:r>
-      <w:hyperlink w:history="1" r:id="rIdmgyc6r76gyox1yw42gpdq">
+      <w:hyperlink w:history="1" r:id="rIdvfmfsphevufvvbv6xbeng">
         <w:r>
           <w:rPr>
             <w:color w:val="0563C1"/>

</xml_diff>

<commit_message>
Report: plain black academic style with numbered sections
Black headings, links and table borders; no coloured fills; ruled header line.
</commit_message>
<xml_diff>
--- a/report/RestoreCheck_DA3_Report.docx
+++ b/report/RestoreCheck_DA3_Report.docx
@@ -5,12 +5,11 @@
     <w:p>
       <w:pPr>
         <w:pBdr>
-          <w:top w:val="dashed" w:color="9CA3AF" w:sz="8" w:space="10"/>
-          <w:left w:val="dashed" w:color="9CA3AF" w:sz="8" w:space="10"/>
-          <w:bottom w:val="dashed" w:color="9CA3AF" w:sz="8" w:space="10"/>
-          <w:right w:val="dashed" w:color="9CA3AF" w:sz="8" w:space="10"/>
+          <w:top w:val="dashed" w:color="000000" w:sz="6" w:space="10"/>
+          <w:left w:val="dashed" w:color="000000" w:sz="6" w:space="10"/>
+          <w:bottom w:val="dashed" w:color="000000" w:sz="6" w:space="10"/>
+          <w:right w:val="dashed" w:color="000000" w:sz="6" w:space="10"/>
         </w:pBdr>
-        <w:shd w:fill="F3F4F6" w:color="auto" w:val="clear"/>
         <w:spacing w:after="120" w:before="240" w:line="360"/>
         <w:jc w:val="center"/>
       </w:pPr>
@@ -18,7 +17,6 @@
         <w:rPr>
           <w:i/>
           <w:iCs/>
-          <w:color w:val="6B7280"/>
         </w:rPr>
         <w:t xml:space="preserve">[ Insert the official VIT logo here ]</w:t>
       </w:r>
@@ -128,12 +126,11 @@
           <w:tcPr>
             <w:tcW w:type="dxa" w:w="3000"/>
             <w:tcBorders>
-              <w:top w:val="single" w:color="A0A7AE" w:sz="4"/>
-              <w:left w:val="single" w:color="A0A7AE" w:sz="4"/>
-              <w:bottom w:val="single" w:color="A0A7AE" w:sz="4"/>
-              <w:right w:val="single" w:color="A0A7AE" w:sz="4"/>
-            </w:tcBorders>
-            <w:shd w:fill="DCE6F2" w:color="auto" w:val="clear"/>
+              <w:top w:val="single" w:color="000000" w:sz="4"/>
+              <w:left w:val="single" w:color="000000" w:sz="4"/>
+              <w:bottom w:val="single" w:color="000000" w:sz="4"/>
+              <w:right w:val="single" w:color="000000" w:sz="4"/>
+            </w:tcBorders>
             <w:tcMar>
               <w:top w:type="dxa" w:w="60"/>
               <w:left w:type="dxa" w:w="100"/>
@@ -157,12 +154,11 @@
           <w:tcPr>
             <w:tcW w:type="dxa" w:w="6026"/>
             <w:tcBorders>
-              <w:top w:val="single" w:color="A0A7AE" w:sz="4"/>
-              <w:left w:val="single" w:color="A0A7AE" w:sz="4"/>
-              <w:bottom w:val="single" w:color="A0A7AE" w:sz="4"/>
-              <w:right w:val="single" w:color="A0A7AE" w:sz="4"/>
-            </w:tcBorders>
-            <w:shd w:fill="DCE6F2" w:color="auto" w:val="clear"/>
+              <w:top w:val="single" w:color="000000" w:sz="4"/>
+              <w:left w:val="single" w:color="000000" w:sz="4"/>
+              <w:bottom w:val="single" w:color="000000" w:sz="4"/>
+              <w:right w:val="single" w:color="000000" w:sz="4"/>
+            </w:tcBorders>
             <w:tcMar>
               <w:top w:type="dxa" w:w="60"/>
               <w:left w:type="dxa" w:w="100"/>
@@ -192,10 +188,10 @@
           <w:tcPr>
             <w:tcW w:type="dxa" w:w="3000"/>
             <w:tcBorders>
-              <w:top w:val="single" w:color="A0A7AE" w:sz="4"/>
-              <w:left w:val="single" w:color="A0A7AE" w:sz="4"/>
-              <w:bottom w:val="single" w:color="A0A7AE" w:sz="4"/>
-              <w:right w:val="single" w:color="A0A7AE" w:sz="4"/>
+              <w:top w:val="single" w:color="000000" w:sz="4"/>
+              <w:left w:val="single" w:color="000000" w:sz="4"/>
+              <w:bottom w:val="single" w:color="000000" w:sz="4"/>
+              <w:right w:val="single" w:color="000000" w:sz="4"/>
             </w:tcBorders>
             <w:tcMar>
               <w:top w:type="dxa" w:w="60"/>
@@ -220,10 +216,10 @@
           <w:tcPr>
             <w:tcW w:type="dxa" w:w="6026"/>
             <w:tcBorders>
-              <w:top w:val="single" w:color="A0A7AE" w:sz="4"/>
-              <w:left w:val="single" w:color="A0A7AE" w:sz="4"/>
-              <w:bottom w:val="single" w:color="A0A7AE" w:sz="4"/>
-              <w:right w:val="single" w:color="A0A7AE" w:sz="4"/>
+              <w:top w:val="single" w:color="000000" w:sz="4"/>
+              <w:left w:val="single" w:color="000000" w:sz="4"/>
+              <w:bottom w:val="single" w:color="000000" w:sz="4"/>
+              <w:right w:val="single" w:color="000000" w:sz="4"/>
             </w:tcBorders>
             <w:tcMar>
               <w:top w:type="dxa" w:w="60"/>
@@ -254,10 +250,10 @@
           <w:tcPr>
             <w:tcW w:type="dxa" w:w="3000"/>
             <w:tcBorders>
-              <w:top w:val="single" w:color="A0A7AE" w:sz="4"/>
-              <w:left w:val="single" w:color="A0A7AE" w:sz="4"/>
-              <w:bottom w:val="single" w:color="A0A7AE" w:sz="4"/>
-              <w:right w:val="single" w:color="A0A7AE" w:sz="4"/>
+              <w:top w:val="single" w:color="000000" w:sz="4"/>
+              <w:left w:val="single" w:color="000000" w:sz="4"/>
+              <w:bottom w:val="single" w:color="000000" w:sz="4"/>
+              <w:right w:val="single" w:color="000000" w:sz="4"/>
             </w:tcBorders>
             <w:tcMar>
               <w:top w:type="dxa" w:w="60"/>
@@ -282,10 +278,10 @@
           <w:tcPr>
             <w:tcW w:type="dxa" w:w="6026"/>
             <w:tcBorders>
-              <w:top w:val="single" w:color="A0A7AE" w:sz="4"/>
-              <w:left w:val="single" w:color="A0A7AE" w:sz="4"/>
-              <w:bottom w:val="single" w:color="A0A7AE" w:sz="4"/>
-              <w:right w:val="single" w:color="A0A7AE" w:sz="4"/>
+              <w:top w:val="single" w:color="000000" w:sz="4"/>
+              <w:left w:val="single" w:color="000000" w:sz="4"/>
+              <w:bottom w:val="single" w:color="000000" w:sz="4"/>
+              <w:right w:val="single" w:color="000000" w:sz="4"/>
             </w:tcBorders>
             <w:tcMar>
               <w:top w:type="dxa" w:w="60"/>
@@ -350,7 +346,7 @@
         <w:pStyle w:val="Heading1"/>
       </w:pPr>
       <w:r>
-        <w:t xml:space="preserve">Abstract</w:t>
+        <w:t xml:space="preserve">1.  Abstract</w:t>
       </w:r>
     </w:p>
     <w:p>
@@ -393,7 +389,7 @@
         <w:pStyle w:val="Heading1"/>
       </w:pPr>
       <w:r>
-        <w:t xml:space="preserve">Problem statement</w:t>
+        <w:t xml:space="preserve">2.  Problem statement</w:t>
       </w:r>
     </w:p>
     <w:p>
@@ -559,7 +555,7 @@
         <w:pStyle w:val="Heading1"/>
       </w:pPr>
       <w:r>
-        <w:t xml:space="preserve">Highlights of the project / Novelty</w:t>
+        <w:t xml:space="preserve">3.  Highlights of the project / Novelty</w:t>
       </w:r>
     </w:p>
     <w:p>
@@ -768,7 +764,7 @@
         <w:pStyle w:val="Heading2"/>
       </w:pPr>
       <w:r>
-        <w:t xml:space="preserve">Related work and prior art</w:t>
+        <w:t xml:space="preserve">3.1  Related work and prior art</w:t>
       </w:r>
     </w:p>
     <w:p>
@@ -811,7 +807,7 @@
         <w:pStyle w:val="Heading1"/>
       </w:pPr>
       <w:r>
-        <w:t xml:space="preserve">Dataset link</w:t>
+        <w:t xml:space="preserve">4.  Dataset link</w:t>
       </w:r>
     </w:p>
     <w:p>
@@ -882,7 +878,7 @@
         <w:pStyle w:val="Heading1"/>
       </w:pPr>
       <w:r>
-        <w:t xml:space="preserve">Project demo link</w:t>
+        <w:t xml:space="preserve">5.  Project demo link</w:t>
       </w:r>
     </w:p>
     <w:p>
@@ -900,10 +896,10 @@
       <w:r>
         <w:t xml:space="preserve"> </w:t>
       </w:r>
-      <w:hyperlink w:history="1" r:id="rIdal9jvbo6pcqckkapksq2g">
+      <w:hyperlink w:history="1" r:id="rIdmmilmrkbuoma1i1zvygml">
         <w:r>
           <w:rPr>
-            <w:color w:val="0563C1"/>
+            <w:color w:val="000000"/>
             <w:u w:val="single"/>
           </w:rPr>
           <w:t xml:space="preserve">https://ranenabner.github.io/restorecheck/</w:t>
@@ -931,7 +927,7 @@
         <w:pStyle w:val="Heading1"/>
       </w:pPr>
       <w:r>
-        <w:t xml:space="preserve">GitHub repository link</w:t>
+        <w:t xml:space="preserve">6.  GitHub repository link</w:t>
       </w:r>
     </w:p>
     <w:p>
@@ -949,10 +945,10 @@
       <w:r>
         <w:t xml:space="preserve"> </w:t>
       </w:r>
-      <w:hyperlink w:history="1" r:id="rIdn1bh_bah9ptmsur9_k7bi">
+      <w:hyperlink w:history="1" r:id="rIdxmwcmogqthcda7teg2t_p">
         <w:r>
           <w:rPr>
-            <w:color w:val="0563C1"/>
+            <w:color w:val="000000"/>
             <w:u w:val="single"/>
           </w:rPr>
           <w:t xml:space="preserve">https://github.com/RanenAbner/restorecheck</w:t>
@@ -974,10 +970,10 @@
       <w:r>
         <w:t xml:space="preserve"> Ranen Abner, Sai Charan, and S. Vigneshwari, "RestoreCheck: Automated Backup Recoverability Verification and Disaster-Recovery Testing on AWS," GitHub repository, 2026. [Online]. Available: </w:t>
       </w:r>
-      <w:hyperlink w:history="1" r:id="rIdm3fblhvqfgkdd3_nvit23">
+      <w:hyperlink w:history="1" r:id="rIdnnxidpsi9kwnih1hoou0-">
         <w:r>
           <w:rPr>
-            <w:color w:val="0563C1"/>
+            <w:color w:val="000000"/>
             <w:u w:val="single"/>
           </w:rPr>
           <w:t xml:space="preserve">https://github.com/RanenAbner/restorecheck</w:t>
@@ -989,18 +985,17 @@
         <w:pStyle w:val="Heading1"/>
       </w:pPr>
       <w:r>
-        <w:t xml:space="preserve">Architecture diagram</w:t>
+        <w:t xml:space="preserve">7.  Architecture diagram</w:t>
       </w:r>
     </w:p>
     <w:p>
       <w:pPr>
         <w:pBdr>
-          <w:top w:val="dashed" w:color="9CA3AF" w:sz="8" w:space="10"/>
-          <w:left w:val="dashed" w:color="9CA3AF" w:sz="8" w:space="10"/>
-          <w:bottom w:val="dashed" w:color="9CA3AF" w:sz="8" w:space="10"/>
-          <w:right w:val="dashed" w:color="9CA3AF" w:sz="8" w:space="10"/>
+          <w:top w:val="dashed" w:color="000000" w:sz="6" w:space="10"/>
+          <w:left w:val="dashed" w:color="000000" w:sz="6" w:space="10"/>
+          <w:bottom w:val="dashed" w:color="000000" w:sz="6" w:space="10"/>
+          <w:right w:val="dashed" w:color="000000" w:sz="6" w:space="10"/>
         </w:pBdr>
-        <w:shd w:fill="F3F4F6" w:color="auto" w:val="clear"/>
         <w:spacing w:after="120" w:before="240" w:line="360"/>
         <w:jc w:val="center"/>
       </w:pPr>
@@ -1008,7 +1003,6 @@
         <w:rPr>
           <w:i/>
           <w:iCs/>
-          <w:color w:val="6B7280"/>
         </w:rPr>
         <w:t xml:space="preserve">[ Insert Figure 1: export docs/architecture.drawio to PNG at app.diagrams.net (File &gt; Export as &gt; PNG, 200%) ]</w:t>
       </w:r>
@@ -1209,12 +1203,11 @@
           <w:tcPr>
             <w:tcW w:type="dxa" w:w="2500"/>
             <w:tcBorders>
-              <w:top w:val="single" w:color="A0A7AE" w:sz="4"/>
-              <w:left w:val="single" w:color="A0A7AE" w:sz="4"/>
-              <w:bottom w:val="single" w:color="A0A7AE" w:sz="4"/>
-              <w:right w:val="single" w:color="A0A7AE" w:sz="4"/>
-            </w:tcBorders>
-            <w:shd w:fill="DCE6F2" w:color="auto" w:val="clear"/>
+              <w:top w:val="single" w:color="000000" w:sz="4"/>
+              <w:left w:val="single" w:color="000000" w:sz="4"/>
+              <w:bottom w:val="single" w:color="000000" w:sz="4"/>
+              <w:right w:val="single" w:color="000000" w:sz="4"/>
+            </w:tcBorders>
             <w:tcMar>
               <w:top w:type="dxa" w:w="60"/>
               <w:left w:type="dxa" w:w="100"/>
@@ -1238,12 +1231,11 @@
           <w:tcPr>
             <w:tcW w:type="dxa" w:w="6526"/>
             <w:tcBorders>
-              <w:top w:val="single" w:color="A0A7AE" w:sz="4"/>
-              <w:left w:val="single" w:color="A0A7AE" w:sz="4"/>
-              <w:bottom w:val="single" w:color="A0A7AE" w:sz="4"/>
-              <w:right w:val="single" w:color="A0A7AE" w:sz="4"/>
-            </w:tcBorders>
-            <w:shd w:fill="DCE6F2" w:color="auto" w:val="clear"/>
+              <w:top w:val="single" w:color="000000" w:sz="4"/>
+              <w:left w:val="single" w:color="000000" w:sz="4"/>
+              <w:bottom w:val="single" w:color="000000" w:sz="4"/>
+              <w:right w:val="single" w:color="000000" w:sz="4"/>
+            </w:tcBorders>
             <w:tcMar>
               <w:top w:type="dxa" w:w="60"/>
               <w:left w:type="dxa" w:w="100"/>
@@ -1273,10 +1265,10 @@
           <w:tcPr>
             <w:tcW w:type="dxa" w:w="2500"/>
             <w:tcBorders>
-              <w:top w:val="single" w:color="A0A7AE" w:sz="4"/>
-              <w:left w:val="single" w:color="A0A7AE" w:sz="4"/>
-              <w:bottom w:val="single" w:color="A0A7AE" w:sz="4"/>
-              <w:right w:val="single" w:color="A0A7AE" w:sz="4"/>
+              <w:top w:val="single" w:color="000000" w:sz="4"/>
+              <w:left w:val="single" w:color="000000" w:sz="4"/>
+              <w:bottom w:val="single" w:color="000000" w:sz="4"/>
+              <w:right w:val="single" w:color="000000" w:sz="4"/>
             </w:tcBorders>
             <w:tcMar>
               <w:top w:type="dxa" w:w="60"/>
@@ -1301,10 +1293,10 @@
           <w:tcPr>
             <w:tcW w:type="dxa" w:w="6526"/>
             <w:tcBorders>
-              <w:top w:val="single" w:color="A0A7AE" w:sz="4"/>
-              <w:left w:val="single" w:color="A0A7AE" w:sz="4"/>
-              <w:bottom w:val="single" w:color="A0A7AE" w:sz="4"/>
-              <w:right w:val="single" w:color="A0A7AE" w:sz="4"/>
+              <w:top w:val="single" w:color="000000" w:sz="4"/>
+              <w:left w:val="single" w:color="000000" w:sz="4"/>
+              <w:bottom w:val="single" w:color="000000" w:sz="4"/>
+              <w:right w:val="single" w:color="000000" w:sz="4"/>
             </w:tcBorders>
             <w:tcMar>
               <w:top w:type="dxa" w:w="60"/>
@@ -1335,10 +1327,10 @@
           <w:tcPr>
             <w:tcW w:type="dxa" w:w="2500"/>
             <w:tcBorders>
-              <w:top w:val="single" w:color="A0A7AE" w:sz="4"/>
-              <w:left w:val="single" w:color="A0A7AE" w:sz="4"/>
-              <w:bottom w:val="single" w:color="A0A7AE" w:sz="4"/>
-              <w:right w:val="single" w:color="A0A7AE" w:sz="4"/>
+              <w:top w:val="single" w:color="000000" w:sz="4"/>
+              <w:left w:val="single" w:color="000000" w:sz="4"/>
+              <w:bottom w:val="single" w:color="000000" w:sz="4"/>
+              <w:right w:val="single" w:color="000000" w:sz="4"/>
             </w:tcBorders>
             <w:tcMar>
               <w:top w:type="dxa" w:w="60"/>
@@ -1363,10 +1355,10 @@
           <w:tcPr>
             <w:tcW w:type="dxa" w:w="6526"/>
             <w:tcBorders>
-              <w:top w:val="single" w:color="A0A7AE" w:sz="4"/>
-              <w:left w:val="single" w:color="A0A7AE" w:sz="4"/>
-              <w:bottom w:val="single" w:color="A0A7AE" w:sz="4"/>
-              <w:right w:val="single" w:color="A0A7AE" w:sz="4"/>
+              <w:top w:val="single" w:color="000000" w:sz="4"/>
+              <w:left w:val="single" w:color="000000" w:sz="4"/>
+              <w:bottom w:val="single" w:color="000000" w:sz="4"/>
+              <w:right w:val="single" w:color="000000" w:sz="4"/>
             </w:tcBorders>
             <w:tcMar>
               <w:top w:type="dxa" w:w="60"/>
@@ -1397,10 +1389,10 @@
           <w:tcPr>
             <w:tcW w:type="dxa" w:w="2500"/>
             <w:tcBorders>
-              <w:top w:val="single" w:color="A0A7AE" w:sz="4"/>
-              <w:left w:val="single" w:color="A0A7AE" w:sz="4"/>
-              <w:bottom w:val="single" w:color="A0A7AE" w:sz="4"/>
-              <w:right w:val="single" w:color="A0A7AE" w:sz="4"/>
+              <w:top w:val="single" w:color="000000" w:sz="4"/>
+              <w:left w:val="single" w:color="000000" w:sz="4"/>
+              <w:bottom w:val="single" w:color="000000" w:sz="4"/>
+              <w:right w:val="single" w:color="000000" w:sz="4"/>
             </w:tcBorders>
             <w:tcMar>
               <w:top w:type="dxa" w:w="60"/>
@@ -1425,10 +1417,10 @@
           <w:tcPr>
             <w:tcW w:type="dxa" w:w="6526"/>
             <w:tcBorders>
-              <w:top w:val="single" w:color="A0A7AE" w:sz="4"/>
-              <w:left w:val="single" w:color="A0A7AE" w:sz="4"/>
-              <w:bottom w:val="single" w:color="A0A7AE" w:sz="4"/>
-              <w:right w:val="single" w:color="A0A7AE" w:sz="4"/>
+              <w:top w:val="single" w:color="000000" w:sz="4"/>
+              <w:left w:val="single" w:color="000000" w:sz="4"/>
+              <w:bottom w:val="single" w:color="000000" w:sz="4"/>
+              <w:right w:val="single" w:color="000000" w:sz="4"/>
             </w:tcBorders>
             <w:tcMar>
               <w:top w:type="dxa" w:w="60"/>
@@ -1459,10 +1451,10 @@
           <w:tcPr>
             <w:tcW w:type="dxa" w:w="2500"/>
             <w:tcBorders>
-              <w:top w:val="single" w:color="A0A7AE" w:sz="4"/>
-              <w:left w:val="single" w:color="A0A7AE" w:sz="4"/>
-              <w:bottom w:val="single" w:color="A0A7AE" w:sz="4"/>
-              <w:right w:val="single" w:color="A0A7AE" w:sz="4"/>
+              <w:top w:val="single" w:color="000000" w:sz="4"/>
+              <w:left w:val="single" w:color="000000" w:sz="4"/>
+              <w:bottom w:val="single" w:color="000000" w:sz="4"/>
+              <w:right w:val="single" w:color="000000" w:sz="4"/>
             </w:tcBorders>
             <w:tcMar>
               <w:top w:type="dxa" w:w="60"/>
@@ -1487,10 +1479,10 @@
           <w:tcPr>
             <w:tcW w:type="dxa" w:w="6526"/>
             <w:tcBorders>
-              <w:top w:val="single" w:color="A0A7AE" w:sz="4"/>
-              <w:left w:val="single" w:color="A0A7AE" w:sz="4"/>
-              <w:bottom w:val="single" w:color="A0A7AE" w:sz="4"/>
-              <w:right w:val="single" w:color="A0A7AE" w:sz="4"/>
+              <w:top w:val="single" w:color="000000" w:sz="4"/>
+              <w:left w:val="single" w:color="000000" w:sz="4"/>
+              <w:bottom w:val="single" w:color="000000" w:sz="4"/>
+              <w:right w:val="single" w:color="000000" w:sz="4"/>
             </w:tcBorders>
             <w:tcMar>
               <w:top w:type="dxa" w:w="60"/>
@@ -1521,10 +1513,10 @@
           <w:tcPr>
             <w:tcW w:type="dxa" w:w="2500"/>
             <w:tcBorders>
-              <w:top w:val="single" w:color="A0A7AE" w:sz="4"/>
-              <w:left w:val="single" w:color="A0A7AE" w:sz="4"/>
-              <w:bottom w:val="single" w:color="A0A7AE" w:sz="4"/>
-              <w:right w:val="single" w:color="A0A7AE" w:sz="4"/>
+              <w:top w:val="single" w:color="000000" w:sz="4"/>
+              <w:left w:val="single" w:color="000000" w:sz="4"/>
+              <w:bottom w:val="single" w:color="000000" w:sz="4"/>
+              <w:right w:val="single" w:color="000000" w:sz="4"/>
             </w:tcBorders>
             <w:tcMar>
               <w:top w:type="dxa" w:w="60"/>
@@ -1549,10 +1541,10 @@
           <w:tcPr>
             <w:tcW w:type="dxa" w:w="6526"/>
             <w:tcBorders>
-              <w:top w:val="single" w:color="A0A7AE" w:sz="4"/>
-              <w:left w:val="single" w:color="A0A7AE" w:sz="4"/>
-              <w:bottom w:val="single" w:color="A0A7AE" w:sz="4"/>
-              <w:right w:val="single" w:color="A0A7AE" w:sz="4"/>
+              <w:top w:val="single" w:color="000000" w:sz="4"/>
+              <w:left w:val="single" w:color="000000" w:sz="4"/>
+              <w:bottom w:val="single" w:color="000000" w:sz="4"/>
+              <w:right w:val="single" w:color="000000" w:sz="4"/>
             </w:tcBorders>
             <w:tcMar>
               <w:top w:type="dxa" w:w="60"/>
@@ -1583,10 +1575,10 @@
           <w:tcPr>
             <w:tcW w:type="dxa" w:w="2500"/>
             <w:tcBorders>
-              <w:top w:val="single" w:color="A0A7AE" w:sz="4"/>
-              <w:left w:val="single" w:color="A0A7AE" w:sz="4"/>
-              <w:bottom w:val="single" w:color="A0A7AE" w:sz="4"/>
-              <w:right w:val="single" w:color="A0A7AE" w:sz="4"/>
+              <w:top w:val="single" w:color="000000" w:sz="4"/>
+              <w:left w:val="single" w:color="000000" w:sz="4"/>
+              <w:bottom w:val="single" w:color="000000" w:sz="4"/>
+              <w:right w:val="single" w:color="000000" w:sz="4"/>
             </w:tcBorders>
             <w:tcMar>
               <w:top w:type="dxa" w:w="60"/>
@@ -1611,10 +1603,10 @@
           <w:tcPr>
             <w:tcW w:type="dxa" w:w="6526"/>
             <w:tcBorders>
-              <w:top w:val="single" w:color="A0A7AE" w:sz="4"/>
-              <w:left w:val="single" w:color="A0A7AE" w:sz="4"/>
-              <w:bottom w:val="single" w:color="A0A7AE" w:sz="4"/>
-              <w:right w:val="single" w:color="A0A7AE" w:sz="4"/>
+              <w:top w:val="single" w:color="000000" w:sz="4"/>
+              <w:left w:val="single" w:color="000000" w:sz="4"/>
+              <w:bottom w:val="single" w:color="000000" w:sz="4"/>
+              <w:right w:val="single" w:color="000000" w:sz="4"/>
             </w:tcBorders>
             <w:tcMar>
               <w:top w:type="dxa" w:w="60"/>
@@ -1645,10 +1637,10 @@
           <w:tcPr>
             <w:tcW w:type="dxa" w:w="2500"/>
             <w:tcBorders>
-              <w:top w:val="single" w:color="A0A7AE" w:sz="4"/>
-              <w:left w:val="single" w:color="A0A7AE" w:sz="4"/>
-              <w:bottom w:val="single" w:color="A0A7AE" w:sz="4"/>
-              <w:right w:val="single" w:color="A0A7AE" w:sz="4"/>
+              <w:top w:val="single" w:color="000000" w:sz="4"/>
+              <w:left w:val="single" w:color="000000" w:sz="4"/>
+              <w:bottom w:val="single" w:color="000000" w:sz="4"/>
+              <w:right w:val="single" w:color="000000" w:sz="4"/>
             </w:tcBorders>
             <w:tcMar>
               <w:top w:type="dxa" w:w="60"/>
@@ -1673,10 +1665,10 @@
           <w:tcPr>
             <w:tcW w:type="dxa" w:w="6526"/>
             <w:tcBorders>
-              <w:top w:val="single" w:color="A0A7AE" w:sz="4"/>
-              <w:left w:val="single" w:color="A0A7AE" w:sz="4"/>
-              <w:bottom w:val="single" w:color="A0A7AE" w:sz="4"/>
-              <w:right w:val="single" w:color="A0A7AE" w:sz="4"/>
+              <w:top w:val="single" w:color="000000" w:sz="4"/>
+              <w:left w:val="single" w:color="000000" w:sz="4"/>
+              <w:bottom w:val="single" w:color="000000" w:sz="4"/>
+              <w:right w:val="single" w:color="000000" w:sz="4"/>
             </w:tcBorders>
             <w:tcMar>
               <w:top w:type="dxa" w:w="60"/>
@@ -1707,10 +1699,10 @@
           <w:tcPr>
             <w:tcW w:type="dxa" w:w="2500"/>
             <w:tcBorders>
-              <w:top w:val="single" w:color="A0A7AE" w:sz="4"/>
-              <w:left w:val="single" w:color="A0A7AE" w:sz="4"/>
-              <w:bottom w:val="single" w:color="A0A7AE" w:sz="4"/>
-              <w:right w:val="single" w:color="A0A7AE" w:sz="4"/>
+              <w:top w:val="single" w:color="000000" w:sz="4"/>
+              <w:left w:val="single" w:color="000000" w:sz="4"/>
+              <w:bottom w:val="single" w:color="000000" w:sz="4"/>
+              <w:right w:val="single" w:color="000000" w:sz="4"/>
             </w:tcBorders>
             <w:tcMar>
               <w:top w:type="dxa" w:w="60"/>
@@ -1735,10 +1727,10 @@
           <w:tcPr>
             <w:tcW w:type="dxa" w:w="6526"/>
             <w:tcBorders>
-              <w:top w:val="single" w:color="A0A7AE" w:sz="4"/>
-              <w:left w:val="single" w:color="A0A7AE" w:sz="4"/>
-              <w:bottom w:val="single" w:color="A0A7AE" w:sz="4"/>
-              <w:right w:val="single" w:color="A0A7AE" w:sz="4"/>
+              <w:top w:val="single" w:color="000000" w:sz="4"/>
+              <w:left w:val="single" w:color="000000" w:sz="4"/>
+              <w:bottom w:val="single" w:color="000000" w:sz="4"/>
+              <w:right w:val="single" w:color="000000" w:sz="4"/>
             </w:tcBorders>
             <w:tcMar>
               <w:top w:type="dxa" w:w="60"/>
@@ -1769,10 +1761,10 @@
           <w:tcPr>
             <w:tcW w:type="dxa" w:w="2500"/>
             <w:tcBorders>
-              <w:top w:val="single" w:color="A0A7AE" w:sz="4"/>
-              <w:left w:val="single" w:color="A0A7AE" w:sz="4"/>
-              <w:bottom w:val="single" w:color="A0A7AE" w:sz="4"/>
-              <w:right w:val="single" w:color="A0A7AE" w:sz="4"/>
+              <w:top w:val="single" w:color="000000" w:sz="4"/>
+              <w:left w:val="single" w:color="000000" w:sz="4"/>
+              <w:bottom w:val="single" w:color="000000" w:sz="4"/>
+              <w:right w:val="single" w:color="000000" w:sz="4"/>
             </w:tcBorders>
             <w:tcMar>
               <w:top w:type="dxa" w:w="60"/>
@@ -1797,10 +1789,10 @@
           <w:tcPr>
             <w:tcW w:type="dxa" w:w="6526"/>
             <w:tcBorders>
-              <w:top w:val="single" w:color="A0A7AE" w:sz="4"/>
-              <w:left w:val="single" w:color="A0A7AE" w:sz="4"/>
-              <w:bottom w:val="single" w:color="A0A7AE" w:sz="4"/>
-              <w:right w:val="single" w:color="A0A7AE" w:sz="4"/>
+              <w:top w:val="single" w:color="000000" w:sz="4"/>
+              <w:left w:val="single" w:color="000000" w:sz="4"/>
+              <w:bottom w:val="single" w:color="000000" w:sz="4"/>
+              <w:right w:val="single" w:color="000000" w:sz="4"/>
             </w:tcBorders>
             <w:tcMar>
               <w:top w:type="dxa" w:w="60"/>
@@ -1831,10 +1823,10 @@
           <w:tcPr>
             <w:tcW w:type="dxa" w:w="2500"/>
             <w:tcBorders>
-              <w:top w:val="single" w:color="A0A7AE" w:sz="4"/>
-              <w:left w:val="single" w:color="A0A7AE" w:sz="4"/>
-              <w:bottom w:val="single" w:color="A0A7AE" w:sz="4"/>
-              <w:right w:val="single" w:color="A0A7AE" w:sz="4"/>
+              <w:top w:val="single" w:color="000000" w:sz="4"/>
+              <w:left w:val="single" w:color="000000" w:sz="4"/>
+              <w:bottom w:val="single" w:color="000000" w:sz="4"/>
+              <w:right w:val="single" w:color="000000" w:sz="4"/>
             </w:tcBorders>
             <w:tcMar>
               <w:top w:type="dxa" w:w="60"/>
@@ -1859,10 +1851,10 @@
           <w:tcPr>
             <w:tcW w:type="dxa" w:w="6526"/>
             <w:tcBorders>
-              <w:top w:val="single" w:color="A0A7AE" w:sz="4"/>
-              <w:left w:val="single" w:color="A0A7AE" w:sz="4"/>
-              <w:bottom w:val="single" w:color="A0A7AE" w:sz="4"/>
-              <w:right w:val="single" w:color="A0A7AE" w:sz="4"/>
+              <w:top w:val="single" w:color="000000" w:sz="4"/>
+              <w:left w:val="single" w:color="000000" w:sz="4"/>
+              <w:bottom w:val="single" w:color="000000" w:sz="4"/>
+              <w:right w:val="single" w:color="000000" w:sz="4"/>
             </w:tcBorders>
             <w:tcMar>
               <w:top w:type="dxa" w:w="60"/>
@@ -1893,10 +1885,10 @@
           <w:tcPr>
             <w:tcW w:type="dxa" w:w="2500"/>
             <w:tcBorders>
-              <w:top w:val="single" w:color="A0A7AE" w:sz="4"/>
-              <w:left w:val="single" w:color="A0A7AE" w:sz="4"/>
-              <w:bottom w:val="single" w:color="A0A7AE" w:sz="4"/>
-              <w:right w:val="single" w:color="A0A7AE" w:sz="4"/>
+              <w:top w:val="single" w:color="000000" w:sz="4"/>
+              <w:left w:val="single" w:color="000000" w:sz="4"/>
+              <w:bottom w:val="single" w:color="000000" w:sz="4"/>
+              <w:right w:val="single" w:color="000000" w:sz="4"/>
             </w:tcBorders>
             <w:tcMar>
               <w:top w:type="dxa" w:w="60"/>
@@ -1921,10 +1913,10 @@
           <w:tcPr>
             <w:tcW w:type="dxa" w:w="6526"/>
             <w:tcBorders>
-              <w:top w:val="single" w:color="A0A7AE" w:sz="4"/>
-              <w:left w:val="single" w:color="A0A7AE" w:sz="4"/>
-              <w:bottom w:val="single" w:color="A0A7AE" w:sz="4"/>
-              <w:right w:val="single" w:color="A0A7AE" w:sz="4"/>
+              <w:top w:val="single" w:color="000000" w:sz="4"/>
+              <w:left w:val="single" w:color="000000" w:sz="4"/>
+              <w:bottom w:val="single" w:color="000000" w:sz="4"/>
+              <w:right w:val="single" w:color="000000" w:sz="4"/>
             </w:tcBorders>
             <w:tcMar>
               <w:top w:type="dxa" w:w="60"/>
@@ -1955,10 +1947,10 @@
           <w:tcPr>
             <w:tcW w:type="dxa" w:w="2500"/>
             <w:tcBorders>
-              <w:top w:val="single" w:color="A0A7AE" w:sz="4"/>
-              <w:left w:val="single" w:color="A0A7AE" w:sz="4"/>
-              <w:bottom w:val="single" w:color="A0A7AE" w:sz="4"/>
-              <w:right w:val="single" w:color="A0A7AE" w:sz="4"/>
+              <w:top w:val="single" w:color="000000" w:sz="4"/>
+              <w:left w:val="single" w:color="000000" w:sz="4"/>
+              <w:bottom w:val="single" w:color="000000" w:sz="4"/>
+              <w:right w:val="single" w:color="000000" w:sz="4"/>
             </w:tcBorders>
             <w:tcMar>
               <w:top w:type="dxa" w:w="60"/>
@@ -1983,10 +1975,10 @@
           <w:tcPr>
             <w:tcW w:type="dxa" w:w="6526"/>
             <w:tcBorders>
-              <w:top w:val="single" w:color="A0A7AE" w:sz="4"/>
-              <w:left w:val="single" w:color="A0A7AE" w:sz="4"/>
-              <w:bottom w:val="single" w:color="A0A7AE" w:sz="4"/>
-              <w:right w:val="single" w:color="A0A7AE" w:sz="4"/>
+              <w:top w:val="single" w:color="000000" w:sz="4"/>
+              <w:left w:val="single" w:color="000000" w:sz="4"/>
+              <w:bottom w:val="single" w:color="000000" w:sz="4"/>
+              <w:right w:val="single" w:color="000000" w:sz="4"/>
             </w:tcBorders>
             <w:tcMar>
               <w:top w:type="dxa" w:w="60"/>
@@ -2029,7 +2021,7 @@
         <w:pStyle w:val="Heading2"/>
       </w:pPr>
       <w:r>
-        <w:t xml:space="preserve">Integrity checks</w:t>
+        <w:t xml:space="preserve">7.1  Integrity checks</w:t>
       </w:r>
     </w:p>
     <w:tbl>
@@ -2058,12 +2050,11 @@
           <w:tcPr>
             <w:tcW w:type="dxa" w:w="2300"/>
             <w:tcBorders>
-              <w:top w:val="single" w:color="A0A7AE" w:sz="4"/>
-              <w:left w:val="single" w:color="A0A7AE" w:sz="4"/>
-              <w:bottom w:val="single" w:color="A0A7AE" w:sz="4"/>
-              <w:right w:val="single" w:color="A0A7AE" w:sz="4"/>
-            </w:tcBorders>
-            <w:shd w:fill="DCE6F2" w:color="auto" w:val="clear"/>
+              <w:top w:val="single" w:color="000000" w:sz="4"/>
+              <w:left w:val="single" w:color="000000" w:sz="4"/>
+              <w:bottom w:val="single" w:color="000000" w:sz="4"/>
+              <w:right w:val="single" w:color="000000" w:sz="4"/>
+            </w:tcBorders>
             <w:tcMar>
               <w:top w:type="dxa" w:w="60"/>
               <w:left w:type="dxa" w:w="100"/>
@@ -2087,12 +2078,11 @@
           <w:tcPr>
             <w:tcW w:type="dxa" w:w="3826"/>
             <w:tcBorders>
-              <w:top w:val="single" w:color="A0A7AE" w:sz="4"/>
-              <w:left w:val="single" w:color="A0A7AE" w:sz="4"/>
-              <w:bottom w:val="single" w:color="A0A7AE" w:sz="4"/>
-              <w:right w:val="single" w:color="A0A7AE" w:sz="4"/>
-            </w:tcBorders>
-            <w:shd w:fill="DCE6F2" w:color="auto" w:val="clear"/>
+              <w:top w:val="single" w:color="000000" w:sz="4"/>
+              <w:left w:val="single" w:color="000000" w:sz="4"/>
+              <w:bottom w:val="single" w:color="000000" w:sz="4"/>
+              <w:right w:val="single" w:color="000000" w:sz="4"/>
+            </w:tcBorders>
             <w:tcMar>
               <w:top w:type="dxa" w:w="60"/>
               <w:left w:type="dxa" w:w="100"/>
@@ -2116,12 +2106,11 @@
           <w:tcPr>
             <w:tcW w:type="dxa" w:w="2900"/>
             <w:tcBorders>
-              <w:top w:val="single" w:color="A0A7AE" w:sz="4"/>
-              <w:left w:val="single" w:color="A0A7AE" w:sz="4"/>
-              <w:bottom w:val="single" w:color="A0A7AE" w:sz="4"/>
-              <w:right w:val="single" w:color="A0A7AE" w:sz="4"/>
-            </w:tcBorders>
-            <w:shd w:fill="DCE6F2" w:color="auto" w:val="clear"/>
+              <w:top w:val="single" w:color="000000" w:sz="4"/>
+              <w:left w:val="single" w:color="000000" w:sz="4"/>
+              <w:bottom w:val="single" w:color="000000" w:sz="4"/>
+              <w:right w:val="single" w:color="000000" w:sz="4"/>
+            </w:tcBorders>
             <w:tcMar>
               <w:top w:type="dxa" w:w="60"/>
               <w:left w:type="dxa" w:w="100"/>
@@ -2151,10 +2140,10 @@
           <w:tcPr>
             <w:tcW w:type="dxa" w:w="2300"/>
             <w:tcBorders>
-              <w:top w:val="single" w:color="A0A7AE" w:sz="4"/>
-              <w:left w:val="single" w:color="A0A7AE" w:sz="4"/>
-              <w:bottom w:val="single" w:color="A0A7AE" w:sz="4"/>
-              <w:right w:val="single" w:color="A0A7AE" w:sz="4"/>
+              <w:top w:val="single" w:color="000000" w:sz="4"/>
+              <w:left w:val="single" w:color="000000" w:sz="4"/>
+              <w:bottom w:val="single" w:color="000000" w:sz="4"/>
+              <w:right w:val="single" w:color="000000" w:sz="4"/>
             </w:tcBorders>
             <w:tcMar>
               <w:top w:type="dxa" w:w="60"/>
@@ -2180,10 +2169,10 @@
           <w:tcPr>
             <w:tcW w:type="dxa" w:w="3826"/>
             <w:tcBorders>
-              <w:top w:val="single" w:color="A0A7AE" w:sz="4"/>
-              <w:left w:val="single" w:color="A0A7AE" w:sz="4"/>
-              <w:bottom w:val="single" w:color="A0A7AE" w:sz="4"/>
-              <w:right w:val="single" w:color="A0A7AE" w:sz="4"/>
+              <w:top w:val="single" w:color="000000" w:sz="4"/>
+              <w:left w:val="single" w:color="000000" w:sz="4"/>
+              <w:bottom w:val="single" w:color="000000" w:sz="4"/>
+              <w:right w:val="single" w:color="000000" w:sz="4"/>
             </w:tcBorders>
             <w:tcMar>
               <w:top w:type="dxa" w:w="60"/>
@@ -2208,10 +2197,10 @@
           <w:tcPr>
             <w:tcW w:type="dxa" w:w="2900"/>
             <w:tcBorders>
-              <w:top w:val="single" w:color="A0A7AE" w:sz="4"/>
-              <w:left w:val="single" w:color="A0A7AE" w:sz="4"/>
-              <w:bottom w:val="single" w:color="A0A7AE" w:sz="4"/>
-              <w:right w:val="single" w:color="A0A7AE" w:sz="4"/>
+              <w:top w:val="single" w:color="000000" w:sz="4"/>
+              <w:left w:val="single" w:color="000000" w:sz="4"/>
+              <w:bottom w:val="single" w:color="000000" w:sz="4"/>
+              <w:right w:val="single" w:color="000000" w:sz="4"/>
             </w:tcBorders>
             <w:tcMar>
               <w:top w:type="dxa" w:w="60"/>
@@ -2242,10 +2231,10 @@
           <w:tcPr>
             <w:tcW w:type="dxa" w:w="2300"/>
             <w:tcBorders>
-              <w:top w:val="single" w:color="A0A7AE" w:sz="4"/>
-              <w:left w:val="single" w:color="A0A7AE" w:sz="4"/>
-              <w:bottom w:val="single" w:color="A0A7AE" w:sz="4"/>
-              <w:right w:val="single" w:color="A0A7AE" w:sz="4"/>
+              <w:top w:val="single" w:color="000000" w:sz="4"/>
+              <w:left w:val="single" w:color="000000" w:sz="4"/>
+              <w:bottom w:val="single" w:color="000000" w:sz="4"/>
+              <w:right w:val="single" w:color="000000" w:sz="4"/>
             </w:tcBorders>
             <w:tcMar>
               <w:top w:type="dxa" w:w="60"/>
@@ -2271,10 +2260,10 @@
           <w:tcPr>
             <w:tcW w:type="dxa" w:w="3826"/>
             <w:tcBorders>
-              <w:top w:val="single" w:color="A0A7AE" w:sz="4"/>
-              <w:left w:val="single" w:color="A0A7AE" w:sz="4"/>
-              <w:bottom w:val="single" w:color="A0A7AE" w:sz="4"/>
-              <w:right w:val="single" w:color="A0A7AE" w:sz="4"/>
+              <w:top w:val="single" w:color="000000" w:sz="4"/>
+              <w:left w:val="single" w:color="000000" w:sz="4"/>
+              <w:bottom w:val="single" w:color="000000" w:sz="4"/>
+              <w:right w:val="single" w:color="000000" w:sz="4"/>
             </w:tcBorders>
             <w:tcMar>
               <w:top w:type="dxa" w:w="60"/>
@@ -2299,10 +2288,10 @@
           <w:tcPr>
             <w:tcW w:type="dxa" w:w="2900"/>
             <w:tcBorders>
-              <w:top w:val="single" w:color="A0A7AE" w:sz="4"/>
-              <w:left w:val="single" w:color="A0A7AE" w:sz="4"/>
-              <w:bottom w:val="single" w:color="A0A7AE" w:sz="4"/>
-              <w:right w:val="single" w:color="A0A7AE" w:sz="4"/>
+              <w:top w:val="single" w:color="000000" w:sz="4"/>
+              <w:left w:val="single" w:color="000000" w:sz="4"/>
+              <w:bottom w:val="single" w:color="000000" w:sz="4"/>
+              <w:right w:val="single" w:color="000000" w:sz="4"/>
             </w:tcBorders>
             <w:tcMar>
               <w:top w:type="dxa" w:w="60"/>
@@ -2333,10 +2322,10 @@
           <w:tcPr>
             <w:tcW w:type="dxa" w:w="2300"/>
             <w:tcBorders>
-              <w:top w:val="single" w:color="A0A7AE" w:sz="4"/>
-              <w:left w:val="single" w:color="A0A7AE" w:sz="4"/>
-              <w:bottom w:val="single" w:color="A0A7AE" w:sz="4"/>
-              <w:right w:val="single" w:color="A0A7AE" w:sz="4"/>
+              <w:top w:val="single" w:color="000000" w:sz="4"/>
+              <w:left w:val="single" w:color="000000" w:sz="4"/>
+              <w:bottom w:val="single" w:color="000000" w:sz="4"/>
+              <w:right w:val="single" w:color="000000" w:sz="4"/>
             </w:tcBorders>
             <w:tcMar>
               <w:top w:type="dxa" w:w="60"/>
@@ -2362,10 +2351,10 @@
           <w:tcPr>
             <w:tcW w:type="dxa" w:w="3826"/>
             <w:tcBorders>
-              <w:top w:val="single" w:color="A0A7AE" w:sz="4"/>
-              <w:left w:val="single" w:color="A0A7AE" w:sz="4"/>
-              <w:bottom w:val="single" w:color="A0A7AE" w:sz="4"/>
-              <w:right w:val="single" w:color="A0A7AE" w:sz="4"/>
+              <w:top w:val="single" w:color="000000" w:sz="4"/>
+              <w:left w:val="single" w:color="000000" w:sz="4"/>
+              <w:bottom w:val="single" w:color="000000" w:sz="4"/>
+              <w:right w:val="single" w:color="000000" w:sz="4"/>
             </w:tcBorders>
             <w:tcMar>
               <w:top w:type="dxa" w:w="60"/>
@@ -2390,10 +2379,10 @@
           <w:tcPr>
             <w:tcW w:type="dxa" w:w="2900"/>
             <w:tcBorders>
-              <w:top w:val="single" w:color="A0A7AE" w:sz="4"/>
-              <w:left w:val="single" w:color="A0A7AE" w:sz="4"/>
-              <w:bottom w:val="single" w:color="A0A7AE" w:sz="4"/>
-              <w:right w:val="single" w:color="A0A7AE" w:sz="4"/>
+              <w:top w:val="single" w:color="000000" w:sz="4"/>
+              <w:left w:val="single" w:color="000000" w:sz="4"/>
+              <w:bottom w:val="single" w:color="000000" w:sz="4"/>
+              <w:right w:val="single" w:color="000000" w:sz="4"/>
             </w:tcBorders>
             <w:tcMar>
               <w:top w:type="dxa" w:w="60"/>
@@ -2424,10 +2413,10 @@
           <w:tcPr>
             <w:tcW w:type="dxa" w:w="2300"/>
             <w:tcBorders>
-              <w:top w:val="single" w:color="A0A7AE" w:sz="4"/>
-              <w:left w:val="single" w:color="A0A7AE" w:sz="4"/>
-              <w:bottom w:val="single" w:color="A0A7AE" w:sz="4"/>
-              <w:right w:val="single" w:color="A0A7AE" w:sz="4"/>
+              <w:top w:val="single" w:color="000000" w:sz="4"/>
+              <w:left w:val="single" w:color="000000" w:sz="4"/>
+              <w:bottom w:val="single" w:color="000000" w:sz="4"/>
+              <w:right w:val="single" w:color="000000" w:sz="4"/>
             </w:tcBorders>
             <w:tcMar>
               <w:top w:type="dxa" w:w="60"/>
@@ -2453,10 +2442,10 @@
           <w:tcPr>
             <w:tcW w:type="dxa" w:w="3826"/>
             <w:tcBorders>
-              <w:top w:val="single" w:color="A0A7AE" w:sz="4"/>
-              <w:left w:val="single" w:color="A0A7AE" w:sz="4"/>
-              <w:bottom w:val="single" w:color="A0A7AE" w:sz="4"/>
-              <w:right w:val="single" w:color="A0A7AE" w:sz="4"/>
+              <w:top w:val="single" w:color="000000" w:sz="4"/>
+              <w:left w:val="single" w:color="000000" w:sz="4"/>
+              <w:bottom w:val="single" w:color="000000" w:sz="4"/>
+              <w:right w:val="single" w:color="000000" w:sz="4"/>
             </w:tcBorders>
             <w:tcMar>
               <w:top w:type="dxa" w:w="60"/>
@@ -2481,10 +2470,10 @@
           <w:tcPr>
             <w:tcW w:type="dxa" w:w="2900"/>
             <w:tcBorders>
-              <w:top w:val="single" w:color="A0A7AE" w:sz="4"/>
-              <w:left w:val="single" w:color="A0A7AE" w:sz="4"/>
-              <w:bottom w:val="single" w:color="A0A7AE" w:sz="4"/>
-              <w:right w:val="single" w:color="A0A7AE" w:sz="4"/>
+              <w:top w:val="single" w:color="000000" w:sz="4"/>
+              <w:left w:val="single" w:color="000000" w:sz="4"/>
+              <w:bottom w:val="single" w:color="000000" w:sz="4"/>
+              <w:right w:val="single" w:color="000000" w:sz="4"/>
             </w:tcBorders>
             <w:tcMar>
               <w:top w:type="dxa" w:w="60"/>
@@ -2515,10 +2504,10 @@
           <w:tcPr>
             <w:tcW w:type="dxa" w:w="2300"/>
             <w:tcBorders>
-              <w:top w:val="single" w:color="A0A7AE" w:sz="4"/>
-              <w:left w:val="single" w:color="A0A7AE" w:sz="4"/>
-              <w:bottom w:val="single" w:color="A0A7AE" w:sz="4"/>
-              <w:right w:val="single" w:color="A0A7AE" w:sz="4"/>
+              <w:top w:val="single" w:color="000000" w:sz="4"/>
+              <w:left w:val="single" w:color="000000" w:sz="4"/>
+              <w:bottom w:val="single" w:color="000000" w:sz="4"/>
+              <w:right w:val="single" w:color="000000" w:sz="4"/>
             </w:tcBorders>
             <w:tcMar>
               <w:top w:type="dxa" w:w="60"/>
@@ -2544,10 +2533,10 @@
           <w:tcPr>
             <w:tcW w:type="dxa" w:w="3826"/>
             <w:tcBorders>
-              <w:top w:val="single" w:color="A0A7AE" w:sz="4"/>
-              <w:left w:val="single" w:color="A0A7AE" w:sz="4"/>
-              <w:bottom w:val="single" w:color="A0A7AE" w:sz="4"/>
-              <w:right w:val="single" w:color="A0A7AE" w:sz="4"/>
+              <w:top w:val="single" w:color="000000" w:sz="4"/>
+              <w:left w:val="single" w:color="000000" w:sz="4"/>
+              <w:bottom w:val="single" w:color="000000" w:sz="4"/>
+              <w:right w:val="single" w:color="000000" w:sz="4"/>
             </w:tcBorders>
             <w:tcMar>
               <w:top w:type="dxa" w:w="60"/>
@@ -2572,10 +2561,10 @@
           <w:tcPr>
             <w:tcW w:type="dxa" w:w="2900"/>
             <w:tcBorders>
-              <w:top w:val="single" w:color="A0A7AE" w:sz="4"/>
-              <w:left w:val="single" w:color="A0A7AE" w:sz="4"/>
-              <w:bottom w:val="single" w:color="A0A7AE" w:sz="4"/>
-              <w:right w:val="single" w:color="A0A7AE" w:sz="4"/>
+              <w:top w:val="single" w:color="000000" w:sz="4"/>
+              <w:left w:val="single" w:color="000000" w:sz="4"/>
+              <w:bottom w:val="single" w:color="000000" w:sz="4"/>
+              <w:right w:val="single" w:color="000000" w:sz="4"/>
             </w:tcBorders>
             <w:tcMar>
               <w:top w:type="dxa" w:w="60"/>
@@ -2606,10 +2595,10 @@
           <w:tcPr>
             <w:tcW w:type="dxa" w:w="2300"/>
             <w:tcBorders>
-              <w:top w:val="single" w:color="A0A7AE" w:sz="4"/>
-              <w:left w:val="single" w:color="A0A7AE" w:sz="4"/>
-              <w:bottom w:val="single" w:color="A0A7AE" w:sz="4"/>
-              <w:right w:val="single" w:color="A0A7AE" w:sz="4"/>
+              <w:top w:val="single" w:color="000000" w:sz="4"/>
+              <w:left w:val="single" w:color="000000" w:sz="4"/>
+              <w:bottom w:val="single" w:color="000000" w:sz="4"/>
+              <w:right w:val="single" w:color="000000" w:sz="4"/>
             </w:tcBorders>
             <w:tcMar>
               <w:top w:type="dxa" w:w="60"/>
@@ -2635,10 +2624,10 @@
           <w:tcPr>
             <w:tcW w:type="dxa" w:w="3826"/>
             <w:tcBorders>
-              <w:top w:val="single" w:color="A0A7AE" w:sz="4"/>
-              <w:left w:val="single" w:color="A0A7AE" w:sz="4"/>
-              <w:bottom w:val="single" w:color="A0A7AE" w:sz="4"/>
-              <w:right w:val="single" w:color="A0A7AE" w:sz="4"/>
+              <w:top w:val="single" w:color="000000" w:sz="4"/>
+              <w:left w:val="single" w:color="000000" w:sz="4"/>
+              <w:bottom w:val="single" w:color="000000" w:sz="4"/>
+              <w:right w:val="single" w:color="000000" w:sz="4"/>
             </w:tcBorders>
             <w:tcMar>
               <w:top w:type="dxa" w:w="60"/>
@@ -2663,10 +2652,10 @@
           <w:tcPr>
             <w:tcW w:type="dxa" w:w="2900"/>
             <w:tcBorders>
-              <w:top w:val="single" w:color="A0A7AE" w:sz="4"/>
-              <w:left w:val="single" w:color="A0A7AE" w:sz="4"/>
-              <w:bottom w:val="single" w:color="A0A7AE" w:sz="4"/>
-              <w:right w:val="single" w:color="A0A7AE" w:sz="4"/>
+              <w:top w:val="single" w:color="000000" w:sz="4"/>
+              <w:left w:val="single" w:color="000000" w:sz="4"/>
+              <w:bottom w:val="single" w:color="000000" w:sz="4"/>
+              <w:right w:val="single" w:color="000000" w:sz="4"/>
             </w:tcBorders>
             <w:tcMar>
               <w:top w:type="dxa" w:w="60"/>
@@ -2759,7 +2748,7 @@
         <w:pStyle w:val="Heading2"/>
       </w:pPr>
       <w:r>
-        <w:t xml:space="preserve">Key design decisions</w:t>
+        <w:t xml:space="preserve">7.2  Key design decisions</w:t>
       </w:r>
     </w:p>
     <w:p>
@@ -2858,7 +2847,7 @@
         <w:pStyle w:val="Heading1"/>
       </w:pPr>
       <w:r>
-        <w:t xml:space="preserve">Screenshots</w:t>
+        <w:t xml:space="preserve">8.  Screenshots</w:t>
       </w:r>
     </w:p>
     <w:p>
@@ -2873,12 +2862,11 @@
     <w:p>
       <w:pPr>
         <w:pBdr>
-          <w:top w:val="dashed" w:color="9CA3AF" w:sz="8" w:space="10"/>
-          <w:left w:val="dashed" w:color="9CA3AF" w:sz="8" w:space="10"/>
-          <w:bottom w:val="dashed" w:color="9CA3AF" w:sz="8" w:space="10"/>
-          <w:right w:val="dashed" w:color="9CA3AF" w:sz="8" w:space="10"/>
+          <w:top w:val="dashed" w:color="000000" w:sz="6" w:space="10"/>
+          <w:left w:val="dashed" w:color="000000" w:sz="6" w:space="10"/>
+          <w:bottom w:val="dashed" w:color="000000" w:sz="6" w:space="10"/>
+          <w:right w:val="dashed" w:color="000000" w:sz="6" w:space="10"/>
         </w:pBdr>
-        <w:shd w:fill="F3F4F6" w:color="auto" w:val="clear"/>
         <w:spacing w:after="120" w:before="240" w:line="360"/>
         <w:jc w:val="center"/>
       </w:pPr>
@@ -2886,7 +2874,6 @@
         <w:rPr>
           <w:i/>
           <w:iCs/>
-          <w:color w:val="6B7280"/>
         </w:rPr>
         <w:t xml:space="preserve">[ Insert screenshot: CloudFormation: the deployed restorecheck and restorecheck-demo-db stacks ]</w:t>
       </w:r>
@@ -2909,12 +2896,11 @@
     <w:p>
       <w:pPr>
         <w:pBdr>
-          <w:top w:val="dashed" w:color="9CA3AF" w:sz="8" w:space="10"/>
-          <w:left w:val="dashed" w:color="9CA3AF" w:sz="8" w:space="10"/>
-          <w:bottom w:val="dashed" w:color="9CA3AF" w:sz="8" w:space="10"/>
-          <w:right w:val="dashed" w:color="9CA3AF" w:sz="8" w:space="10"/>
+          <w:top w:val="dashed" w:color="000000" w:sz="6" w:space="10"/>
+          <w:left w:val="dashed" w:color="000000" w:sz="6" w:space="10"/>
+          <w:bottom w:val="dashed" w:color="000000" w:sz="6" w:space="10"/>
+          <w:right w:val="dashed" w:color="000000" w:sz="6" w:space="10"/>
         </w:pBdr>
-        <w:shd w:fill="F3F4F6" w:color="auto" w:val="clear"/>
         <w:spacing w:after="120" w:before="240" w:line="360"/>
         <w:jc w:val="center"/>
       </w:pPr>
@@ -2922,7 +2908,6 @@
         <w:rPr>
           <w:i/>
           <w:iCs/>
-          <w:color w:val="6B7280"/>
         </w:rPr>
         <w:t xml:space="preserve">[ Insert screenshot: Step Functions: graph view of a PASSED execution, every step green and ending in BackupVerified ]</w:t>
       </w:r>
@@ -2945,12 +2930,11 @@
     <w:p>
       <w:pPr>
         <w:pBdr>
-          <w:top w:val="dashed" w:color="9CA3AF" w:sz="8" w:space="10"/>
-          <w:left w:val="dashed" w:color="9CA3AF" w:sz="8" w:space="10"/>
-          <w:bottom w:val="dashed" w:color="9CA3AF" w:sz="8" w:space="10"/>
-          <w:right w:val="dashed" w:color="9CA3AF" w:sz="8" w:space="10"/>
+          <w:top w:val="dashed" w:color="000000" w:sz="6" w:space="10"/>
+          <w:left w:val="dashed" w:color="000000" w:sz="6" w:space="10"/>
+          <w:bottom w:val="dashed" w:color="000000" w:sz="6" w:space="10"/>
+          <w:right w:val="dashed" w:color="000000" w:sz="6" w:space="10"/>
         </w:pBdr>
-        <w:shd w:fill="F3F4F6" w:color="auto" w:val="clear"/>
         <w:spacing w:after="120" w:before="240" w:line="360"/>
         <w:jc w:val="center"/>
       </w:pPr>
@@ -2958,7 +2942,6 @@
         <w:rPr>
           <w:i/>
           <w:iCs/>
-          <w:color w:val="6B7280"/>
         </w:rPr>
         <w:t xml:space="preserve">[ Insert screenshot: Step Functions: a run in progress, looping through WaitForRestore and CheckRestoreStatus until the restored instance is available ]</w:t>
       </w:r>
@@ -2981,12 +2964,11 @@
     <w:p>
       <w:pPr>
         <w:pBdr>
-          <w:top w:val="dashed" w:color="9CA3AF" w:sz="8" w:space="10"/>
-          <w:left w:val="dashed" w:color="9CA3AF" w:sz="8" w:space="10"/>
-          <w:bottom w:val="dashed" w:color="9CA3AF" w:sz="8" w:space="10"/>
-          <w:right w:val="dashed" w:color="9CA3AF" w:sz="8" w:space="10"/>
+          <w:top w:val="dashed" w:color="000000" w:sz="6" w:space="10"/>
+          <w:left w:val="dashed" w:color="000000" w:sz="6" w:space="10"/>
+          <w:bottom w:val="dashed" w:color="000000" w:sz="6" w:space="10"/>
+          <w:right w:val="dashed" w:color="000000" w:sz="6" w:space="10"/>
         </w:pBdr>
-        <w:shd w:fill="F3F4F6" w:color="auto" w:val="clear"/>
         <w:spacing w:after="120" w:before="240" w:line="360"/>
         <w:jc w:val="center"/>
       </w:pPr>
@@ -2994,7 +2976,6 @@
         <w:rPr>
           <w:i/>
           <w:iCs/>
-          <w:color w:val="6B7280"/>
         </w:rPr>
         <w:t xml:space="preserve">[ Insert screenshot: Step Functions: the FAILED corrupt-data execution, ending in the red BackupNotVerified state ]</w:t>
       </w:r>
@@ -3017,12 +2998,11 @@
     <w:p>
       <w:pPr>
         <w:pBdr>
-          <w:top w:val="dashed" w:color="9CA3AF" w:sz="8" w:space="10"/>
-          <w:left w:val="dashed" w:color="9CA3AF" w:sz="8" w:space="10"/>
-          <w:bottom w:val="dashed" w:color="9CA3AF" w:sz="8" w:space="10"/>
-          <w:right w:val="dashed" w:color="9CA3AF" w:sz="8" w:space="10"/>
+          <w:top w:val="dashed" w:color="000000" w:sz="6" w:space="10"/>
+          <w:left w:val="dashed" w:color="000000" w:sz="6" w:space="10"/>
+          <w:bottom w:val="dashed" w:color="000000" w:sz="6" w:space="10"/>
+          <w:right w:val="dashed" w:color="000000" w:sz="6" w:space="10"/>
         </w:pBdr>
-        <w:shd w:fill="F3F4F6" w:color="auto" w:val="clear"/>
         <w:spacing w:after="120" w:before="240" w:line="360"/>
         <w:jc w:val="center"/>
       </w:pPr>
@@ -3030,7 +3010,6 @@
         <w:rPr>
           <w:i/>
           <w:iCs/>
-          <w:color w:val="6B7280"/>
         </w:rPr>
         <w:t xml:space="preserve">[ Insert screenshot: Output of the RunIntegrityChecks step in the corrupt-data run: canary_checksum failed while every other check passed ]</w:t>
       </w:r>
@@ -3053,12 +3032,11 @@
     <w:p>
       <w:pPr>
         <w:pBdr>
-          <w:top w:val="dashed" w:color="9CA3AF" w:sz="8" w:space="10"/>
-          <w:left w:val="dashed" w:color="9CA3AF" w:sz="8" w:space="10"/>
-          <w:bottom w:val="dashed" w:color="9CA3AF" w:sz="8" w:space="10"/>
-          <w:right w:val="dashed" w:color="9CA3AF" w:sz="8" w:space="10"/>
+          <w:top w:val="dashed" w:color="000000" w:sz="6" w:space="10"/>
+          <w:left w:val="dashed" w:color="000000" w:sz="6" w:space="10"/>
+          <w:bottom w:val="dashed" w:color="000000" w:sz="6" w:space="10"/>
+          <w:right w:val="dashed" w:color="000000" w:sz="6" w:space="10"/>
         </w:pBdr>
-        <w:shd w:fill="F3F4F6" w:color="auto" w:val="clear"/>
         <w:spacing w:after="120" w:before="240" w:line="360"/>
         <w:jc w:val="center"/>
       </w:pPr>
@@ -3066,7 +3044,6 @@
         <w:rPr>
           <w:i/>
           <w:iCs/>
-          <w:color w:val="6B7280"/>
         </w:rPr>
         <w:t xml:space="preserve">[ Insert screenshot: RDS console during a run: the temporary restorecheck-tmp-* instance beside the source database ]</w:t>
       </w:r>
@@ -3089,12 +3066,11 @@
     <w:p>
       <w:pPr>
         <w:pBdr>
-          <w:top w:val="dashed" w:color="9CA3AF" w:sz="8" w:space="10"/>
-          <w:left w:val="dashed" w:color="9CA3AF" w:sz="8" w:space="10"/>
-          <w:bottom w:val="dashed" w:color="9CA3AF" w:sz="8" w:space="10"/>
-          <w:right w:val="dashed" w:color="9CA3AF" w:sz="8" w:space="10"/>
+          <w:top w:val="dashed" w:color="000000" w:sz="6" w:space="10"/>
+          <w:left w:val="dashed" w:color="000000" w:sz="6" w:space="10"/>
+          <w:bottom w:val="dashed" w:color="000000" w:sz="6" w:space="10"/>
+          <w:right w:val="dashed" w:color="000000" w:sz="6" w:space="10"/>
         </w:pBdr>
-        <w:shd w:fill="F3F4F6" w:color="auto" w:val="clear"/>
         <w:spacing w:after="120" w:before="240" w:line="360"/>
         <w:jc w:val="center"/>
       </w:pPr>
@@ -3102,7 +3078,6 @@
         <w:rPr>
           <w:i/>
           <w:iCs/>
-          <w:color w:val="6B7280"/>
         </w:rPr>
         <w:t xml:space="preserve">[ Insert screenshot: The SNS alert email received for the corrupt-data backup, naming the failed check ]</w:t>
       </w:r>
@@ -3125,12 +3100,11 @@
     <w:p>
       <w:pPr>
         <w:pBdr>
-          <w:top w:val="dashed" w:color="9CA3AF" w:sz="8" w:space="10"/>
-          <w:left w:val="dashed" w:color="9CA3AF" w:sz="8" w:space="10"/>
-          <w:bottom w:val="dashed" w:color="9CA3AF" w:sz="8" w:space="10"/>
-          <w:right w:val="dashed" w:color="9CA3AF" w:sz="8" w:space="10"/>
+          <w:top w:val="dashed" w:color="000000" w:sz="6" w:space="10"/>
+          <w:left w:val="dashed" w:color="000000" w:sz="6" w:space="10"/>
+          <w:bottom w:val="dashed" w:color="000000" w:sz="6" w:space="10"/>
+          <w:right w:val="dashed" w:color="000000" w:sz="6" w:space="10"/>
         </w:pBdr>
-        <w:shd w:fill="F3F4F6" w:color="auto" w:val="clear"/>
         <w:spacing w:after="120" w:before="240" w:line="360"/>
         <w:jc w:val="center"/>
       </w:pPr>
@@ -3138,7 +3112,6 @@
         <w:rPr>
           <w:i/>
           <w:iCs/>
-          <w:color w:val="6B7280"/>
         </w:rPr>
         <w:t xml:space="preserve">[ Insert screenshot: DynamoDB: run history with PASSED, FAILED and ERROR runs ]</w:t>
       </w:r>
@@ -3161,12 +3134,11 @@
     <w:p>
       <w:pPr>
         <w:pBdr>
-          <w:top w:val="dashed" w:color="9CA3AF" w:sz="8" w:space="10"/>
-          <w:left w:val="dashed" w:color="9CA3AF" w:sz="8" w:space="10"/>
-          <w:bottom w:val="dashed" w:color="9CA3AF" w:sz="8" w:space="10"/>
-          <w:right w:val="dashed" w:color="9CA3AF" w:sz="8" w:space="10"/>
+          <w:top w:val="dashed" w:color="000000" w:sz="6" w:space="10"/>
+          <w:left w:val="dashed" w:color="000000" w:sz="6" w:space="10"/>
+          <w:bottom w:val="dashed" w:color="000000" w:sz="6" w:space="10"/>
+          <w:right w:val="dashed" w:color="000000" w:sz="6" w:space="10"/>
         </w:pBdr>
-        <w:shd w:fill="F3F4F6" w:color="auto" w:val="clear"/>
         <w:spacing w:after="120" w:before="240" w:line="360"/>
         <w:jc w:val="center"/>
       </w:pPr>
@@ -3174,7 +3146,6 @@
         <w:rPr>
           <w:i/>
           <w:iCs/>
-          <w:color w:val="6B7280"/>
         </w:rPr>
         <w:t xml:space="preserve">[ Insert screenshot: S3: the detailed JSON verification report of the corrupt-data run ]</w:t>
       </w:r>
@@ -3197,12 +3168,11 @@
     <w:p>
       <w:pPr>
         <w:pBdr>
-          <w:top w:val="dashed" w:color="9CA3AF" w:sz="8" w:space="10"/>
-          <w:left w:val="dashed" w:color="9CA3AF" w:sz="8" w:space="10"/>
-          <w:bottom w:val="dashed" w:color="9CA3AF" w:sz="8" w:space="10"/>
-          <w:right w:val="dashed" w:color="9CA3AF" w:sz="8" w:space="10"/>
+          <w:top w:val="dashed" w:color="000000" w:sz="6" w:space="10"/>
+          <w:left w:val="dashed" w:color="000000" w:sz="6" w:space="10"/>
+          <w:bottom w:val="dashed" w:color="000000" w:sz="6" w:space="10"/>
+          <w:right w:val="dashed" w:color="000000" w:sz="6" w:space="10"/>
         </w:pBdr>
-        <w:shd w:fill="F3F4F6" w:color="auto" w:val="clear"/>
         <w:spacing w:after="120" w:before="240" w:line="360"/>
         <w:jc w:val="center"/>
       </w:pPr>
@@ -3210,7 +3180,6 @@
         <w:rPr>
           <w:i/>
           <w:iCs/>
-          <w:color w:val="6B7280"/>
         </w:rPr>
         <w:t xml:space="preserve">[ Insert screenshot: CloudWatch: the restorecheck-backup-health dashboard over the scenario runs (21 October, UTC). The single verifier Lambda error near 13:00 is the expected "no snapshot" error of the no-backup scenario, which is how that ERROR is detected ]</w:t>
       </w:r>
@@ -3233,12 +3202,11 @@
     <w:p>
       <w:pPr>
         <w:pBdr>
-          <w:top w:val="dashed" w:color="9CA3AF" w:sz="8" w:space="10"/>
-          <w:left w:val="dashed" w:color="9CA3AF" w:sz="8" w:space="10"/>
-          <w:bottom w:val="dashed" w:color="9CA3AF" w:sz="8" w:space="10"/>
-          <w:right w:val="dashed" w:color="9CA3AF" w:sz="8" w:space="10"/>
+          <w:top w:val="dashed" w:color="000000" w:sz="6" w:space="10"/>
+          <w:left w:val="dashed" w:color="000000" w:sz="6" w:space="10"/>
+          <w:bottom w:val="dashed" w:color="000000" w:sz="6" w:space="10"/>
+          <w:right w:val="dashed" w:color="000000" w:sz="6" w:space="10"/>
         </w:pBdr>
-        <w:shd w:fill="F3F4F6" w:color="auto" w:val="clear"/>
         <w:spacing w:after="120" w:before="240" w:line="360"/>
         <w:jc w:val="center"/>
       </w:pPr>
@@ -3246,7 +3214,6 @@
         <w:rPr>
           <w:i/>
           <w:iCs/>
-          <w:color w:val="6B7280"/>
         </w:rPr>
         <w:t xml:space="preserve">[ Insert screenshot: IAM: the verifier's custom least-privilege JSON policy ]</w:t>
       </w:r>
@@ -3269,12 +3236,11 @@
     <w:p>
       <w:pPr>
         <w:pBdr>
-          <w:top w:val="dashed" w:color="9CA3AF" w:sz="8" w:space="10"/>
-          <w:left w:val="dashed" w:color="9CA3AF" w:sz="8" w:space="10"/>
-          <w:bottom w:val="dashed" w:color="9CA3AF" w:sz="8" w:space="10"/>
-          <w:right w:val="dashed" w:color="9CA3AF" w:sz="8" w:space="10"/>
+          <w:top w:val="dashed" w:color="000000" w:sz="6" w:space="10"/>
+          <w:left w:val="dashed" w:color="000000" w:sz="6" w:space="10"/>
+          <w:bottom w:val="dashed" w:color="000000" w:sz="6" w:space="10"/>
+          <w:right w:val="dashed" w:color="000000" w:sz="6" w:space="10"/>
         </w:pBdr>
-        <w:shd w:fill="F3F4F6" w:color="auto" w:val="clear"/>
         <w:spacing w:after="120" w:before="240" w:line="360"/>
         <w:jc w:val="center"/>
       </w:pPr>
@@ -3282,7 +3248,6 @@
         <w:rPr>
           <w:i/>
           <w:iCs/>
-          <w:color w:val="6B7280"/>
         </w:rPr>
         <w:t xml:space="preserve">[ Insert screenshot: IAM: the checker's custom JSON policy, allowing database login as one user only ]</w:t>
       </w:r>
@@ -3305,12 +3270,11 @@
     <w:p>
       <w:pPr>
         <w:pBdr>
-          <w:top w:val="dashed" w:color="9CA3AF" w:sz="8" w:space="10"/>
-          <w:left w:val="dashed" w:color="9CA3AF" w:sz="8" w:space="10"/>
-          <w:bottom w:val="dashed" w:color="9CA3AF" w:sz="8" w:space="10"/>
-          <w:right w:val="dashed" w:color="9CA3AF" w:sz="8" w:space="10"/>
+          <w:top w:val="dashed" w:color="000000" w:sz="6" w:space="10"/>
+          <w:left w:val="dashed" w:color="000000" w:sz="6" w:space="10"/>
+          <w:bottom w:val="dashed" w:color="000000" w:sz="6" w:space="10"/>
+          <w:right w:val="dashed" w:color="000000" w:sz="6" w:space="10"/>
         </w:pBdr>
-        <w:shd w:fill="F3F4F6" w:color="auto" w:val="clear"/>
         <w:spacing w:after="120" w:before="240" w:line="360"/>
         <w:jc w:val="center"/>
       </w:pPr>
@@ -3318,7 +3282,6 @@
         <w:rPr>
           <w:i/>
           <w:iCs/>
-          <w:color w:val="6B7280"/>
         </w:rPr>
         <w:t xml:space="preserve">[ Insert screenshot: The results site on GitHub Pages ]</w:t>
       </w:r>
@@ -3341,12 +3304,11 @@
     <w:p>
       <w:pPr>
         <w:pBdr>
-          <w:top w:val="dashed" w:color="9CA3AF" w:sz="8" w:space="10"/>
-          <w:left w:val="dashed" w:color="9CA3AF" w:sz="8" w:space="10"/>
-          <w:bottom w:val="dashed" w:color="9CA3AF" w:sz="8" w:space="10"/>
-          <w:right w:val="dashed" w:color="9CA3AF" w:sz="8" w:space="10"/>
+          <w:top w:val="dashed" w:color="000000" w:sz="6" w:space="10"/>
+          <w:left w:val="dashed" w:color="000000" w:sz="6" w:space="10"/>
+          <w:bottom w:val="dashed" w:color="000000" w:sz="6" w:space="10"/>
+          <w:right w:val="dashed" w:color="000000" w:sz="6" w:space="10"/>
         </w:pBdr>
-        <w:shd w:fill="F3F4F6" w:color="auto" w:val="clear"/>
         <w:spacing w:after="120" w:before="240" w:line="360"/>
         <w:jc w:val="center"/>
       </w:pPr>
@@ -3354,7 +3316,6 @@
         <w:rPr>
           <w:i/>
           <w:iCs/>
-          <w:color w:val="6B7280"/>
         </w:rPr>
         <w:t xml:space="preserve">[ Insert screenshot: Automated test suite output (pytest): 76 tests passed ]</w:t>
       </w:r>
@@ -3379,7 +3340,7 @@
         <w:pStyle w:val="Heading1"/>
       </w:pPr>
       <w:r>
-        <w:t xml:space="preserve">Results</w:t>
+        <w:t xml:space="preserve">9.  Results</w:t>
       </w:r>
     </w:p>
     <w:p>
@@ -3432,12 +3393,11 @@
           <w:tcPr>
             <w:tcW w:type="dxa" w:w="1250"/>
             <w:tcBorders>
-              <w:top w:val="single" w:color="A0A7AE" w:sz="4"/>
-              <w:left w:val="single" w:color="A0A7AE" w:sz="4"/>
-              <w:bottom w:val="single" w:color="A0A7AE" w:sz="4"/>
-              <w:right w:val="single" w:color="A0A7AE" w:sz="4"/>
-            </w:tcBorders>
-            <w:shd w:fill="DCE6F2" w:color="auto" w:val="clear"/>
+              <w:top w:val="single" w:color="000000" w:sz="4"/>
+              <w:left w:val="single" w:color="000000" w:sz="4"/>
+              <w:bottom w:val="single" w:color="000000" w:sz="4"/>
+              <w:right w:val="single" w:color="000000" w:sz="4"/>
+            </w:tcBorders>
             <w:tcMar>
               <w:top w:type="dxa" w:w="60"/>
               <w:left w:type="dxa" w:w="100"/>
@@ -3461,12 +3421,11 @@
           <w:tcPr>
             <w:tcW w:type="dxa" w:w="2150"/>
             <w:tcBorders>
-              <w:top w:val="single" w:color="A0A7AE" w:sz="4"/>
-              <w:left w:val="single" w:color="A0A7AE" w:sz="4"/>
-              <w:bottom w:val="single" w:color="A0A7AE" w:sz="4"/>
-              <w:right w:val="single" w:color="A0A7AE" w:sz="4"/>
-            </w:tcBorders>
-            <w:shd w:fill="DCE6F2" w:color="auto" w:val="clear"/>
+              <w:top w:val="single" w:color="000000" w:sz="4"/>
+              <w:left w:val="single" w:color="000000" w:sz="4"/>
+              <w:bottom w:val="single" w:color="000000" w:sz="4"/>
+              <w:right w:val="single" w:color="000000" w:sz="4"/>
+            </w:tcBorders>
             <w:tcMar>
               <w:top w:type="dxa" w:w="60"/>
               <w:left w:type="dxa" w:w="100"/>
@@ -3490,12 +3449,11 @@
           <w:tcPr>
             <w:tcW w:type="dxa" w:w="900"/>
             <w:tcBorders>
-              <w:top w:val="single" w:color="A0A7AE" w:sz="4"/>
-              <w:left w:val="single" w:color="A0A7AE" w:sz="4"/>
-              <w:bottom w:val="single" w:color="A0A7AE" w:sz="4"/>
-              <w:right w:val="single" w:color="A0A7AE" w:sz="4"/>
-            </w:tcBorders>
-            <w:shd w:fill="DCE6F2" w:color="auto" w:val="clear"/>
+              <w:top w:val="single" w:color="000000" w:sz="4"/>
+              <w:left w:val="single" w:color="000000" w:sz="4"/>
+              <w:bottom w:val="single" w:color="000000" w:sz="4"/>
+              <w:right w:val="single" w:color="000000" w:sz="4"/>
+            </w:tcBorders>
             <w:tcMar>
               <w:top w:type="dxa" w:w="60"/>
               <w:left w:type="dxa" w:w="100"/>
@@ -3519,12 +3477,11 @@
           <w:tcPr>
             <w:tcW w:type="dxa" w:w="900"/>
             <w:tcBorders>
-              <w:top w:val="single" w:color="A0A7AE" w:sz="4"/>
-              <w:left w:val="single" w:color="A0A7AE" w:sz="4"/>
-              <w:bottom w:val="single" w:color="A0A7AE" w:sz="4"/>
-              <w:right w:val="single" w:color="A0A7AE" w:sz="4"/>
-            </w:tcBorders>
-            <w:shd w:fill="DCE6F2" w:color="auto" w:val="clear"/>
+              <w:top w:val="single" w:color="000000" w:sz="4"/>
+              <w:left w:val="single" w:color="000000" w:sz="4"/>
+              <w:bottom w:val="single" w:color="000000" w:sz="4"/>
+              <w:right w:val="single" w:color="000000" w:sz="4"/>
+            </w:tcBorders>
             <w:tcMar>
               <w:top w:type="dxa" w:w="60"/>
               <w:left w:type="dxa" w:w="100"/>
@@ -3548,12 +3505,11 @@
           <w:tcPr>
             <w:tcW w:type="dxa" w:w="2020"/>
             <w:tcBorders>
-              <w:top w:val="single" w:color="A0A7AE" w:sz="4"/>
-              <w:left w:val="single" w:color="A0A7AE" w:sz="4"/>
-              <w:bottom w:val="single" w:color="A0A7AE" w:sz="4"/>
-              <w:right w:val="single" w:color="A0A7AE" w:sz="4"/>
-            </w:tcBorders>
-            <w:shd w:fill="DCE6F2" w:color="auto" w:val="clear"/>
+              <w:top w:val="single" w:color="000000" w:sz="4"/>
+              <w:left w:val="single" w:color="000000" w:sz="4"/>
+              <w:bottom w:val="single" w:color="000000" w:sz="4"/>
+              <w:right w:val="single" w:color="000000" w:sz="4"/>
+            </w:tcBorders>
             <w:tcMar>
               <w:top w:type="dxa" w:w="60"/>
               <w:left w:type="dxa" w:w="100"/>
@@ -3577,12 +3533,11 @@
           <w:tcPr>
             <w:tcW w:type="dxa" w:w="900"/>
             <w:tcBorders>
-              <w:top w:val="single" w:color="A0A7AE" w:sz="4"/>
-              <w:left w:val="single" w:color="A0A7AE" w:sz="4"/>
-              <w:bottom w:val="single" w:color="A0A7AE" w:sz="4"/>
-              <w:right w:val="single" w:color="A0A7AE" w:sz="4"/>
-            </w:tcBorders>
-            <w:shd w:fill="DCE6F2" w:color="auto" w:val="clear"/>
+              <w:top w:val="single" w:color="000000" w:sz="4"/>
+              <w:left w:val="single" w:color="000000" w:sz="4"/>
+              <w:bottom w:val="single" w:color="000000" w:sz="4"/>
+              <w:right w:val="single" w:color="000000" w:sz="4"/>
+            </w:tcBorders>
             <w:tcMar>
               <w:top w:type="dxa" w:w="60"/>
               <w:left w:type="dxa" w:w="100"/>
@@ -3606,12 +3561,11 @@
           <w:tcPr>
             <w:tcW w:type="dxa" w:w="906"/>
             <w:tcBorders>
-              <w:top w:val="single" w:color="A0A7AE" w:sz="4"/>
-              <w:left w:val="single" w:color="A0A7AE" w:sz="4"/>
-              <w:bottom w:val="single" w:color="A0A7AE" w:sz="4"/>
-              <w:right w:val="single" w:color="A0A7AE" w:sz="4"/>
-            </w:tcBorders>
-            <w:shd w:fill="DCE6F2" w:color="auto" w:val="clear"/>
+              <w:top w:val="single" w:color="000000" w:sz="4"/>
+              <w:left w:val="single" w:color="000000" w:sz="4"/>
+              <w:bottom w:val="single" w:color="000000" w:sz="4"/>
+              <w:right w:val="single" w:color="000000" w:sz="4"/>
+            </w:tcBorders>
             <w:tcMar>
               <w:top w:type="dxa" w:w="60"/>
               <w:left w:type="dxa" w:w="100"/>
@@ -3641,10 +3595,10 @@
           <w:tcPr>
             <w:tcW w:type="dxa" w:w="1250"/>
             <w:tcBorders>
-              <w:top w:val="single" w:color="A0A7AE" w:sz="4"/>
-              <w:left w:val="single" w:color="A0A7AE" w:sz="4"/>
-              <w:bottom w:val="single" w:color="A0A7AE" w:sz="4"/>
-              <w:right w:val="single" w:color="A0A7AE" w:sz="4"/>
+              <w:top w:val="single" w:color="000000" w:sz="4"/>
+              <w:left w:val="single" w:color="000000" w:sz="4"/>
+              <w:bottom w:val="single" w:color="000000" w:sz="4"/>
+              <w:right w:val="single" w:color="000000" w:sz="4"/>
             </w:tcBorders>
             <w:tcMar>
               <w:top w:type="dxa" w:w="60"/>
@@ -3669,10 +3623,10 @@
           <w:tcPr>
             <w:tcW w:type="dxa" w:w="2150"/>
             <w:tcBorders>
-              <w:top w:val="single" w:color="A0A7AE" w:sz="4"/>
-              <w:left w:val="single" w:color="A0A7AE" w:sz="4"/>
-              <w:bottom w:val="single" w:color="A0A7AE" w:sz="4"/>
-              <w:right w:val="single" w:color="A0A7AE" w:sz="4"/>
+              <w:top w:val="single" w:color="000000" w:sz="4"/>
+              <w:left w:val="single" w:color="000000" w:sz="4"/>
+              <w:bottom w:val="single" w:color="000000" w:sz="4"/>
+              <w:right w:val="single" w:color="000000" w:sz="4"/>
             </w:tcBorders>
             <w:tcMar>
               <w:top w:type="dxa" w:w="60"/>
@@ -3697,10 +3651,10 @@
           <w:tcPr>
             <w:tcW w:type="dxa" w:w="900"/>
             <w:tcBorders>
-              <w:top w:val="single" w:color="A0A7AE" w:sz="4"/>
-              <w:left w:val="single" w:color="A0A7AE" w:sz="4"/>
-              <w:bottom w:val="single" w:color="A0A7AE" w:sz="4"/>
-              <w:right w:val="single" w:color="A0A7AE" w:sz="4"/>
+              <w:top w:val="single" w:color="000000" w:sz="4"/>
+              <w:left w:val="single" w:color="000000" w:sz="4"/>
+              <w:bottom w:val="single" w:color="000000" w:sz="4"/>
+              <w:right w:val="single" w:color="000000" w:sz="4"/>
             </w:tcBorders>
             <w:tcMar>
               <w:top w:type="dxa" w:w="60"/>
@@ -3725,10 +3679,10 @@
           <w:tcPr>
             <w:tcW w:type="dxa" w:w="900"/>
             <w:tcBorders>
-              <w:top w:val="single" w:color="A0A7AE" w:sz="4"/>
-              <w:left w:val="single" w:color="A0A7AE" w:sz="4"/>
-              <w:bottom w:val="single" w:color="A0A7AE" w:sz="4"/>
-              <w:right w:val="single" w:color="A0A7AE" w:sz="4"/>
+              <w:top w:val="single" w:color="000000" w:sz="4"/>
+              <w:left w:val="single" w:color="000000" w:sz="4"/>
+              <w:bottom w:val="single" w:color="000000" w:sz="4"/>
+              <w:right w:val="single" w:color="000000" w:sz="4"/>
             </w:tcBorders>
             <w:tcMar>
               <w:top w:type="dxa" w:w="60"/>
@@ -3753,10 +3707,10 @@
           <w:tcPr>
             <w:tcW w:type="dxa" w:w="2020"/>
             <w:tcBorders>
-              <w:top w:val="single" w:color="A0A7AE" w:sz="4"/>
-              <w:left w:val="single" w:color="A0A7AE" w:sz="4"/>
-              <w:bottom w:val="single" w:color="A0A7AE" w:sz="4"/>
-              <w:right w:val="single" w:color="A0A7AE" w:sz="4"/>
+              <w:top w:val="single" w:color="000000" w:sz="4"/>
+              <w:left w:val="single" w:color="000000" w:sz="4"/>
+              <w:bottom w:val="single" w:color="000000" w:sz="4"/>
+              <w:right w:val="single" w:color="000000" w:sz="4"/>
             </w:tcBorders>
             <w:tcMar>
               <w:top w:type="dxa" w:w="60"/>
@@ -3781,10 +3735,10 @@
           <w:tcPr>
             <w:tcW w:type="dxa" w:w="900"/>
             <w:tcBorders>
-              <w:top w:val="single" w:color="A0A7AE" w:sz="4"/>
-              <w:left w:val="single" w:color="A0A7AE" w:sz="4"/>
-              <w:bottom w:val="single" w:color="A0A7AE" w:sz="4"/>
-              <w:right w:val="single" w:color="A0A7AE" w:sz="4"/>
+              <w:top w:val="single" w:color="000000" w:sz="4"/>
+              <w:left w:val="single" w:color="000000" w:sz="4"/>
+              <w:bottom w:val="single" w:color="000000" w:sz="4"/>
+              <w:right w:val="single" w:color="000000" w:sz="4"/>
             </w:tcBorders>
             <w:tcMar>
               <w:top w:type="dxa" w:w="60"/>
@@ -3809,10 +3763,10 @@
           <w:tcPr>
             <w:tcW w:type="dxa" w:w="906"/>
             <w:tcBorders>
-              <w:top w:val="single" w:color="A0A7AE" w:sz="4"/>
-              <w:left w:val="single" w:color="A0A7AE" w:sz="4"/>
-              <w:bottom w:val="single" w:color="A0A7AE" w:sz="4"/>
-              <w:right w:val="single" w:color="A0A7AE" w:sz="4"/>
+              <w:top w:val="single" w:color="000000" w:sz="4"/>
+              <w:left w:val="single" w:color="000000" w:sz="4"/>
+              <w:bottom w:val="single" w:color="000000" w:sz="4"/>
+              <w:right w:val="single" w:color="000000" w:sz="4"/>
             </w:tcBorders>
             <w:tcMar>
               <w:top w:type="dxa" w:w="60"/>
@@ -3843,10 +3797,10 @@
           <w:tcPr>
             <w:tcW w:type="dxa" w:w="1250"/>
             <w:tcBorders>
-              <w:top w:val="single" w:color="A0A7AE" w:sz="4"/>
-              <w:left w:val="single" w:color="A0A7AE" w:sz="4"/>
-              <w:bottom w:val="single" w:color="A0A7AE" w:sz="4"/>
-              <w:right w:val="single" w:color="A0A7AE" w:sz="4"/>
+              <w:top w:val="single" w:color="000000" w:sz="4"/>
+              <w:left w:val="single" w:color="000000" w:sz="4"/>
+              <w:bottom w:val="single" w:color="000000" w:sz="4"/>
+              <w:right w:val="single" w:color="000000" w:sz="4"/>
             </w:tcBorders>
             <w:tcMar>
               <w:top w:type="dxa" w:w="60"/>
@@ -3871,10 +3825,10 @@
           <w:tcPr>
             <w:tcW w:type="dxa" w:w="2150"/>
             <w:tcBorders>
-              <w:top w:val="single" w:color="A0A7AE" w:sz="4"/>
-              <w:left w:val="single" w:color="A0A7AE" w:sz="4"/>
-              <w:bottom w:val="single" w:color="A0A7AE" w:sz="4"/>
-              <w:right w:val="single" w:color="A0A7AE" w:sz="4"/>
+              <w:top w:val="single" w:color="000000" w:sz="4"/>
+              <w:left w:val="single" w:color="000000" w:sz="4"/>
+              <w:bottom w:val="single" w:color="000000" w:sz="4"/>
+              <w:right w:val="single" w:color="000000" w:sz="4"/>
             </w:tcBorders>
             <w:tcMar>
               <w:top w:type="dxa" w:w="60"/>
@@ -3899,10 +3853,10 @@
           <w:tcPr>
             <w:tcW w:type="dxa" w:w="900"/>
             <w:tcBorders>
-              <w:top w:val="single" w:color="A0A7AE" w:sz="4"/>
-              <w:left w:val="single" w:color="A0A7AE" w:sz="4"/>
-              <w:bottom w:val="single" w:color="A0A7AE" w:sz="4"/>
-              <w:right w:val="single" w:color="A0A7AE" w:sz="4"/>
+              <w:top w:val="single" w:color="000000" w:sz="4"/>
+              <w:left w:val="single" w:color="000000" w:sz="4"/>
+              <w:bottom w:val="single" w:color="000000" w:sz="4"/>
+              <w:right w:val="single" w:color="000000" w:sz="4"/>
             </w:tcBorders>
             <w:tcMar>
               <w:top w:type="dxa" w:w="60"/>
@@ -3927,10 +3881,10 @@
           <w:tcPr>
             <w:tcW w:type="dxa" w:w="900"/>
             <w:tcBorders>
-              <w:top w:val="single" w:color="A0A7AE" w:sz="4"/>
-              <w:left w:val="single" w:color="A0A7AE" w:sz="4"/>
-              <w:bottom w:val="single" w:color="A0A7AE" w:sz="4"/>
-              <w:right w:val="single" w:color="A0A7AE" w:sz="4"/>
+              <w:top w:val="single" w:color="000000" w:sz="4"/>
+              <w:left w:val="single" w:color="000000" w:sz="4"/>
+              <w:bottom w:val="single" w:color="000000" w:sz="4"/>
+              <w:right w:val="single" w:color="000000" w:sz="4"/>
             </w:tcBorders>
             <w:tcMar>
               <w:top w:type="dxa" w:w="60"/>
@@ -3955,10 +3909,10 @@
           <w:tcPr>
             <w:tcW w:type="dxa" w:w="2020"/>
             <w:tcBorders>
-              <w:top w:val="single" w:color="A0A7AE" w:sz="4"/>
-              <w:left w:val="single" w:color="A0A7AE" w:sz="4"/>
-              <w:bottom w:val="single" w:color="A0A7AE" w:sz="4"/>
-              <w:right w:val="single" w:color="A0A7AE" w:sz="4"/>
+              <w:top w:val="single" w:color="000000" w:sz="4"/>
+              <w:left w:val="single" w:color="000000" w:sz="4"/>
+              <w:bottom w:val="single" w:color="000000" w:sz="4"/>
+              <w:right w:val="single" w:color="000000" w:sz="4"/>
             </w:tcBorders>
             <w:tcMar>
               <w:top w:type="dxa" w:w="60"/>
@@ -4022,10 +3976,10 @@
           <w:tcPr>
             <w:tcW w:type="dxa" w:w="900"/>
             <w:tcBorders>
-              <w:top w:val="single" w:color="A0A7AE" w:sz="4"/>
-              <w:left w:val="single" w:color="A0A7AE" w:sz="4"/>
-              <w:bottom w:val="single" w:color="A0A7AE" w:sz="4"/>
-              <w:right w:val="single" w:color="A0A7AE" w:sz="4"/>
+              <w:top w:val="single" w:color="000000" w:sz="4"/>
+              <w:left w:val="single" w:color="000000" w:sz="4"/>
+              <w:bottom w:val="single" w:color="000000" w:sz="4"/>
+              <w:right w:val="single" w:color="000000" w:sz="4"/>
             </w:tcBorders>
             <w:tcMar>
               <w:top w:type="dxa" w:w="60"/>
@@ -4050,10 +4004,10 @@
           <w:tcPr>
             <w:tcW w:type="dxa" w:w="906"/>
             <w:tcBorders>
-              <w:top w:val="single" w:color="A0A7AE" w:sz="4"/>
-              <w:left w:val="single" w:color="A0A7AE" w:sz="4"/>
-              <w:bottom w:val="single" w:color="A0A7AE" w:sz="4"/>
-              <w:right w:val="single" w:color="A0A7AE" w:sz="4"/>
+              <w:top w:val="single" w:color="000000" w:sz="4"/>
+              <w:left w:val="single" w:color="000000" w:sz="4"/>
+              <w:bottom w:val="single" w:color="000000" w:sz="4"/>
+              <w:right w:val="single" w:color="000000" w:sz="4"/>
             </w:tcBorders>
             <w:tcMar>
               <w:top w:type="dxa" w:w="60"/>
@@ -4084,10 +4038,10 @@
           <w:tcPr>
             <w:tcW w:type="dxa" w:w="1250"/>
             <w:tcBorders>
-              <w:top w:val="single" w:color="A0A7AE" w:sz="4"/>
-              <w:left w:val="single" w:color="A0A7AE" w:sz="4"/>
-              <w:bottom w:val="single" w:color="A0A7AE" w:sz="4"/>
-              <w:right w:val="single" w:color="A0A7AE" w:sz="4"/>
+              <w:top w:val="single" w:color="000000" w:sz="4"/>
+              <w:left w:val="single" w:color="000000" w:sz="4"/>
+              <w:bottom w:val="single" w:color="000000" w:sz="4"/>
+              <w:right w:val="single" w:color="000000" w:sz="4"/>
             </w:tcBorders>
             <w:tcMar>
               <w:top w:type="dxa" w:w="60"/>
@@ -4112,10 +4066,10 @@
           <w:tcPr>
             <w:tcW w:type="dxa" w:w="2150"/>
             <w:tcBorders>
-              <w:top w:val="single" w:color="A0A7AE" w:sz="4"/>
-              <w:left w:val="single" w:color="A0A7AE" w:sz="4"/>
-              <w:bottom w:val="single" w:color="A0A7AE" w:sz="4"/>
-              <w:right w:val="single" w:color="A0A7AE" w:sz="4"/>
+              <w:top w:val="single" w:color="000000" w:sz="4"/>
+              <w:left w:val="single" w:color="000000" w:sz="4"/>
+              <w:bottom w:val="single" w:color="000000" w:sz="4"/>
+              <w:right w:val="single" w:color="000000" w:sz="4"/>
             </w:tcBorders>
             <w:tcMar>
               <w:top w:type="dxa" w:w="60"/>
@@ -4140,10 +4094,10 @@
           <w:tcPr>
             <w:tcW w:type="dxa" w:w="900"/>
             <w:tcBorders>
-              <w:top w:val="single" w:color="A0A7AE" w:sz="4"/>
-              <w:left w:val="single" w:color="A0A7AE" w:sz="4"/>
-              <w:bottom w:val="single" w:color="A0A7AE" w:sz="4"/>
-              <w:right w:val="single" w:color="A0A7AE" w:sz="4"/>
+              <w:top w:val="single" w:color="000000" w:sz="4"/>
+              <w:left w:val="single" w:color="000000" w:sz="4"/>
+              <w:bottom w:val="single" w:color="000000" w:sz="4"/>
+              <w:right w:val="single" w:color="000000" w:sz="4"/>
             </w:tcBorders>
             <w:tcMar>
               <w:top w:type="dxa" w:w="60"/>
@@ -4168,10 +4122,10 @@
           <w:tcPr>
             <w:tcW w:type="dxa" w:w="900"/>
             <w:tcBorders>
-              <w:top w:val="single" w:color="A0A7AE" w:sz="4"/>
-              <w:left w:val="single" w:color="A0A7AE" w:sz="4"/>
-              <w:bottom w:val="single" w:color="A0A7AE" w:sz="4"/>
-              <w:right w:val="single" w:color="A0A7AE" w:sz="4"/>
+              <w:top w:val="single" w:color="000000" w:sz="4"/>
+              <w:left w:val="single" w:color="000000" w:sz="4"/>
+              <w:bottom w:val="single" w:color="000000" w:sz="4"/>
+              <w:right w:val="single" w:color="000000" w:sz="4"/>
             </w:tcBorders>
             <w:tcMar>
               <w:top w:type="dxa" w:w="60"/>
@@ -4196,10 +4150,10 @@
           <w:tcPr>
             <w:tcW w:type="dxa" w:w="2020"/>
             <w:tcBorders>
-              <w:top w:val="single" w:color="A0A7AE" w:sz="4"/>
-              <w:left w:val="single" w:color="A0A7AE" w:sz="4"/>
-              <w:bottom w:val="single" w:color="A0A7AE" w:sz="4"/>
-              <w:right w:val="single" w:color="A0A7AE" w:sz="4"/>
+              <w:top w:val="single" w:color="000000" w:sz="4"/>
+              <w:left w:val="single" w:color="000000" w:sz="4"/>
+              <w:bottom w:val="single" w:color="000000" w:sz="4"/>
+              <w:right w:val="single" w:color="000000" w:sz="4"/>
             </w:tcBorders>
             <w:tcMar>
               <w:top w:type="dxa" w:w="60"/>
@@ -4225,10 +4179,10 @@
           <w:tcPr>
             <w:tcW w:type="dxa" w:w="900"/>
             <w:tcBorders>
-              <w:top w:val="single" w:color="A0A7AE" w:sz="4"/>
-              <w:left w:val="single" w:color="A0A7AE" w:sz="4"/>
-              <w:bottom w:val="single" w:color="A0A7AE" w:sz="4"/>
-              <w:right w:val="single" w:color="A0A7AE" w:sz="4"/>
+              <w:top w:val="single" w:color="000000" w:sz="4"/>
+              <w:left w:val="single" w:color="000000" w:sz="4"/>
+              <w:bottom w:val="single" w:color="000000" w:sz="4"/>
+              <w:right w:val="single" w:color="000000" w:sz="4"/>
             </w:tcBorders>
             <w:tcMar>
               <w:top w:type="dxa" w:w="60"/>
@@ -4253,10 +4207,10 @@
           <w:tcPr>
             <w:tcW w:type="dxa" w:w="906"/>
             <w:tcBorders>
-              <w:top w:val="single" w:color="A0A7AE" w:sz="4"/>
-              <w:left w:val="single" w:color="A0A7AE" w:sz="4"/>
-              <w:bottom w:val="single" w:color="A0A7AE" w:sz="4"/>
-              <w:right w:val="single" w:color="A0A7AE" w:sz="4"/>
+              <w:top w:val="single" w:color="000000" w:sz="4"/>
+              <w:left w:val="single" w:color="000000" w:sz="4"/>
+              <w:bottom w:val="single" w:color="000000" w:sz="4"/>
+              <w:right w:val="single" w:color="000000" w:sz="4"/>
             </w:tcBorders>
             <w:tcMar>
               <w:top w:type="dxa" w:w="60"/>
@@ -4287,10 +4241,10 @@
           <w:tcPr>
             <w:tcW w:type="dxa" w:w="1250"/>
             <w:tcBorders>
-              <w:top w:val="single" w:color="A0A7AE" w:sz="4"/>
-              <w:left w:val="single" w:color="A0A7AE" w:sz="4"/>
-              <w:bottom w:val="single" w:color="A0A7AE" w:sz="4"/>
-              <w:right w:val="single" w:color="A0A7AE" w:sz="4"/>
+              <w:top w:val="single" w:color="000000" w:sz="4"/>
+              <w:left w:val="single" w:color="000000" w:sz="4"/>
+              <w:bottom w:val="single" w:color="000000" w:sz="4"/>
+              <w:right w:val="single" w:color="000000" w:sz="4"/>
             </w:tcBorders>
             <w:tcMar>
               <w:top w:type="dxa" w:w="60"/>
@@ -4315,10 +4269,10 @@
           <w:tcPr>
             <w:tcW w:type="dxa" w:w="2150"/>
             <w:tcBorders>
-              <w:top w:val="single" w:color="A0A7AE" w:sz="4"/>
-              <w:left w:val="single" w:color="A0A7AE" w:sz="4"/>
-              <w:bottom w:val="single" w:color="A0A7AE" w:sz="4"/>
-              <w:right w:val="single" w:color="A0A7AE" w:sz="4"/>
+              <w:top w:val="single" w:color="000000" w:sz="4"/>
+              <w:left w:val="single" w:color="000000" w:sz="4"/>
+              <w:bottom w:val="single" w:color="000000" w:sz="4"/>
+              <w:right w:val="single" w:color="000000" w:sz="4"/>
             </w:tcBorders>
             <w:tcMar>
               <w:top w:type="dxa" w:w="60"/>
@@ -4343,10 +4297,10 @@
           <w:tcPr>
             <w:tcW w:type="dxa" w:w="900"/>
             <w:tcBorders>
-              <w:top w:val="single" w:color="A0A7AE" w:sz="4"/>
-              <w:left w:val="single" w:color="A0A7AE" w:sz="4"/>
-              <w:bottom w:val="single" w:color="A0A7AE" w:sz="4"/>
-              <w:right w:val="single" w:color="A0A7AE" w:sz="4"/>
+              <w:top w:val="single" w:color="000000" w:sz="4"/>
+              <w:left w:val="single" w:color="000000" w:sz="4"/>
+              <w:bottom w:val="single" w:color="000000" w:sz="4"/>
+              <w:right w:val="single" w:color="000000" w:sz="4"/>
             </w:tcBorders>
             <w:tcMar>
               <w:top w:type="dxa" w:w="60"/>
@@ -4371,10 +4325,10 @@
           <w:tcPr>
             <w:tcW w:type="dxa" w:w="900"/>
             <w:tcBorders>
-              <w:top w:val="single" w:color="A0A7AE" w:sz="4"/>
-              <w:left w:val="single" w:color="A0A7AE" w:sz="4"/>
-              <w:bottom w:val="single" w:color="A0A7AE" w:sz="4"/>
-              <w:right w:val="single" w:color="A0A7AE" w:sz="4"/>
+              <w:top w:val="single" w:color="000000" w:sz="4"/>
+              <w:left w:val="single" w:color="000000" w:sz="4"/>
+              <w:bottom w:val="single" w:color="000000" w:sz="4"/>
+              <w:right w:val="single" w:color="000000" w:sz="4"/>
             </w:tcBorders>
             <w:tcMar>
               <w:top w:type="dxa" w:w="60"/>
@@ -4399,10 +4353,10 @@
           <w:tcPr>
             <w:tcW w:type="dxa" w:w="2020"/>
             <w:tcBorders>
-              <w:top w:val="single" w:color="A0A7AE" w:sz="4"/>
-              <w:left w:val="single" w:color="A0A7AE" w:sz="4"/>
-              <w:bottom w:val="single" w:color="A0A7AE" w:sz="4"/>
-              <w:right w:val="single" w:color="A0A7AE" w:sz="4"/>
+              <w:top w:val="single" w:color="000000" w:sz="4"/>
+              <w:left w:val="single" w:color="000000" w:sz="4"/>
+              <w:bottom w:val="single" w:color="000000" w:sz="4"/>
+              <w:right w:val="single" w:color="000000" w:sz="4"/>
             </w:tcBorders>
             <w:tcMar>
               <w:top w:type="dxa" w:w="60"/>
@@ -4428,10 +4382,10 @@
           <w:tcPr>
             <w:tcW w:type="dxa" w:w="900"/>
             <w:tcBorders>
-              <w:top w:val="single" w:color="A0A7AE" w:sz="4"/>
-              <w:left w:val="single" w:color="A0A7AE" w:sz="4"/>
-              <w:bottom w:val="single" w:color="A0A7AE" w:sz="4"/>
-              <w:right w:val="single" w:color="A0A7AE" w:sz="4"/>
+              <w:top w:val="single" w:color="000000" w:sz="4"/>
+              <w:left w:val="single" w:color="000000" w:sz="4"/>
+              <w:bottom w:val="single" w:color="000000" w:sz="4"/>
+              <w:right w:val="single" w:color="000000" w:sz="4"/>
             </w:tcBorders>
             <w:tcMar>
               <w:top w:type="dxa" w:w="60"/>
@@ -4456,10 +4410,10 @@
           <w:tcPr>
             <w:tcW w:type="dxa" w:w="906"/>
             <w:tcBorders>
-              <w:top w:val="single" w:color="A0A7AE" w:sz="4"/>
-              <w:left w:val="single" w:color="A0A7AE" w:sz="4"/>
-              <w:bottom w:val="single" w:color="A0A7AE" w:sz="4"/>
-              <w:right w:val="single" w:color="A0A7AE" w:sz="4"/>
+              <w:top w:val="single" w:color="000000" w:sz="4"/>
+              <w:left w:val="single" w:color="000000" w:sz="4"/>
+              <w:bottom w:val="single" w:color="000000" w:sz="4"/>
+              <w:right w:val="single" w:color="000000" w:sz="4"/>
             </w:tcBorders>
             <w:tcMar>
               <w:top w:type="dxa" w:w="60"/>
@@ -4490,10 +4444,10 @@
           <w:tcPr>
             <w:tcW w:type="dxa" w:w="1250"/>
             <w:tcBorders>
-              <w:top w:val="single" w:color="A0A7AE" w:sz="4"/>
-              <w:left w:val="single" w:color="A0A7AE" w:sz="4"/>
-              <w:bottom w:val="single" w:color="A0A7AE" w:sz="4"/>
-              <w:right w:val="single" w:color="A0A7AE" w:sz="4"/>
+              <w:top w:val="single" w:color="000000" w:sz="4"/>
+              <w:left w:val="single" w:color="000000" w:sz="4"/>
+              <w:bottom w:val="single" w:color="000000" w:sz="4"/>
+              <w:right w:val="single" w:color="000000" w:sz="4"/>
             </w:tcBorders>
             <w:tcMar>
               <w:top w:type="dxa" w:w="60"/>
@@ -4518,10 +4472,10 @@
           <w:tcPr>
             <w:tcW w:type="dxa" w:w="2150"/>
             <w:tcBorders>
-              <w:top w:val="single" w:color="A0A7AE" w:sz="4"/>
-              <w:left w:val="single" w:color="A0A7AE" w:sz="4"/>
-              <w:bottom w:val="single" w:color="A0A7AE" w:sz="4"/>
-              <w:right w:val="single" w:color="A0A7AE" w:sz="4"/>
+              <w:top w:val="single" w:color="000000" w:sz="4"/>
+              <w:left w:val="single" w:color="000000" w:sz="4"/>
+              <w:bottom w:val="single" w:color="000000" w:sz="4"/>
+              <w:right w:val="single" w:color="000000" w:sz="4"/>
             </w:tcBorders>
             <w:tcMar>
               <w:top w:type="dxa" w:w="60"/>
@@ -4546,10 +4500,10 @@
           <w:tcPr>
             <w:tcW w:type="dxa" w:w="900"/>
             <w:tcBorders>
-              <w:top w:val="single" w:color="A0A7AE" w:sz="4"/>
-              <w:left w:val="single" w:color="A0A7AE" w:sz="4"/>
-              <w:bottom w:val="single" w:color="A0A7AE" w:sz="4"/>
-              <w:right w:val="single" w:color="A0A7AE" w:sz="4"/>
+              <w:top w:val="single" w:color="000000" w:sz="4"/>
+              <w:left w:val="single" w:color="000000" w:sz="4"/>
+              <w:bottom w:val="single" w:color="000000" w:sz="4"/>
+              <w:right w:val="single" w:color="000000" w:sz="4"/>
             </w:tcBorders>
             <w:tcMar>
               <w:top w:type="dxa" w:w="60"/>
@@ -4574,10 +4528,10 @@
           <w:tcPr>
             <w:tcW w:type="dxa" w:w="900"/>
             <w:tcBorders>
-              <w:top w:val="single" w:color="A0A7AE" w:sz="4"/>
-              <w:left w:val="single" w:color="A0A7AE" w:sz="4"/>
-              <w:bottom w:val="single" w:color="A0A7AE" w:sz="4"/>
-              <w:right w:val="single" w:color="A0A7AE" w:sz="4"/>
+              <w:top w:val="single" w:color="000000" w:sz="4"/>
+              <w:left w:val="single" w:color="000000" w:sz="4"/>
+              <w:bottom w:val="single" w:color="000000" w:sz="4"/>
+              <w:right w:val="single" w:color="000000" w:sz="4"/>
             </w:tcBorders>
             <w:tcMar>
               <w:top w:type="dxa" w:w="60"/>
@@ -4602,10 +4556,10 @@
           <w:tcPr>
             <w:tcW w:type="dxa" w:w="2020"/>
             <w:tcBorders>
-              <w:top w:val="single" w:color="A0A7AE" w:sz="4"/>
-              <w:left w:val="single" w:color="A0A7AE" w:sz="4"/>
-              <w:bottom w:val="single" w:color="A0A7AE" w:sz="4"/>
-              <w:right w:val="single" w:color="A0A7AE" w:sz="4"/>
+              <w:top w:val="single" w:color="000000" w:sz="4"/>
+              <w:left w:val="single" w:color="000000" w:sz="4"/>
+              <w:bottom w:val="single" w:color="000000" w:sz="4"/>
+              <w:right w:val="single" w:color="000000" w:sz="4"/>
             </w:tcBorders>
             <w:tcMar>
               <w:top w:type="dxa" w:w="60"/>
@@ -4631,10 +4585,10 @@
           <w:tcPr>
             <w:tcW w:type="dxa" w:w="900"/>
             <w:tcBorders>
-              <w:top w:val="single" w:color="A0A7AE" w:sz="4"/>
-              <w:left w:val="single" w:color="A0A7AE" w:sz="4"/>
-              <w:bottom w:val="single" w:color="A0A7AE" w:sz="4"/>
-              <w:right w:val="single" w:color="A0A7AE" w:sz="4"/>
+              <w:top w:val="single" w:color="000000" w:sz="4"/>
+              <w:left w:val="single" w:color="000000" w:sz="4"/>
+              <w:bottom w:val="single" w:color="000000" w:sz="4"/>
+              <w:right w:val="single" w:color="000000" w:sz="4"/>
             </w:tcBorders>
             <w:tcMar>
               <w:top w:type="dxa" w:w="60"/>
@@ -4659,10 +4613,10 @@
           <w:tcPr>
             <w:tcW w:type="dxa" w:w="906"/>
             <w:tcBorders>
-              <w:top w:val="single" w:color="A0A7AE" w:sz="4"/>
-              <w:left w:val="single" w:color="A0A7AE" w:sz="4"/>
-              <w:bottom w:val="single" w:color="A0A7AE" w:sz="4"/>
-              <w:right w:val="single" w:color="A0A7AE" w:sz="4"/>
+              <w:top w:val="single" w:color="000000" w:sz="4"/>
+              <w:left w:val="single" w:color="000000" w:sz="4"/>
+              <w:bottom w:val="single" w:color="000000" w:sz="4"/>
+              <w:right w:val="single" w:color="000000" w:sz="4"/>
             </w:tcBorders>
             <w:tcMar>
               <w:top w:type="dxa" w:w="60"/>
@@ -4693,10 +4647,10 @@
           <w:tcPr>
             <w:tcW w:type="dxa" w:w="1250"/>
             <w:tcBorders>
-              <w:top w:val="single" w:color="A0A7AE" w:sz="4"/>
-              <w:left w:val="single" w:color="A0A7AE" w:sz="4"/>
-              <w:bottom w:val="single" w:color="A0A7AE" w:sz="4"/>
-              <w:right w:val="single" w:color="A0A7AE" w:sz="4"/>
+              <w:top w:val="single" w:color="000000" w:sz="4"/>
+              <w:left w:val="single" w:color="000000" w:sz="4"/>
+              <w:bottom w:val="single" w:color="000000" w:sz="4"/>
+              <w:right w:val="single" w:color="000000" w:sz="4"/>
             </w:tcBorders>
             <w:tcMar>
               <w:top w:type="dxa" w:w="60"/>
@@ -4721,10 +4675,10 @@
           <w:tcPr>
             <w:tcW w:type="dxa" w:w="2150"/>
             <w:tcBorders>
-              <w:top w:val="single" w:color="A0A7AE" w:sz="4"/>
-              <w:left w:val="single" w:color="A0A7AE" w:sz="4"/>
-              <w:bottom w:val="single" w:color="A0A7AE" w:sz="4"/>
-              <w:right w:val="single" w:color="A0A7AE" w:sz="4"/>
+              <w:top w:val="single" w:color="000000" w:sz="4"/>
+              <w:left w:val="single" w:color="000000" w:sz="4"/>
+              <w:bottom w:val="single" w:color="000000" w:sz="4"/>
+              <w:right w:val="single" w:color="000000" w:sz="4"/>
             </w:tcBorders>
             <w:tcMar>
               <w:top w:type="dxa" w:w="60"/>
@@ -4749,10 +4703,10 @@
           <w:tcPr>
             <w:tcW w:type="dxa" w:w="900"/>
             <w:tcBorders>
-              <w:top w:val="single" w:color="A0A7AE" w:sz="4"/>
-              <w:left w:val="single" w:color="A0A7AE" w:sz="4"/>
-              <w:bottom w:val="single" w:color="A0A7AE" w:sz="4"/>
-              <w:right w:val="single" w:color="A0A7AE" w:sz="4"/>
+              <w:top w:val="single" w:color="000000" w:sz="4"/>
+              <w:left w:val="single" w:color="000000" w:sz="4"/>
+              <w:bottom w:val="single" w:color="000000" w:sz="4"/>
+              <w:right w:val="single" w:color="000000" w:sz="4"/>
             </w:tcBorders>
             <w:tcMar>
               <w:top w:type="dxa" w:w="60"/>
@@ -4777,10 +4731,10 @@
           <w:tcPr>
             <w:tcW w:type="dxa" w:w="900"/>
             <w:tcBorders>
-              <w:top w:val="single" w:color="A0A7AE" w:sz="4"/>
-              <w:left w:val="single" w:color="A0A7AE" w:sz="4"/>
-              <w:bottom w:val="single" w:color="A0A7AE" w:sz="4"/>
-              <w:right w:val="single" w:color="A0A7AE" w:sz="4"/>
+              <w:top w:val="single" w:color="000000" w:sz="4"/>
+              <w:left w:val="single" w:color="000000" w:sz="4"/>
+              <w:bottom w:val="single" w:color="000000" w:sz="4"/>
+              <w:right w:val="single" w:color="000000" w:sz="4"/>
             </w:tcBorders>
             <w:tcMar>
               <w:top w:type="dxa" w:w="60"/>
@@ -4805,10 +4759,10 @@
           <w:tcPr>
             <w:tcW w:type="dxa" w:w="2020"/>
             <w:tcBorders>
-              <w:top w:val="single" w:color="A0A7AE" w:sz="4"/>
-              <w:left w:val="single" w:color="A0A7AE" w:sz="4"/>
-              <w:bottom w:val="single" w:color="A0A7AE" w:sz="4"/>
-              <w:right w:val="single" w:color="A0A7AE" w:sz="4"/>
+              <w:top w:val="single" w:color="000000" w:sz="4"/>
+              <w:left w:val="single" w:color="000000" w:sz="4"/>
+              <w:bottom w:val="single" w:color="000000" w:sz="4"/>
+              <w:right w:val="single" w:color="000000" w:sz="4"/>
             </w:tcBorders>
             <w:tcMar>
               <w:top w:type="dxa" w:w="60"/>
@@ -4833,10 +4787,10 @@
           <w:tcPr>
             <w:tcW w:type="dxa" w:w="900"/>
             <w:tcBorders>
-              <w:top w:val="single" w:color="A0A7AE" w:sz="4"/>
-              <w:left w:val="single" w:color="A0A7AE" w:sz="4"/>
-              <w:bottom w:val="single" w:color="A0A7AE" w:sz="4"/>
-              <w:right w:val="single" w:color="A0A7AE" w:sz="4"/>
+              <w:top w:val="single" w:color="000000" w:sz="4"/>
+              <w:left w:val="single" w:color="000000" w:sz="4"/>
+              <w:bottom w:val="single" w:color="000000" w:sz="4"/>
+              <w:right w:val="single" w:color="000000" w:sz="4"/>
             </w:tcBorders>
             <w:tcMar>
               <w:top w:type="dxa" w:w="60"/>
@@ -4861,10 +4815,10 @@
           <w:tcPr>
             <w:tcW w:type="dxa" w:w="906"/>
             <w:tcBorders>
-              <w:top w:val="single" w:color="A0A7AE" w:sz="4"/>
-              <w:left w:val="single" w:color="A0A7AE" w:sz="4"/>
-              <w:bottom w:val="single" w:color="A0A7AE" w:sz="4"/>
-              <w:right w:val="single" w:color="A0A7AE" w:sz="4"/>
+              <w:top w:val="single" w:color="000000" w:sz="4"/>
+              <w:left w:val="single" w:color="000000" w:sz="4"/>
+              <w:bottom w:val="single" w:color="000000" w:sz="4"/>
+              <w:right w:val="single" w:color="000000" w:sz="4"/>
             </w:tcBorders>
             <w:tcMar>
               <w:top w:type="dxa" w:w="60"/>
@@ -5017,7 +4971,7 @@
         <w:pStyle w:val="Heading2"/>
       </w:pPr>
       <w:r>
-        <w:t xml:space="preserve">Engineering verification</w:t>
+        <w:t xml:space="preserve">9.1  Engineering verification</w:t>
       </w:r>
     </w:p>
     <w:p>
@@ -5034,7 +4988,7 @@
         <w:pStyle w:val="Heading1"/>
       </w:pPr>
       <w:r>
-        <w:t xml:space="preserve">Conclusion</w:t>
+        <w:t xml:space="preserve">10.  Conclusion</w:t>
       </w:r>
     </w:p>
     <w:p>
@@ -5097,10 +5051,10 @@
       <w:r>
         <w:t xml:space="preserve">Amazon Web Services, "Data protection in Amazon S3," Amazon S3 User Guide. [Online]. Available: </w:t>
       </w:r>
-      <w:hyperlink w:history="1" r:id="rIdtk01j_epbu_8saj8hh1k5">
+      <w:hyperlink w:history="1" r:id="rIdnabrm6giysntivtdc18ku">
         <w:r>
           <w:rPr>
-            <w:color w:val="0563C1"/>
+            <w:color w:val="000000"/>
             <w:u w:val="single"/>
           </w:rPr>
           <w:t xml:space="preserve">https://docs.aws.amazon.com/AmazonS3/latest/userguide/DataDurability.html</w:t>
@@ -5118,10 +5072,10 @@
       <w:r>
         <w:t xml:space="preserve">Cybersecurity and Infrastructure Security Agency, "#StopRansomware guide." [Online]. Available: </w:t>
       </w:r>
-      <w:hyperlink w:history="1" r:id="rId4yt_luulhws09xt095pzp">
+      <w:hyperlink w:history="1" r:id="rIdbytwaqc1st3yfpvugohuk">
         <w:r>
           <w:rPr>
-            <w:color w:val="0563C1"/>
+            <w:color w:val="000000"/>
             <w:u w:val="single"/>
           </w:rPr>
           <w:t xml:space="preserve">https://www.cisa.gov/stopransomware/ransomware-guide</w:t>
@@ -5149,10 +5103,10 @@
       <w:r>
         <w:t xml:space="preserve">, 2003. [Online]. Available: </w:t>
       </w:r>
-      <w:hyperlink w:history="1" r:id="rIddrtocxmlcqhhrf-zkvvpy">
+      <w:hyperlink w:history="1" r:id="rIdlfniu672tyufntpi140wh">
         <w:r>
           <w:rPr>
-            <w:color w:val="0563C1"/>
+            <w:color w:val="000000"/>
             <w:u w:val="single"/>
           </w:rPr>
           <w:t xml:space="preserve">https://www.usenix.org/conference/usits-03/why-do-internet-services-fail-and-what-can-be-done-about-it</w:t>
@@ -5170,10 +5124,10 @@
       <w:r>
         <w:t xml:space="preserve">Amazon Web Services, "Shared responsibility model." [Online]. Available: </w:t>
       </w:r>
-      <w:hyperlink w:history="1" r:id="rIddrfqeqetys-rq_gykkpio">
+      <w:hyperlink w:history="1" r:id="rIdjciz0egse2ie9blfqxkj-">
         <w:r>
           <w:rPr>
-            <w:color w:val="0563C1"/>
+            <w:color w:val="000000"/>
             <w:u w:val="single"/>
           </w:rPr>
           <w:t xml:space="preserve">https://aws.amazon.com/compliance/shared-responsibility-model/</w:t>
@@ -5204,10 +5158,10 @@
       <w:r>
         <w:t xml:space="preserve">doi: </w:t>
       </w:r>
-      <w:hyperlink w:history="1" r:id="rIdou9es6qjndsadn_pe4bew">
+      <w:hyperlink w:history="1" r:id="rIdylq_6k_btsxvmgl7807ns">
         <w:r>
           <w:rPr>
-            <w:color w:val="0563C1"/>
+            <w:color w:val="000000"/>
             <w:u w:val="single"/>
           </w:rPr>
           <w:t xml:space="preserve">10.1145/1416944.1416947</w:t>
@@ -5219,10 +5173,10 @@
       <w:r>
         <w:t xml:space="preserve"> Free conference version: </w:t>
       </w:r>
-      <w:hyperlink w:history="1" r:id="rIdzyqs3so2i6kj2mpzm3qh1">
+      <w:hyperlink w:history="1" r:id="rIdllagu8ocg8xzod-fpjidh">
         <w:r>
           <w:rPr>
-            <w:color w:val="0563C1"/>
+            <w:color w:val="000000"/>
             <w:u w:val="single"/>
           </w:rPr>
           <w:t xml:space="preserve">https://www.usenix.org/conference/fast-08/analysis-data-corruption-storage-stack</w:t>
@@ -5240,10 +5194,10 @@
       <w:r>
         <w:t xml:space="preserve">Amazon Web Services, "Encrypting Amazon RDS resources," Amazon RDS User Guide. [Online]. Available: </w:t>
       </w:r>
-      <w:hyperlink w:history="1" r:id="rIdyssrw903p1gaznzi5xklq">
+      <w:hyperlink w:history="1" r:id="rIdhwgp7ux9g763vdwmdxheh">
         <w:r>
           <w:rPr>
-            <w:color w:val="0563C1"/>
+            <w:color w:val="000000"/>
             <w:u w:val="single"/>
           </w:rPr>
           <w:t xml:space="preserve">https://docs.aws.amazon.com/AmazonRDS/latest/UserGuide/Overview.Encryption.html</w:t>
@@ -5261,10 +5215,10 @@
       <w:r>
         <w:t xml:space="preserve">GitLab Inc., "Postmortem of database outage of January 31," GitLab Blog, Feb. 2017. [Online]. Available: </w:t>
       </w:r>
-      <w:hyperlink w:history="1" r:id="rIdodhgsjjax25gtjfu6yo4e">
+      <w:hyperlink w:history="1" r:id="rIdxmrb1ugvebbwnebgk7k-7">
         <w:r>
           <w:rPr>
-            <w:color w:val="0563C1"/>
+            <w:color w:val="000000"/>
             <w:u w:val="single"/>
           </w:rPr>
           <w:t xml:space="preserve">https://about.gitlab.com/blog/postmortem-of-database-outage-of-january-31/</w:t>
@@ -5282,10 +5236,10 @@
       <w:r>
         <w:t xml:space="preserve">Amazon Web Services, "REL09-BP04 Perform periodic recovery of the data to verify backup integrity and processes," AWS Well-Architected Framework. [Online]. Available: </w:t>
       </w:r>
-      <w:hyperlink w:history="1" r:id="rIdzqvl6bkpdgubz-oasmn_h">
+      <w:hyperlink w:history="1" r:id="rId0tl_9oh3-nujlqr9g7g1d">
         <w:r>
           <w:rPr>
-            <w:color w:val="0563C1"/>
+            <w:color w:val="000000"/>
             <w:u w:val="single"/>
           </w:rPr>
           <w:t xml:space="preserve">https://docs.aws.amazon.com/wellarchitected/latest/reliability-pillar/rel_backing_up_data_periodic_recovery_testing_data.html</w:t>
@@ -5303,10 +5257,10 @@
       <w:r>
         <w:t xml:space="preserve">Amazon Web Services, "Reliability pillar," AWS Well-Architected Framework. [Online]. Available: </w:t>
       </w:r>
-      <w:hyperlink w:history="1" r:id="rIdebd4ptkzx48ippf0nf3-u">
+      <w:hyperlink w:history="1" r:id="rIdhu-syiev1pdxbxalhrjjz">
         <w:r>
           <w:rPr>
-            <w:color w:val="0563C1"/>
+            <w:color w:val="000000"/>
             <w:u w:val="single"/>
           </w:rPr>
           <w:t xml:space="preserve">https://docs.aws.amazon.com/wellarchitected/latest/reliability-pillar/welcome.html</w:t>
@@ -5327,10 +5281,10 @@
       <w:r>
         <w:t xml:space="preserve">doi: </w:t>
       </w:r>
-      <w:hyperlink w:history="1" r:id="rIdn6rw2dq6c2pogvjg5u8tu">
+      <w:hyperlink w:history="1" r:id="rId4d9qkn3zsz768dfnxbnyp">
         <w:r>
           <w:rPr>
-            <w:color w:val="0563C1"/>
+            <w:color w:val="000000"/>
             <w:u w:val="single"/>
           </w:rPr>
           <w:t xml:space="preserve">10.6028/NIST.SP.800-34r1</w:t>
@@ -5354,10 +5308,10 @@
       <w:r>
         <w:t xml:space="preserve">doi: </w:t>
       </w:r>
-      <w:hyperlink w:history="1" r:id="rId_uib45lp3j43alab5hits">
+      <w:hyperlink w:history="1" r:id="rIdv05gjpmoz_ypwldkid81h">
         <w:r>
           <w:rPr>
-            <w:color w:val="0563C1"/>
+            <w:color w:val="000000"/>
             <w:u w:val="single"/>
           </w:rPr>
           <w:t xml:space="preserve">10.6028/NIST.CSWP.29</w:t>
@@ -5385,10 +5339,10 @@
       <w:r>
         <w:t xml:space="preserve">, ISO/IEC 27031:2011. [Online]. Available: </w:t>
       </w:r>
-      <w:hyperlink w:history="1" r:id="rIdqwe89tdlhjf0uamvoxoxb">
+      <w:hyperlink w:history="1" r:id="rIdcss0xlbtpfsi2crpvrykx">
         <w:r>
           <w:rPr>
-            <w:color w:val="0563C1"/>
+            <w:color w:val="000000"/>
             <w:u w:val="single"/>
           </w:rPr>
           <w:t xml:space="preserve">https://www.iso.org/standard/44374.html</w:t>
@@ -5406,10 +5360,10 @@
       <w:r>
         <w:t xml:space="preserve">Amazon Web Services, "Lambda quotas," AWS Lambda Developer Guide. [Online]. Available: </w:t>
       </w:r>
-      <w:hyperlink w:history="1" r:id="rIdenhqywksn8rbl1sg3r1uf">
+      <w:hyperlink w:history="1" r:id="rIdx9_1iygq-9ph2r188udhf">
         <w:r>
           <w:rPr>
-            <w:color w:val="0563C1"/>
+            <w:color w:val="000000"/>
             <w:u w:val="single"/>
           </w:rPr>
           <w:t xml:space="preserve">https://docs.aws.amazon.com/lambda/latest/dg/gettingstarted-limits.html</w:t>
@@ -5427,10 +5381,10 @@
       <w:r>
         <w:t xml:space="preserve">Amazon Web Services, "What is Step Functions?," AWS Step Functions Developer Guide. [Online]. Available: </w:t>
       </w:r>
-      <w:hyperlink w:history="1" r:id="rIdp_d0gxaywxssn6bi_kzea">
+      <w:hyperlink w:history="1" r:id="rId7-xbeztnkjfss_kqqc_rc">
         <w:r>
           <w:rPr>
-            <w:color w:val="0563C1"/>
+            <w:color w:val="000000"/>
             <w:u w:val="single"/>
           </w:rPr>
           <w:t xml:space="preserve">https://docs.aws.amazon.com/step-functions/latest/dg/welcome.html</w:t>
@@ -5448,10 +5402,10 @@
       <w:r>
         <w:t xml:space="preserve">Amazon Web Services, "Handling errors in Step Functions workflows," AWS Step Functions Developer Guide. [Online]. Available: </w:t>
       </w:r>
-      <w:hyperlink w:history="1" r:id="rIdnfdztarouizw1z8cdfk0t">
+      <w:hyperlink w:history="1" r:id="rIdmvg6jcyi7dbzn6hfxm5su">
         <w:r>
           <w:rPr>
-            <w:color w:val="0563C1"/>
+            <w:color w:val="000000"/>
             <w:u w:val="single"/>
           </w:rPr>
           <w:t xml:space="preserve">https://docs.aws.amazon.com/step-functions/latest/dg/concepts-error-handling.html</w:t>
@@ -5469,10 +5423,10 @@
       <w:r>
         <w:t xml:space="preserve">Amazon Web Services, "Security best practices in IAM," AWS IAM User Guide. [Online]. Available: </w:t>
       </w:r>
-      <w:hyperlink w:history="1" r:id="rIdgo6zfdvtjt1w0tde2msmx">
+      <w:hyperlink w:history="1" r:id="rIdqjf-ep74wmhoh_3le5vxs">
         <w:r>
           <w:rPr>
-            <w:color w:val="0563C1"/>
+            <w:color w:val="000000"/>
             <w:u w:val="single"/>
           </w:rPr>
           <w:t xml:space="preserve">https://docs.aws.amazon.com/IAM/latest/UserGuide/best-practices.html</w:t>
@@ -5490,10 +5444,10 @@
       <w:r>
         <w:t xml:space="preserve">Amazon Web Services, "IAM JSON policy reference," AWS IAM User Guide. [Online]. Available: </w:t>
       </w:r>
-      <w:hyperlink w:history="1" r:id="rIdxslexkwa0eyjg9s8zexlt">
+      <w:hyperlink w:history="1" r:id="rId281cquga6u0fihm1dd4wp">
         <w:r>
           <w:rPr>
-            <w:color w:val="0563C1"/>
+            <w:color w:val="000000"/>
             <w:u w:val="single"/>
           </w:rPr>
           <w:t xml:space="preserve">https://docs.aws.amazon.com/IAM/latest/UserGuide/reference_policies.html</w:t>
@@ -5511,10 +5465,10 @@
       <w:r>
         <w:t xml:space="preserve">Amazon Web Services, "IAM database authentication for MariaDB, MySQL, and PostgreSQL," Amazon RDS User Guide. [Online]. Available: </w:t>
       </w:r>
-      <w:hyperlink w:history="1" r:id="rId_i353kdslniqhtxoa8s5g">
+      <w:hyperlink w:history="1" r:id="rId8tfpgfowlgjfrurhzxx2e">
         <w:r>
           <w:rPr>
-            <w:color w:val="0563C1"/>
+            <w:color w:val="000000"/>
             <w:u w:val="single"/>
           </w:rPr>
           <w:t xml:space="preserve">https://docs.aws.amazon.com/AmazonRDS/latest/UserGuide/UsingWithRDS.IAMDBAuth.html</w:t>
@@ -5532,10 +5486,10 @@
       <w:r>
         <w:t xml:space="preserve">Amazon Web Services, "Using SSL/TLS to encrypt a connection to a DB instance or cluster," Amazon RDS User Guide. [Online]. Available: </w:t>
       </w:r>
-      <w:hyperlink w:history="1" r:id="rIdoj4t8wlzv3kfslx1tdejp">
+      <w:hyperlink w:history="1" r:id="rIdvxfp6n3mzdnarxtmuhvz4">
         <w:r>
           <w:rPr>
-            <w:color w:val="0563C1"/>
+            <w:color w:val="000000"/>
             <w:u w:val="single"/>
           </w:rPr>
           <w:t xml:space="preserve">https://docs.aws.amazon.com/AmazonRDS/latest/UserGuide/UsingWithRDS.SSL.html</w:t>
@@ -5553,10 +5507,10 @@
       <w:r>
         <w:t xml:space="preserve">Amazon Web Services, "Control traffic to your AWS resources using security groups," Amazon VPC User Guide. [Online]. Available: </w:t>
       </w:r>
-      <w:hyperlink w:history="1" r:id="rId8wzuakakrckgmmaatbbsu">
+      <w:hyperlink w:history="1" r:id="rIdluibdlde0lynn5aoqfbl9">
         <w:r>
           <w:rPr>
-            <w:color w:val="0563C1"/>
+            <w:color w:val="000000"/>
             <w:u w:val="single"/>
           </w:rPr>
           <w:t xml:space="preserve">https://docs.aws.amazon.com/vpc/latest/userguide/vpc-security-groups.html</w:t>
@@ -5574,10 +5528,10 @@
       <w:r>
         <w:t xml:space="preserve">Amazon Web Services, "Giving Lambda event functions access to resources in an Amazon VPC," AWS Lambda Developer Guide. [Online]. Available: </w:t>
       </w:r>
-      <w:hyperlink w:history="1" r:id="rIdmuxyfzqe11mrimdzpg_hg">
+      <w:hyperlink w:history="1" r:id="rIdjaxcx_2to5hejcaza-emc">
         <w:r>
           <w:rPr>
-            <w:color w:val="0563C1"/>
+            <w:color w:val="000000"/>
             <w:u w:val="single"/>
           </w:rPr>
           <w:t xml:space="preserve">https://docs.aws.amazon.com/lambda/latest/dg/configuration-vpc.html</w:t>
@@ -5595,10 +5549,10 @@
       <w:r>
         <w:t xml:space="preserve">Amazon Web Services, "What is the AWS Serverless Application Model (AWS SAM)?," AWS SAM Developer Guide. [Online]. Available: </w:t>
       </w:r>
-      <w:hyperlink w:history="1" r:id="rIdbwrycwgju87i1fflrtayu">
+      <w:hyperlink w:history="1" r:id="rId0gi04pzggacqwxxoezlbr">
         <w:r>
           <w:rPr>
-            <w:color w:val="0563C1"/>
+            <w:color w:val="000000"/>
             <w:u w:val="single"/>
           </w:rPr>
           <w:t xml:space="preserve">https://docs.aws.amazon.com/serverless-application-model/latest/developerguide/what-is-sam.html</w:t>
@@ -5616,10 +5570,10 @@
       <w:r>
         <w:t xml:space="preserve">Amazon Web Services, "What is CloudFormation?," AWS CloudFormation User Guide. [Online]. Available: </w:t>
       </w:r>
-      <w:hyperlink w:history="1" r:id="rIdpkvvgmfqbvc6ddg2gemcw">
+      <w:hyperlink w:history="1" r:id="rIdlwvcvmpoe8eilbeflkil8">
         <w:r>
           <w:rPr>
-            <w:color w:val="0563C1"/>
+            <w:color w:val="000000"/>
             <w:u w:val="single"/>
           </w:rPr>
           <w:t xml:space="preserve">https://docs.aws.amazon.com/AWSCloudFormation/latest/UserGuide/Welcome.html</w:t>
@@ -5637,10 +5591,10 @@
       <w:r>
         <w:t xml:space="preserve">United Nations, "Goal 9: Build resilient infrastructure, promote inclusive and sustainable industrialization and foster innovation." [Online]. Available: </w:t>
       </w:r>
-      <w:hyperlink w:history="1" r:id="rIdma0mar-kmlxdhznl1oru0">
+      <w:hyperlink w:history="1" r:id="rIdory0uf_aqcixr-ducowcb">
         <w:r>
           <w:rPr>
-            <w:color w:val="0563C1"/>
+            <w:color w:val="000000"/>
             <w:u w:val="single"/>
           </w:rPr>
           <w:t xml:space="preserve">https://sdgs.un.org/goals/goal9</w:t>
@@ -5658,10 +5612,10 @@
       <w:r>
         <w:t xml:space="preserve">United Nations, "Goal 11: Make cities and human settlements inclusive, safe, resilient and sustainable." [Online]. Available: </w:t>
       </w:r>
-      <w:hyperlink w:history="1" r:id="rId5ckbyrm8wrnovvhpsccqn">
+      <w:hyperlink w:history="1" r:id="rIdishe2kuks4iudyztkit9k">
         <w:r>
           <w:rPr>
-            <w:color w:val="0563C1"/>
+            <w:color w:val="000000"/>
             <w:u w:val="single"/>
           </w:rPr>
           <w:t xml:space="preserve">https://sdgs.un.org/goals/goal11</w:t>
@@ -5689,10 +5643,10 @@
       <w:r>
         <w:t xml:space="preserve">, 2010. [Online]. Available: </w:t>
       </w:r>
-      <w:hyperlink w:history="1" r:id="rIduy0jwjv3xub2c-trtnrz7">
+      <w:hyperlink w:history="1" r:id="rIdk77vqgfpzdeypreg8n65r">
         <w:r>
           <w:rPr>
-            <w:color w:val="0563C1"/>
+            <w:color w:val="000000"/>
             <w:u w:val="single"/>
           </w:rPr>
           <w:t xml:space="preserve">https://www.usenix.org/conference/hotcloud-10/disaster-recovery-cloud-service-economic-benefits-deployment-challenges</w:t>
@@ -5723,10 +5677,10 @@
       <w:r>
         <w:t xml:space="preserve">doi: </w:t>
       </w:r>
-      <w:hyperlink w:history="1" r:id="rIdw2v2yungsggrebnodnags">
+      <w:hyperlink w:history="1" r:id="rIdvvx8xjz4noewyio1rcocl">
         <w:r>
           <w:rPr>
-            <w:color w:val="0563C1"/>
+            <w:color w:val="000000"/>
             <w:u w:val="single"/>
           </w:rPr>
           <w:t xml:space="preserve">10.1109/RAMS.2013.6517700</w:t>
@@ -5760,10 +5714,10 @@
       <w:r>
         <w:t xml:space="preserve">doi: </w:t>
       </w:r>
-      <w:hyperlink w:history="1" r:id="rIdbzouz8aaj44p6xi-inlaf">
+      <w:hyperlink w:history="1" r:id="rIdan1wymscm6fp2r2ywivfp">
         <w:r>
           <w:rPr>
-            <w:color w:val="0563C1"/>
+            <w:color w:val="000000"/>
             <w:u w:val="single"/>
           </w:rPr>
           <w:t xml:space="preserve">10.1109/CLOUD.2015.127</w:t>
@@ -5797,10 +5751,10 @@
       <w:r>
         <w:t xml:space="preserve">doi: </w:t>
       </w:r>
-      <w:hyperlink w:history="1" r:id="rIdcsy4fw_jgn7b4vpbsy8ky">
+      <w:hyperlink w:history="1" r:id="rIdq37sjeegaj8yfxx2ol7ox">
         <w:r>
           <w:rPr>
-            <w:color w:val="0563C1"/>
+            <w:color w:val="000000"/>
             <w:u w:val="single"/>
           </w:rPr>
           <w:t xml:space="preserve">10.5539/cis.v7n4p39</w:t>
@@ -5831,10 +5785,10 @@
       <w:r>
         <w:t xml:space="preserve">, 2008. [Online]. Available: </w:t>
       </w:r>
-      <w:hyperlink w:history="1" r:id="rIddbywanqa1xi7g5_gzjrtq">
+      <w:hyperlink w:history="1" r:id="rIdxgz28fmutvke1yphciojm">
         <w:r>
           <w:rPr>
-            <w:color w:val="0563C1"/>
+            <w:color w:val="000000"/>
             <w:u w:val="single"/>
           </w:rPr>
           <w:t xml:space="preserve">https://www.usenix.org/conference/nsdi-08/remus-high-availability-asynchronous-virtual-machine-replication</w:t>
@@ -5862,10 +5816,10 @@
       <w:r>
         <w:t xml:space="preserve">, 2007. [Online]. Available: </w:t>
       </w:r>
-      <w:hyperlink w:history="1" r:id="rIddotqbexgovjiz2vfoaimm">
+      <w:hyperlink w:history="1" r:id="rIdm5ucf2lwfsenoxhukhkvn">
         <w:r>
           <w:rPr>
-            <w:color w:val="0563C1"/>
+            <w:color w:val="000000"/>
             <w:u w:val="single"/>
           </w:rPr>
           <w:t xml:space="preserve">https://www.usenix.org/conference/fast-07/disk-failures-real-world-what-does-mttf-1000000-hours-mean-you</w:t>
@@ -5896,10 +5850,10 @@
       <w:r>
         <w:t xml:space="preserve">doi: </w:t>
       </w:r>
-      <w:hyperlink w:history="1" r:id="rIdgc5yy-t7wvkzlv0vqrk4p">
+      <w:hyperlink w:history="1" r:id="rIdss3gt7wdr1puwpkb6mdkt">
         <w:r>
           <w:rPr>
-            <w:color w:val="0563C1"/>
+            <w:color w:val="000000"/>
             <w:u w:val="single"/>
           </w:rPr>
           <w:t xml:space="preserve">10.1145/2670979.2670986</w:t>
@@ -5930,10 +5884,10 @@
       <w:r>
         <w:t xml:space="preserve">, 2014. [Online]. Available: </w:t>
       </w:r>
-      <w:hyperlink w:history="1" r:id="rIdoq95t0hkopoofhxvwrsd8">
+      <w:hyperlink w:history="1" r:id="rId4e7gnditrqmhcqe7imymi">
         <w:r>
           <w:rPr>
-            <w:color w:val="0563C1"/>
+            <w:color w:val="000000"/>
             <w:u w:val="single"/>
           </w:rPr>
           <w:t xml:space="preserve">https://www.usenix.org/conference/osdi14/technical-sessions/presentation/yuan</w:t>
@@ -5964,10 +5918,10 @@
       <w:r>
         <w:t xml:space="preserve">doi: </w:t>
       </w:r>
-      <w:hyperlink w:history="1" r:id="rId_csp_yyhqmsjtawmc6rhs">
+      <w:hyperlink w:history="1" r:id="rId2zybaa5o8fwmwq_kzxe9q">
         <w:r>
           <w:rPr>
-            <w:color w:val="0563C1"/>
+            <w:color w:val="000000"/>
             <w:u w:val="single"/>
           </w:rPr>
           <w:t xml:space="preserve">10.1109/MS.2016.60</w:t>
@@ -6001,10 +5955,10 @@
       <w:r>
         <w:t xml:space="preserve">doi: </w:t>
       </w:r>
-      <w:hyperlink w:history="1" r:id="rIdosf7pom3pfaqgcq519k7x">
+      <w:hyperlink w:history="1" r:id="rIdkh2uppdcsprimbyfwxczk">
         <w:r>
           <w:rPr>
-            <w:color w:val="0563C1"/>
+            <w:color w:val="000000"/>
             <w:u w:val="single"/>
           </w:rPr>
           <w:t xml:space="preserve">10.1109/ICSE-SEIP.2019.00012</w:t>
@@ -6035,10 +5989,10 @@
       <w:r>
         <w:t xml:space="preserve">, B. Beyer, C. Jones, J. Petoff, and N. R. Murphy, Eds. Sebastopol, CA, USA: O'Reilly Media, 2016, ch. 26. [Online]. Available: </w:t>
       </w:r>
-      <w:hyperlink w:history="1" r:id="rId-um0dt4aapvast0adejt-">
+      <w:hyperlink w:history="1" r:id="rId-cefixgseayet8nbyu9wu">
         <w:r>
           <w:rPr>
-            <w:color w:val="0563C1"/>
+            <w:color w:val="000000"/>
             <w:u w:val="single"/>
           </w:rPr>
           <w:t xml:space="preserve">https://sre.google/sre-book/data-integrity/</w:t>
@@ -6056,10 +6010,10 @@
       <w:r>
         <w:t xml:space="preserve">Amazon Web Services, "Restore testing," AWS Backup Developer Guide. [Online]. Available: </w:t>
       </w:r>
-      <w:hyperlink w:history="1" r:id="rIdytu9iotyy7rwex1wouqm_">
+      <w:hyperlink w:history="1" r:id="rIdvqbqkhiypmg2ogldh8bph">
         <w:r>
           <w:rPr>
-            <w:color w:val="0563C1"/>
+            <w:color w:val="000000"/>
             <w:u w:val="single"/>
           </w:rPr>
           <w:t xml:space="preserve">https://docs.aws.amazon.com/aws-backup/latest/devguide/restore-testing.html</w:t>
@@ -6077,10 +6031,10 @@
       <w:r>
         <w:t xml:space="preserve">Amazon Web Services, "What is AWS Backup?," AWS Backup Developer Guide. [Online]. Available: </w:t>
       </w:r>
-      <w:hyperlink w:history="1" r:id="rIdvgdu2bqna-qlgkjqpi_ao">
+      <w:hyperlink w:history="1" r:id="rIdowydxfg0pgk7ffly9bp9z">
         <w:r>
           <w:rPr>
-            <w:color w:val="0563C1"/>
+            <w:color w:val="000000"/>
             <w:u w:val="single"/>
           </w:rPr>
           <w:t xml:space="preserve">https://docs.aws.amazon.com/aws-backup/latest/devguide/whatisbackup.html</w:t>
@@ -6098,10 +6052,10 @@
       <w:r>
         <w:t xml:space="preserve">Amazon Web Services, "Amazon States Language." [Online]. Available: </w:t>
       </w:r>
-      <w:hyperlink w:history="1" r:id="rIdokbbdps3scz_n6mwofw6t">
+      <w:hyperlink w:history="1" r:id="rIdgdeidyuxuy2p8i0cr4evn">
         <w:r>
           <w:rPr>
-            <w:color w:val="0563C1"/>
+            <w:color w:val="000000"/>
             <w:u w:val="single"/>
           </w:rPr>
           <w:t xml:space="preserve">https://states-language.net/spec.html</w:t>
@@ -6119,10 +6073,10 @@
       <w:r>
         <w:t xml:space="preserve">Amazon Web Services, "Creating a scheduled rule (legacy) in Amazon EventBridge," Amazon EventBridge User Guide. [Online]. Available: </w:t>
       </w:r>
-      <w:hyperlink w:history="1" r:id="rIdhyexj0kmhcoxfu8yxrsrk">
+      <w:hyperlink w:history="1" r:id="rIda8vpez1ugwyqclvvs7lo8">
         <w:r>
           <w:rPr>
-            <w:color w:val="0563C1"/>
+            <w:color w:val="000000"/>
             <w:u w:val="single"/>
           </w:rPr>
           <w:t xml:space="preserve">https://docs.aws.amazon.com/eventbridge/latest/userguide/eb-create-rule-schedule.html</w:t>
@@ -6140,10 +6094,10 @@
       <w:r>
         <w:t xml:space="preserve">Amazon Web Services, "Introduction to backups," Amazon RDS User Guide. [Online]. Available: </w:t>
       </w:r>
-      <w:hyperlink w:history="1" r:id="rIdxftyfhauw456seqorb3-e">
+      <w:hyperlink w:history="1" r:id="rIdaagxa8drd3tykvhcwntby">
         <w:r>
           <w:rPr>
-            <w:color w:val="0563C1"/>
+            <w:color w:val="000000"/>
             <w:u w:val="single"/>
           </w:rPr>
           <w:t xml:space="preserve">https://docs.aws.amazon.com/AmazonRDS/latest/UserGuide/USER_WorkingWithAutomatedBackups.html</w:t>
@@ -6161,10 +6115,10 @@
       <w:r>
         <w:t xml:space="preserve">Amazon Web Services, "Restoring to a DB instance," Amazon RDS User Guide. [Online]. Available: </w:t>
       </w:r>
-      <w:hyperlink w:history="1" r:id="rIdceshtrae4doy4svvxtpy_">
+      <w:hyperlink w:history="1" r:id="rIdlhjwerjvbhgmhzoohlexq">
         <w:r>
           <w:rPr>
-            <w:color w:val="0563C1"/>
+            <w:color w:val="000000"/>
             <w:u w:val="single"/>
           </w:rPr>
           <w:t xml:space="preserve">https://docs.aws.amazon.com/AmazonRDS/latest/UserGuide/USER_RestoreFromSnapshot.html</w:t>
@@ -6182,10 +6136,10 @@
       <w:r>
         <w:t xml:space="preserve">Amazon Web Services, "Viewing instance status," Amazon RDS User Guide. [Online]. Available: </w:t>
       </w:r>
-      <w:hyperlink w:history="1" r:id="rId71scpczocpavxyobw5h8x">
+      <w:hyperlink w:history="1" r:id="rId-cf0hezyiohjcpcamvxta">
         <w:r>
           <w:rPr>
-            <w:color w:val="0563C1"/>
+            <w:color w:val="000000"/>
             <w:u w:val="single"/>
           </w:rPr>
           <w:t xml:space="preserve">https://docs.aws.amazon.com/AmazonRDS/latest/UserGuide/accessing-monitoring.html</w:t>
@@ -6203,10 +6157,10 @@
       <w:r>
         <w:t xml:space="preserve">Amazon Web Services, "Core components of Amazon DynamoDB," Amazon DynamoDB Developer Guide. [Online]. Available: </w:t>
       </w:r>
-      <w:hyperlink w:history="1" r:id="rIdpymt1naizy54ktkuacyvc">
+      <w:hyperlink w:history="1" r:id="rIdmj0ncapol0tzldl20amsd">
         <w:r>
           <w:rPr>
-            <w:color w:val="0563C1"/>
+            <w:color w:val="000000"/>
             <w:u w:val="single"/>
           </w:rPr>
           <w:t xml:space="preserve">https://docs.aws.amazon.com/amazondynamodb/latest/developerguide/HowItWorks.CoreComponents.html</w:t>
@@ -6224,10 +6178,10 @@
       <w:r>
         <w:t xml:space="preserve">Amazon Web Services, "Publish custom metrics (PutMetricData / EMF)," Amazon CloudWatch User Guide. [Online]. Available: </w:t>
       </w:r>
-      <w:hyperlink w:history="1" r:id="rIdjvjvemwggyif2snoigano">
+      <w:hyperlink w:history="1" r:id="rIdofn8i2ht-yif74ohmv1zr">
         <w:r>
           <w:rPr>
-            <w:color w:val="0563C1"/>
+            <w:color w:val="000000"/>
             <w:u w:val="single"/>
           </w:rPr>
           <w:t xml:space="preserve">https://docs.aws.amazon.com/AmazonCloudWatch/latest/monitoring/publishingMetrics.html</w:t>
@@ -6245,10 +6199,10 @@
       <w:r>
         <w:t xml:space="preserve">Amazon Web Services, "Amazon SNS email subscription setup and management," Amazon SNS Developer Guide. [Online]. Available: </w:t>
       </w:r>
-      <w:hyperlink w:history="1" r:id="rIdpgrrlbup0qy2jdshckl3u">
+      <w:hyperlink w:history="1" r:id="rIdphgpd5ay3sffdrskr_ipq">
         <w:r>
           <w:rPr>
-            <w:color w:val="0563C1"/>
+            <w:color w:val="000000"/>
             <w:u w:val="single"/>
           </w:rPr>
           <w:t xml:space="preserve">https://docs.aws.amazon.com/sns/latest/dg/sns-email-notifications.html</w:t>
@@ -6266,10 +6220,10 @@
       <w:r>
         <w:t xml:space="preserve">Amazon Web Services, "Using Amazon CloudWatch dashboards," Amazon CloudWatch User Guide. [Online]. Available: </w:t>
       </w:r>
-      <w:hyperlink w:history="1" r:id="rId2r-r2gvldgly98xllhidu">
+      <w:hyperlink w:history="1" r:id="rIdxb5yl_jcbp-eg3as5qxlm">
         <w:r>
           <w:rPr>
-            <w:color w:val="0563C1"/>
+            <w:color w:val="000000"/>
             <w:u w:val="single"/>
           </w:rPr>
           <w:t xml:space="preserve">https://docs.aws.amazon.com/AmazonCloudWatch/latest/monitoring/CloudWatch_Dashboards.html</w:t>
@@ -6287,10 +6241,10 @@
       <w:r>
         <w:t xml:space="preserve">Amazon Web Services, "Service control policies (SCPs)," AWS Organizations User Guide. [Online]. Available: </w:t>
       </w:r>
-      <w:hyperlink w:history="1" r:id="rIdgmcy92jdlsryfgjkj_f1f">
+      <w:hyperlink w:history="1" r:id="rId3zhnhjgvqwy9nrmapjlmg">
         <w:r>
           <w:rPr>
-            <w:color w:val="0563C1"/>
+            <w:color w:val="000000"/>
             <w:u w:val="single"/>
           </w:rPr>
           <w:t xml:space="preserve">https://docs.aws.amazon.com/organizations/latest/userguide/orgs_manage_policies_scps.html</w:t>
@@ -6308,10 +6262,10 @@
       <w:r>
         <w:t xml:space="preserve">Amazon Web Services, "Disaster recovery (DR) objectives," AWS Well-Architected Framework. [Online]. Available: </w:t>
       </w:r>
-      <w:hyperlink w:history="1" r:id="rIdznuez3lftnaua7fjsv114">
+      <w:hyperlink w:history="1" r:id="rId7w3xt5u9vcwmfocmu70jy">
         <w:r>
           <w:rPr>
-            <w:color w:val="0563C1"/>
+            <w:color w:val="000000"/>
             <w:u w:val="single"/>
           </w:rPr>
           <w:t xml:space="preserve">https://docs.aws.amazon.com/wellarchitected/latest/reliability-pillar/disaster-recovery-dr-objectives.html</w:t>
@@ -6329,10 +6283,10 @@
       <w:r>
         <w:t xml:space="preserve">Moto contributors, "Moto: Mock AWS services." [Online]. Available: </w:t>
       </w:r>
-      <w:hyperlink w:history="1" r:id="rIdniv7hucclt9xioisw9ckx">
+      <w:hyperlink w:history="1" r:id="rIdfhvnuev6-byvopxgyogxm">
         <w:r>
           <w:rPr>
-            <w:color w:val="0563C1"/>
+            <w:color w:val="000000"/>
             <w:u w:val="single"/>
           </w:rPr>
           <w:t xml:space="preserve">https://github.com/getmoto/moto</w:t>
@@ -6353,10 +6307,10 @@
       <w:r>
         <w:t xml:space="preserve">doi: </w:t>
       </w:r>
-      <w:hyperlink w:history="1" r:id="rIdqzxqv-np_16khqvtwprky">
+      <w:hyperlink w:history="1" r:id="rId-ai8vqd158nbbdsprspba">
         <w:r>
           <w:rPr>
-            <w:color w:val="0563C1"/>
+            <w:color w:val="000000"/>
             <w:u w:val="single"/>
           </w:rPr>
           <w:t xml:space="preserve">10.6028/NIST.SP.800-209</w:t>
@@ -6377,10 +6331,10 @@
       <w:r>
         <w:t xml:space="preserve">Amazon Web Services, "Disaster recovery of workloads on AWS: Recovery in the cloud," AWS Whitepaper. [Online]. Available: </w:t>
       </w:r>
-      <w:hyperlink w:history="1" r:id="rIdrp9ysr6idhv-thlnqoe1f">
+      <w:hyperlink w:history="1" r:id="rIdosawtupu6xzzkly9axh4p">
         <w:r>
           <w:rPr>
-            <w:color w:val="0563C1"/>
+            <w:color w:val="000000"/>
             <w:u w:val="single"/>
           </w:rPr>
           <w:t xml:space="preserve">https://docs.aws.amazon.com/whitepapers/latest/disaster-recovery-workloads-on-aws/disaster-recovery-workloads-on-aws.html</w:t>
@@ -6398,10 +6352,10 @@
       <w:r>
         <w:t xml:space="preserve">Amazon Web Services, "Boto3 documentation," AWS SDK for Python. [Online]. Available: </w:t>
       </w:r>
-      <w:hyperlink w:history="1" r:id="rIde6wzzqjmirz1tpo6kv9o0">
+      <w:hyperlink w:history="1" r:id="rIdvnstvpjtoobokpa8u1nmv">
         <w:r>
           <w:rPr>
-            <w:color w:val="0563C1"/>
+            <w:color w:val="000000"/>
             <w:u w:val="single"/>
           </w:rPr>
           <w:t xml:space="preserve">https://docs.aws.amazon.com/boto3/latest/</w:t>
@@ -6419,10 +6373,10 @@
       <w:r>
         <w:t xml:space="preserve">The PostgreSQL Global Development Group, "Backup and restore," PostgreSQL Documentation. [Online]. Available: </w:t>
       </w:r>
-      <w:hyperlink w:history="1" r:id="rIdfggusszzfmd3iec7vprc3">
+      <w:hyperlink w:history="1" r:id="rIdajeifbpfdlzadcydnkfns">
         <w:r>
           <w:rPr>
-            <w:color w:val="0563C1"/>
+            <w:color w:val="000000"/>
             <w:u w:val="single"/>
           </w:rPr>
           <w:t xml:space="preserve">https://www.postgresql.org/docs/current/backup.html</w:t>
@@ -6450,10 +6404,10 @@
       <w:r>
         <w:t xml:space="preserve">, "pg8000: A pure-Python PostgreSQL driver," Python Package Index. [Online]. Available: </w:t>
       </w:r>
-      <w:hyperlink w:history="1" r:id="rId3cnqzhqw7xxdcl-tf1rfo">
+      <w:hyperlink w:history="1" r:id="rIdzygqinird3wdn7jzlr8li">
         <w:r>
           <w:rPr>
-            <w:color w:val="0563C1"/>
+            <w:color w:val="000000"/>
             <w:u w:val="single"/>
           </w:rPr>
           <w:t xml:space="preserve">https://pypi.org/project/pg8000/</w:t>
@@ -6471,10 +6425,10 @@
       <w:r>
         <w:t xml:space="preserve">LocalStack, "LocalStack documentation." [Online]. Available: </w:t>
       </w:r>
-      <w:hyperlink w:history="1" r:id="rIdvfmfsphevufvvbv6xbeng">
+      <w:hyperlink w:history="1" r:id="rIdjqrw2gwzdhszgn0-ounjz">
         <w:r>
           <w:rPr>
-            <w:color w:val="0563C1"/>
+            <w:color w:val="000000"/>
             <w:u w:val="single"/>
           </w:rPr>
           <w:t xml:space="preserve">https://docs.localstack.cloud/</w:t>
@@ -6626,15 +6580,19 @@
 <w:hdr xmlns:wpc="http://schemas.microsoft.com/office/word/2010/wordprocessingCanvas" xmlns:mc="http://schemas.openxmlformats.org/markup-compatibility/2006" xmlns:o="urn:schemas-microsoft-com:office:office" xmlns:r="http://schemas.openxmlformats.org/officeDocument/2006/relationships" xmlns:m="http://schemas.openxmlformats.org/officeDocument/2006/math" xmlns:v="urn:schemas-microsoft-com:vml" xmlns:wp14="http://schemas.microsoft.com/office/word/2010/wordprocessingDrawing" xmlns:wp="http://schemas.openxmlformats.org/drawingml/2006/wordprocessingDrawing" xmlns:w10="urn:schemas-microsoft-com:office:word" xmlns:w="http://schemas.openxmlformats.org/wordprocessingml/2006/main" xmlns:w14="http://schemas.microsoft.com/office/word/2010/wordml" xmlns:w15="http://schemas.microsoft.com/office/word/2012/wordml" xmlns:wpg="http://schemas.microsoft.com/office/word/2010/wordprocessingGroup" xmlns:wpi="http://schemas.microsoft.com/office/word/2010/wordprocessingInk" xmlns:wne="http://schemas.microsoft.com/office/word/2006/wordml" xmlns:wps="http://schemas.microsoft.com/office/word/2010/wordprocessingShape" xmlns:cx="http://schemas.microsoft.com/office/drawing/2014/chartex" xmlns:cx1="http://schemas.microsoft.com/office/drawing/2015/9/8/chartex" xmlns:cx2="http://schemas.microsoft.com/office/drawing/2015/10/21/chartex" xmlns:cx3="http://schemas.microsoft.com/office/drawing/2016/5/9/chartex" xmlns:cx4="http://schemas.microsoft.com/office/drawing/2016/5/10/chartex" xmlns:cx5="http://schemas.microsoft.com/office/drawing/2016/5/11/chartex" xmlns:cx6="http://schemas.microsoft.com/office/drawing/2016/5/12/chartex" xmlns:cx7="http://schemas.microsoft.com/office/drawing/2016/5/13/chartex" xmlns:cx8="http://schemas.microsoft.com/office/drawing/2016/5/14/chartex" xmlns:w16cid="http://schemas.microsoft.com/office/word/2016/wordml/cid" xmlns:w16se="http://schemas.microsoft.com/office/word/2015/wordml/symex">
   <w:p>
     <w:pPr>
+      <w:pBdr>
+        <w:bottom w:val="single" w:color="000000" w:sz="4" w:space="4"/>
+      </w:pBdr>
       <w:jc w:val="right"/>
     </w:pPr>
     <w:r>
       <w:rPr>
-        <w:color w:val="6B7280"/>
+        <w:i/>
+        <w:iCs/>
         <w:sz w:val="18"/>
         <w:szCs w:val="18"/>
       </w:rPr>
-      <w:t xml:space="preserve">RestoreCheck · BCSE355L DA-III</w:t>
+      <w:t xml:space="preserve">RestoreCheck  |  BCSE355L Cloud Architecture Design  |  DA-III</w:t>
     </w:r>
   </w:p>
 </w:hdr>
@@ -6777,6 +6735,7 @@
     <w:rPrDefault>
       <w:rPr>
         <w:rFonts w:ascii="Times New Roman" w:cs="Times New Roman" w:eastAsia="Times New Roman" w:hAnsi="Times New Roman"/>
+        <w:color w:val="000000"/>
         <w:sz w:val="24"/>
         <w:szCs w:val="24"/>
       </w:rPr>
@@ -6958,15 +6917,16 @@
     <w:qFormat/>
     <w:pPr>
       <w:keepNext/>
-      <w:spacing w:after="140" w:before="360"/>
+      <w:spacing w:after="160" w:before="360"/>
       <w:outlineLvl w:val="0"/>
     </w:pPr>
     <w:rPr>
+      <w:rFonts w:ascii="Times New Roman" w:cs="Times New Roman" w:eastAsia="Times New Roman" w:hAnsi="Times New Roman"/>
       <w:b/>
       <w:bCs/>
-      <w:color w:val="1F3864"/>
-      <w:sz w:val="30"/>
-      <w:szCs w:val="30"/>
+      <w:color w:val="000000"/>
+      <w:sz w:val="28"/>
+      <w:szCs w:val="28"/>
     </w:rPr>
   </w:style>
   <w:style w:type="paragraph" w:styleId="Heading2">
@@ -6976,15 +6936,16 @@
     <w:qFormat/>
     <w:pPr>
       <w:keepNext/>
-      <w:spacing w:after="100" w:before="240"/>
+      <w:spacing w:after="120" w:before="240"/>
       <w:outlineLvl w:val="1"/>
     </w:pPr>
     <w:rPr>
+      <w:rFonts w:ascii="Times New Roman" w:cs="Times New Roman" w:eastAsia="Times New Roman" w:hAnsi="Times New Roman"/>
       <w:b/>
       <w:bCs/>
-      <w:color w:val="2F5496"/>
-      <w:sz w:val="26"/>
-      <w:szCs w:val="26"/>
+      <w:color w:val="000000"/>
+      <w:sz w:val="24"/>
+      <w:szCs w:val="24"/>
     </w:rPr>
   </w:style>
 </w:styles>

</xml_diff>

<commit_message>
Add the backup-health dashboard to the project website
docs/index.html is now a dashboard that reads docs/data/runs.json: latest
result, summary tiles, restore time per run, the integrity checks of every
run, and a run table that opens each run's full report. It follows the
viewer's light or dark setting and works on phones.

scripts/export_runs.py builds the data file from the DynamoDB history and
the S3 reports, labels demo scenarios from the snapshot names, and masks
account IDs, bucket names and RDS endpoint IDs before publishing. The
explainer page moves to docs/about.html.
</commit_message>
<xml_diff>
--- a/report/RestoreCheck_DA3_Report.docx
+++ b/report/RestoreCheck_DA3_Report.docx
@@ -891,12 +891,12 @@
           <w:b/>
           <w:bCs/>
         </w:rPr>
-        <w:t xml:space="preserve">Results site:</w:t>
+        <w:t xml:space="preserve">Dashboard (project website):</w:t>
       </w:r>
       <w:r>
         <w:t xml:space="preserve"> </w:t>
       </w:r>
-      <w:hyperlink w:history="1" r:id="rIdmmilmrkbuoma1i1zvygml">
+      <w:hyperlink w:history="1" r:id="rIdu-mjclv9kb2jz0aa_yfjn">
         <w:r>
           <w:rPr>
             <w:color w:val="000000"/>
@@ -905,6 +905,12 @@
           <w:t xml:space="preserve">https://ranenabner.github.io/restorecheck/</w:t>
         </w:r>
       </w:hyperlink>
+      <w:r>
+        <w:t xml:space="preserve">.</w:t>
+      </w:r>
+      <w:r>
+        <w:t xml:space="preserve"> It shows every recorded run: the latest result, restore times, which check caught each broken backup, and each run's full report.</w:t>
+      </w:r>
     </w:p>
     <w:p>
       <w:pPr>
@@ -945,7 +951,7 @@
       <w:r>
         <w:t xml:space="preserve"> </w:t>
       </w:r>
-      <w:hyperlink w:history="1" r:id="rIdxmwcmogqthcda7teg2t_p">
+      <w:hyperlink w:history="1" r:id="rIdgfhtl4hvrawv-4pepyz8o">
         <w:r>
           <w:rPr>
             <w:color w:val="000000"/>
@@ -970,7 +976,7 @@
       <w:r>
         <w:t xml:space="preserve"> Ranen Abner, Sai Charan, and S. Vigneshwari, "RestoreCheck: Automated Backup Recoverability Verification and Disaster-Recovery Testing on AWS," GitHub repository, 2026. [Online]. Available: </w:t>
       </w:r>
-      <w:hyperlink w:history="1" r:id="rIdnnxidpsi9kwnih1hoou0-">
+      <w:hyperlink w:history="1" r:id="rIdw84ofit8t1djzhf6lveni">
         <w:r>
           <w:rPr>
             <w:color w:val="000000"/>
@@ -3283,7 +3289,7 @@
           <w:i/>
           <w:iCs/>
         </w:rPr>
-        <w:t xml:space="preserve">[ Insert screenshot: The results site on GitHub Pages ]</w:t>
+        <w:t xml:space="preserve">[ Insert screenshot: The RestoreCheck dashboard on GitHub Pages: latest result, restore time per run and the integrity checks of every run ]</w:t>
       </w:r>
     </w:p>
     <w:p>
@@ -3298,7 +3304,7 @@
           <w:sz w:val="20"/>
           <w:szCs w:val="20"/>
         </w:rPr>
-        <w:t xml:space="preserve">Figure 14. The results site on GitHub Pages</w:t>
+        <w:t xml:space="preserve">Figure 14. The RestoreCheck dashboard on GitHub Pages: latest result, restore time per run and the integrity checks of every run</w:t>
       </w:r>
     </w:p>
     <w:p>
@@ -5029,7 +5035,7 @@
         <w:t xml:space="preserve">Future work.</w:t>
       </w:r>
       <w:r>
-        <w:t xml:space="preserve"> Verifying EC2/EBS volume snapshots and other engines; multi-region restore testing; deriving expectations automatically from the source database; using the checker as the validation step of AWS Backup restore testing; moving the schedule to EventBridge Scheduler; and a live dashboard served from S3 and CloudFront.</w:t>
+        <w:t xml:space="preserve"> Verifying EC2/EBS volume snapshots and other engines; multi-region restore testing; deriving expectations automatically from the source database; using the checker as the validation step of AWS Backup restore testing; moving the schedule to EventBridge Scheduler; and a live version of the dashboard, served from S3 and CloudFront and reading DynamoDB directly.</w:t>
       </w:r>
     </w:p>
     <w:p>
@@ -5051,7 +5057,7 @@
       <w:r>
         <w:t xml:space="preserve">Amazon Web Services, "Data protection in Amazon S3," Amazon S3 User Guide. [Online]. Available: </w:t>
       </w:r>
-      <w:hyperlink w:history="1" r:id="rIdnabrm6giysntivtdc18ku">
+      <w:hyperlink w:history="1" r:id="rIdnrqi9yp0-aamqjcvugxlg">
         <w:r>
           <w:rPr>
             <w:color w:val="000000"/>
@@ -5072,7 +5078,7 @@
       <w:r>
         <w:t xml:space="preserve">Cybersecurity and Infrastructure Security Agency, "#StopRansomware guide." [Online]. Available: </w:t>
       </w:r>
-      <w:hyperlink w:history="1" r:id="rIdbytwaqc1st3yfpvugohuk">
+      <w:hyperlink w:history="1" r:id="rIdad7j-mknpf61yuf_qfuj3">
         <w:r>
           <w:rPr>
             <w:color w:val="000000"/>
@@ -5103,7 +5109,7 @@
       <w:r>
         <w:t xml:space="preserve">, 2003. [Online]. Available: </w:t>
       </w:r>
-      <w:hyperlink w:history="1" r:id="rIdlfniu672tyufntpi140wh">
+      <w:hyperlink w:history="1" r:id="rIdxroeeefkdboz2bxsr5-di">
         <w:r>
           <w:rPr>
             <w:color w:val="000000"/>
@@ -5124,7 +5130,7 @@
       <w:r>
         <w:t xml:space="preserve">Amazon Web Services, "Shared responsibility model." [Online]. Available: </w:t>
       </w:r>
-      <w:hyperlink w:history="1" r:id="rIdjciz0egse2ie9blfqxkj-">
+      <w:hyperlink w:history="1" r:id="rIdzx58zf9lsszq9zrc1gaj6">
         <w:r>
           <w:rPr>
             <w:color w:val="000000"/>
@@ -5158,7 +5164,7 @@
       <w:r>
         <w:t xml:space="preserve">doi: </w:t>
       </w:r>
-      <w:hyperlink w:history="1" r:id="rIdylq_6k_btsxvmgl7807ns">
+      <w:hyperlink w:history="1" r:id="rIdcqi2h2aoecagrdeu_o0yq">
         <w:r>
           <w:rPr>
             <w:color w:val="000000"/>
@@ -5173,7 +5179,7 @@
       <w:r>
         <w:t xml:space="preserve"> Free conference version: </w:t>
       </w:r>
-      <w:hyperlink w:history="1" r:id="rIdllagu8ocg8xzod-fpjidh">
+      <w:hyperlink w:history="1" r:id="rIdpeuggsq2i1qumo53hum8s">
         <w:r>
           <w:rPr>
             <w:color w:val="000000"/>
@@ -5194,7 +5200,7 @@
       <w:r>
         <w:t xml:space="preserve">Amazon Web Services, "Encrypting Amazon RDS resources," Amazon RDS User Guide. [Online]. Available: </w:t>
       </w:r>
-      <w:hyperlink w:history="1" r:id="rIdhwgp7ux9g763vdwmdxheh">
+      <w:hyperlink w:history="1" r:id="rIdi9gp3imni1yv1ptadobbn">
         <w:r>
           <w:rPr>
             <w:color w:val="000000"/>
@@ -5215,7 +5221,7 @@
       <w:r>
         <w:t xml:space="preserve">GitLab Inc., "Postmortem of database outage of January 31," GitLab Blog, Feb. 2017. [Online]. Available: </w:t>
       </w:r>
-      <w:hyperlink w:history="1" r:id="rIdxmrb1ugvebbwnebgk7k-7">
+      <w:hyperlink w:history="1" r:id="rIdwtm09edrm9rvrm5fvdyrt">
         <w:r>
           <w:rPr>
             <w:color w:val="000000"/>
@@ -5236,7 +5242,7 @@
       <w:r>
         <w:t xml:space="preserve">Amazon Web Services, "REL09-BP04 Perform periodic recovery of the data to verify backup integrity and processes," AWS Well-Architected Framework. [Online]. Available: </w:t>
       </w:r>
-      <w:hyperlink w:history="1" r:id="rId0tl_9oh3-nujlqr9g7g1d">
+      <w:hyperlink w:history="1" r:id="rIda5jxb0lprxozp8uhxjkau">
         <w:r>
           <w:rPr>
             <w:color w:val="000000"/>
@@ -5257,7 +5263,7 @@
       <w:r>
         <w:t xml:space="preserve">Amazon Web Services, "Reliability pillar," AWS Well-Architected Framework. [Online]. Available: </w:t>
       </w:r>
-      <w:hyperlink w:history="1" r:id="rIdhu-syiev1pdxbxalhrjjz">
+      <w:hyperlink w:history="1" r:id="rIdd_hlxiy488lfhp9czp9is">
         <w:r>
           <w:rPr>
             <w:color w:val="000000"/>
@@ -5281,7 +5287,7 @@
       <w:r>
         <w:t xml:space="preserve">doi: </w:t>
       </w:r>
-      <w:hyperlink w:history="1" r:id="rId4d9qkn3zsz768dfnxbnyp">
+      <w:hyperlink w:history="1" r:id="rIdzajzvyxdxzqpaq098oihc">
         <w:r>
           <w:rPr>
             <w:color w:val="000000"/>
@@ -5308,7 +5314,7 @@
       <w:r>
         <w:t xml:space="preserve">doi: </w:t>
       </w:r>
-      <w:hyperlink w:history="1" r:id="rIdv05gjpmoz_ypwldkid81h">
+      <w:hyperlink w:history="1" r:id="rIdn7cuwyulwuns8bbpd0t-4">
         <w:r>
           <w:rPr>
             <w:color w:val="000000"/>
@@ -5339,7 +5345,7 @@
       <w:r>
         <w:t xml:space="preserve">, ISO/IEC 27031:2011. [Online]. Available: </w:t>
       </w:r>
-      <w:hyperlink w:history="1" r:id="rIdcss0xlbtpfsi2crpvrykx">
+      <w:hyperlink w:history="1" r:id="rId-njg-ge455zirxfeab6bk">
         <w:r>
           <w:rPr>
             <w:color w:val="000000"/>
@@ -5360,7 +5366,7 @@
       <w:r>
         <w:t xml:space="preserve">Amazon Web Services, "Lambda quotas," AWS Lambda Developer Guide. [Online]. Available: </w:t>
       </w:r>
-      <w:hyperlink w:history="1" r:id="rIdx9_1iygq-9ph2r188udhf">
+      <w:hyperlink w:history="1" r:id="rIdnduzrx_5nnqe0hhwc1bwg">
         <w:r>
           <w:rPr>
             <w:color w:val="000000"/>
@@ -5381,7 +5387,7 @@
       <w:r>
         <w:t xml:space="preserve">Amazon Web Services, "What is Step Functions?," AWS Step Functions Developer Guide. [Online]. Available: </w:t>
       </w:r>
-      <w:hyperlink w:history="1" r:id="rId7-xbeztnkjfss_kqqc_rc">
+      <w:hyperlink w:history="1" r:id="rIdzb2wrz0bzdhqdxqvl4eca">
         <w:r>
           <w:rPr>
             <w:color w:val="000000"/>
@@ -5402,7 +5408,7 @@
       <w:r>
         <w:t xml:space="preserve">Amazon Web Services, "Handling errors in Step Functions workflows," AWS Step Functions Developer Guide. [Online]. Available: </w:t>
       </w:r>
-      <w:hyperlink w:history="1" r:id="rIdmvg6jcyi7dbzn6hfxm5su">
+      <w:hyperlink w:history="1" r:id="rIdcm9ztuh0wunyrin9nbtxh">
         <w:r>
           <w:rPr>
             <w:color w:val="000000"/>
@@ -5423,7 +5429,7 @@
       <w:r>
         <w:t xml:space="preserve">Amazon Web Services, "Security best practices in IAM," AWS IAM User Guide. [Online]. Available: </w:t>
       </w:r>
-      <w:hyperlink w:history="1" r:id="rIdqjf-ep74wmhoh_3le5vxs">
+      <w:hyperlink w:history="1" r:id="rId1jxuprg_91x2d2hbbgxou">
         <w:r>
           <w:rPr>
             <w:color w:val="000000"/>
@@ -5444,7 +5450,7 @@
       <w:r>
         <w:t xml:space="preserve">Amazon Web Services, "IAM JSON policy reference," AWS IAM User Guide. [Online]. Available: </w:t>
       </w:r>
-      <w:hyperlink w:history="1" r:id="rId281cquga6u0fihm1dd4wp">
+      <w:hyperlink w:history="1" r:id="rId57fwcroe4oipa1hwa7wj0">
         <w:r>
           <w:rPr>
             <w:color w:val="000000"/>
@@ -5465,7 +5471,7 @@
       <w:r>
         <w:t xml:space="preserve">Amazon Web Services, "IAM database authentication for MariaDB, MySQL, and PostgreSQL," Amazon RDS User Guide. [Online]. Available: </w:t>
       </w:r>
-      <w:hyperlink w:history="1" r:id="rId8tfpgfowlgjfrurhzxx2e">
+      <w:hyperlink w:history="1" r:id="rIdix4j6gkhhkwybejtsxzcr">
         <w:r>
           <w:rPr>
             <w:color w:val="000000"/>
@@ -5486,7 +5492,7 @@
       <w:r>
         <w:t xml:space="preserve">Amazon Web Services, "Using SSL/TLS to encrypt a connection to a DB instance or cluster," Amazon RDS User Guide. [Online]. Available: </w:t>
       </w:r>
-      <w:hyperlink w:history="1" r:id="rIdvxfp6n3mzdnarxtmuhvz4">
+      <w:hyperlink w:history="1" r:id="rIdsfx87aarp6tzgvqvmdfvl">
         <w:r>
           <w:rPr>
             <w:color w:val="000000"/>
@@ -5507,7 +5513,7 @@
       <w:r>
         <w:t xml:space="preserve">Amazon Web Services, "Control traffic to your AWS resources using security groups," Amazon VPC User Guide. [Online]. Available: </w:t>
       </w:r>
-      <w:hyperlink w:history="1" r:id="rIdluibdlde0lynn5aoqfbl9">
+      <w:hyperlink w:history="1" r:id="rId3hwk7lupx4e7aldbirkae">
         <w:r>
           <w:rPr>
             <w:color w:val="000000"/>
@@ -5528,7 +5534,7 @@
       <w:r>
         <w:t xml:space="preserve">Amazon Web Services, "Giving Lambda event functions access to resources in an Amazon VPC," AWS Lambda Developer Guide. [Online]. Available: </w:t>
       </w:r>
-      <w:hyperlink w:history="1" r:id="rIdjaxcx_2to5hejcaza-emc">
+      <w:hyperlink w:history="1" r:id="rIdm66usbyzlmg-gsr5a4bip">
         <w:r>
           <w:rPr>
             <w:color w:val="000000"/>
@@ -5549,7 +5555,7 @@
       <w:r>
         <w:t xml:space="preserve">Amazon Web Services, "What is the AWS Serverless Application Model (AWS SAM)?," AWS SAM Developer Guide. [Online]. Available: </w:t>
       </w:r>
-      <w:hyperlink w:history="1" r:id="rId0gi04pzggacqwxxoezlbr">
+      <w:hyperlink w:history="1" r:id="rIdvwzovollue0zzykk2_vec">
         <w:r>
           <w:rPr>
             <w:color w:val="000000"/>
@@ -5570,7 +5576,7 @@
       <w:r>
         <w:t xml:space="preserve">Amazon Web Services, "What is CloudFormation?," AWS CloudFormation User Guide. [Online]. Available: </w:t>
       </w:r>
-      <w:hyperlink w:history="1" r:id="rIdlwvcvmpoe8eilbeflkil8">
+      <w:hyperlink w:history="1" r:id="rId3gbrejlc2hrwopmpp9hqg">
         <w:r>
           <w:rPr>
             <w:color w:val="000000"/>
@@ -5591,7 +5597,7 @@
       <w:r>
         <w:t xml:space="preserve">United Nations, "Goal 9: Build resilient infrastructure, promote inclusive and sustainable industrialization and foster innovation." [Online]. Available: </w:t>
       </w:r>
-      <w:hyperlink w:history="1" r:id="rIdory0uf_aqcixr-ducowcb">
+      <w:hyperlink w:history="1" r:id="rId4-muczbtee1csy64vhoiv">
         <w:r>
           <w:rPr>
             <w:color w:val="000000"/>
@@ -5612,7 +5618,7 @@
       <w:r>
         <w:t xml:space="preserve">United Nations, "Goal 11: Make cities and human settlements inclusive, safe, resilient and sustainable." [Online]. Available: </w:t>
       </w:r>
-      <w:hyperlink w:history="1" r:id="rIdishe2kuks4iudyztkit9k">
+      <w:hyperlink w:history="1" r:id="rIdemgd7rcp0skcd8strde_9">
         <w:r>
           <w:rPr>
             <w:color w:val="000000"/>
@@ -5643,7 +5649,7 @@
       <w:r>
         <w:t xml:space="preserve">, 2010. [Online]. Available: </w:t>
       </w:r>
-      <w:hyperlink w:history="1" r:id="rIdk77vqgfpzdeypreg8n65r">
+      <w:hyperlink w:history="1" r:id="rIdcivop1yybuqqosndktqkt">
         <w:r>
           <w:rPr>
             <w:color w:val="000000"/>
@@ -5677,7 +5683,7 @@
       <w:r>
         <w:t xml:space="preserve">doi: </w:t>
       </w:r>
-      <w:hyperlink w:history="1" r:id="rIdvvx8xjz4noewyio1rcocl">
+      <w:hyperlink w:history="1" r:id="rIdedofsoc1sindav4hqgxbf">
         <w:r>
           <w:rPr>
             <w:color w:val="000000"/>
@@ -5714,7 +5720,7 @@
       <w:r>
         <w:t xml:space="preserve">doi: </w:t>
       </w:r>
-      <w:hyperlink w:history="1" r:id="rIdan1wymscm6fp2r2ywivfp">
+      <w:hyperlink w:history="1" r:id="rIdn9mxfnr2pgsun59tbbjv4">
         <w:r>
           <w:rPr>
             <w:color w:val="000000"/>
@@ -5751,7 +5757,7 @@
       <w:r>
         <w:t xml:space="preserve">doi: </w:t>
       </w:r>
-      <w:hyperlink w:history="1" r:id="rIdq37sjeegaj8yfxx2ol7ox">
+      <w:hyperlink w:history="1" r:id="rIdfmgfvzdhu8aimp4t7tdso">
         <w:r>
           <w:rPr>
             <w:color w:val="000000"/>
@@ -5785,7 +5791,7 @@
       <w:r>
         <w:t xml:space="preserve">, 2008. [Online]. Available: </w:t>
       </w:r>
-      <w:hyperlink w:history="1" r:id="rIdxgz28fmutvke1yphciojm">
+      <w:hyperlink w:history="1" r:id="rIdjpdez4zejrpvz1p4mvk2j">
         <w:r>
           <w:rPr>
             <w:color w:val="000000"/>
@@ -5816,7 +5822,7 @@
       <w:r>
         <w:t xml:space="preserve">, 2007. [Online]. Available: </w:t>
       </w:r>
-      <w:hyperlink w:history="1" r:id="rIdm5ucf2lwfsenoxhukhkvn">
+      <w:hyperlink w:history="1" r:id="rIddqwudqmalua1skjq9n7ng">
         <w:r>
           <w:rPr>
             <w:color w:val="000000"/>
@@ -5850,7 +5856,7 @@
       <w:r>
         <w:t xml:space="preserve">doi: </w:t>
       </w:r>
-      <w:hyperlink w:history="1" r:id="rIdss3gt7wdr1puwpkb6mdkt">
+      <w:hyperlink w:history="1" r:id="rIdwaohxjrwimhaurarvjuf5">
         <w:r>
           <w:rPr>
             <w:color w:val="000000"/>
@@ -5884,7 +5890,7 @@
       <w:r>
         <w:t xml:space="preserve">, 2014. [Online]. Available: </w:t>
       </w:r>
-      <w:hyperlink w:history="1" r:id="rId4e7gnditrqmhcqe7imymi">
+      <w:hyperlink w:history="1" r:id="rId3e3-wktbmvc13sx50_ra7">
         <w:r>
           <w:rPr>
             <w:color w:val="000000"/>
@@ -5918,7 +5924,7 @@
       <w:r>
         <w:t xml:space="preserve">doi: </w:t>
       </w:r>
-      <w:hyperlink w:history="1" r:id="rId2zybaa5o8fwmwq_kzxe9q">
+      <w:hyperlink w:history="1" r:id="rIddoonnujk9v0dkmlcctfto">
         <w:r>
           <w:rPr>
             <w:color w:val="000000"/>
@@ -5955,7 +5961,7 @@
       <w:r>
         <w:t xml:space="preserve">doi: </w:t>
       </w:r>
-      <w:hyperlink w:history="1" r:id="rIdkh2uppdcsprimbyfwxczk">
+      <w:hyperlink w:history="1" r:id="rIdmyg9x2bd5af33znmpdb06">
         <w:r>
           <w:rPr>
             <w:color w:val="000000"/>
@@ -5989,7 +5995,7 @@
       <w:r>
         <w:t xml:space="preserve">, B. Beyer, C. Jones, J. Petoff, and N. R. Murphy, Eds. Sebastopol, CA, USA: O'Reilly Media, 2016, ch. 26. [Online]. Available: </w:t>
       </w:r>
-      <w:hyperlink w:history="1" r:id="rId-cefixgseayet8nbyu9wu">
+      <w:hyperlink w:history="1" r:id="rIdrqf44r76dnwzkskdkzlpr">
         <w:r>
           <w:rPr>
             <w:color w:val="000000"/>
@@ -6010,7 +6016,7 @@
       <w:r>
         <w:t xml:space="preserve">Amazon Web Services, "Restore testing," AWS Backup Developer Guide. [Online]. Available: </w:t>
       </w:r>
-      <w:hyperlink w:history="1" r:id="rIdvqbqkhiypmg2ogldh8bph">
+      <w:hyperlink w:history="1" r:id="rIdlqddjg6hlg8y2stisykdb">
         <w:r>
           <w:rPr>
             <w:color w:val="000000"/>
@@ -6031,7 +6037,7 @@
       <w:r>
         <w:t xml:space="preserve">Amazon Web Services, "What is AWS Backup?," AWS Backup Developer Guide. [Online]. Available: </w:t>
       </w:r>
-      <w:hyperlink w:history="1" r:id="rIdowydxfg0pgk7ffly9bp9z">
+      <w:hyperlink w:history="1" r:id="rIdkl-nbydzj2tcjau4g_fn7">
         <w:r>
           <w:rPr>
             <w:color w:val="000000"/>
@@ -6052,7 +6058,7 @@
       <w:r>
         <w:t xml:space="preserve">Amazon Web Services, "Amazon States Language." [Online]. Available: </w:t>
       </w:r>
-      <w:hyperlink w:history="1" r:id="rIdgdeidyuxuy2p8i0cr4evn">
+      <w:hyperlink w:history="1" r:id="rIdui0awdlm0bx8ips3uzzcj">
         <w:r>
           <w:rPr>
             <w:color w:val="000000"/>
@@ -6073,7 +6079,7 @@
       <w:r>
         <w:t xml:space="preserve">Amazon Web Services, "Creating a scheduled rule (legacy) in Amazon EventBridge," Amazon EventBridge User Guide. [Online]. Available: </w:t>
       </w:r>
-      <w:hyperlink w:history="1" r:id="rIda8vpez1ugwyqclvvs7lo8">
+      <w:hyperlink w:history="1" r:id="rIdfvzteq_7nz4wvgxhnwjyq">
         <w:r>
           <w:rPr>
             <w:color w:val="000000"/>
@@ -6094,7 +6100,7 @@
       <w:r>
         <w:t xml:space="preserve">Amazon Web Services, "Introduction to backups," Amazon RDS User Guide. [Online]. Available: </w:t>
       </w:r>
-      <w:hyperlink w:history="1" r:id="rIdaagxa8drd3tykvhcwntby">
+      <w:hyperlink w:history="1" r:id="rIdz6kfawzhzcz9f_mbbieqf">
         <w:r>
           <w:rPr>
             <w:color w:val="000000"/>
@@ -6115,7 +6121,7 @@
       <w:r>
         <w:t xml:space="preserve">Amazon Web Services, "Restoring to a DB instance," Amazon RDS User Guide. [Online]. Available: </w:t>
       </w:r>
-      <w:hyperlink w:history="1" r:id="rIdlhjwerjvbhgmhzoohlexq">
+      <w:hyperlink w:history="1" r:id="rIdsrd8sdoiwmqyrosic7qqe">
         <w:r>
           <w:rPr>
             <w:color w:val="000000"/>
@@ -6136,7 +6142,7 @@
       <w:r>
         <w:t xml:space="preserve">Amazon Web Services, "Viewing instance status," Amazon RDS User Guide. [Online]. Available: </w:t>
       </w:r>
-      <w:hyperlink w:history="1" r:id="rId-cf0hezyiohjcpcamvxta">
+      <w:hyperlink w:history="1" r:id="rIdw_dhiijyp32f_ea1vxevc">
         <w:r>
           <w:rPr>
             <w:color w:val="000000"/>
@@ -6157,7 +6163,7 @@
       <w:r>
         <w:t xml:space="preserve">Amazon Web Services, "Core components of Amazon DynamoDB," Amazon DynamoDB Developer Guide. [Online]. Available: </w:t>
       </w:r>
-      <w:hyperlink w:history="1" r:id="rIdmj0ncapol0tzldl20amsd">
+      <w:hyperlink w:history="1" r:id="rIdld3ku50gxplt5zptl3di2">
         <w:r>
           <w:rPr>
             <w:color w:val="000000"/>
@@ -6178,7 +6184,7 @@
       <w:r>
         <w:t xml:space="preserve">Amazon Web Services, "Publish custom metrics (PutMetricData / EMF)," Amazon CloudWatch User Guide. [Online]. Available: </w:t>
       </w:r>
-      <w:hyperlink w:history="1" r:id="rIdofn8i2ht-yif74ohmv1zr">
+      <w:hyperlink w:history="1" r:id="rIdqihesm0cnx304pwuuf7p7">
         <w:r>
           <w:rPr>
             <w:color w:val="000000"/>
@@ -6199,7 +6205,7 @@
       <w:r>
         <w:t xml:space="preserve">Amazon Web Services, "Amazon SNS email subscription setup and management," Amazon SNS Developer Guide. [Online]. Available: </w:t>
       </w:r>
-      <w:hyperlink w:history="1" r:id="rIdphgpd5ay3sffdrskr_ipq">
+      <w:hyperlink w:history="1" r:id="rIdh-dtagxybfbw_d2nlckoz">
         <w:r>
           <w:rPr>
             <w:color w:val="000000"/>
@@ -6220,7 +6226,7 @@
       <w:r>
         <w:t xml:space="preserve">Amazon Web Services, "Using Amazon CloudWatch dashboards," Amazon CloudWatch User Guide. [Online]. Available: </w:t>
       </w:r>
-      <w:hyperlink w:history="1" r:id="rIdxb5yl_jcbp-eg3as5qxlm">
+      <w:hyperlink w:history="1" r:id="rIdo66ucj4p-wz3x78ko-9lu">
         <w:r>
           <w:rPr>
             <w:color w:val="000000"/>
@@ -6241,7 +6247,7 @@
       <w:r>
         <w:t xml:space="preserve">Amazon Web Services, "Service control policies (SCPs)," AWS Organizations User Guide. [Online]. Available: </w:t>
       </w:r>
-      <w:hyperlink w:history="1" r:id="rId3zhnhjgvqwy9nrmapjlmg">
+      <w:hyperlink w:history="1" r:id="rIdoseqxaicn5vw-qg_9lxes">
         <w:r>
           <w:rPr>
             <w:color w:val="000000"/>
@@ -6262,7 +6268,7 @@
       <w:r>
         <w:t xml:space="preserve">Amazon Web Services, "Disaster recovery (DR) objectives," AWS Well-Architected Framework. [Online]. Available: </w:t>
       </w:r>
-      <w:hyperlink w:history="1" r:id="rId7w3xt5u9vcwmfocmu70jy">
+      <w:hyperlink w:history="1" r:id="rIdxzuatzjglh8p-0r21iryt">
         <w:r>
           <w:rPr>
             <w:color w:val="000000"/>
@@ -6283,7 +6289,7 @@
       <w:r>
         <w:t xml:space="preserve">Moto contributors, "Moto: Mock AWS services." [Online]. Available: </w:t>
       </w:r>
-      <w:hyperlink w:history="1" r:id="rIdfhvnuev6-byvopxgyogxm">
+      <w:hyperlink w:history="1" r:id="rIdf5xijwlfnslslpwynyqb6">
         <w:r>
           <w:rPr>
             <w:color w:val="000000"/>
@@ -6307,7 +6313,7 @@
       <w:r>
         <w:t xml:space="preserve">doi: </w:t>
       </w:r>
-      <w:hyperlink w:history="1" r:id="rId-ai8vqd158nbbdsprspba">
+      <w:hyperlink w:history="1" r:id="rIdh6-0sqybn2bgc8rys6ml4">
         <w:r>
           <w:rPr>
             <w:color w:val="000000"/>
@@ -6331,7 +6337,7 @@
       <w:r>
         <w:t xml:space="preserve">Amazon Web Services, "Disaster recovery of workloads on AWS: Recovery in the cloud," AWS Whitepaper. [Online]. Available: </w:t>
       </w:r>
-      <w:hyperlink w:history="1" r:id="rIdosawtupu6xzzkly9axh4p">
+      <w:hyperlink w:history="1" r:id="rIdioropuvaxi_cxnrxhiyvc">
         <w:r>
           <w:rPr>
             <w:color w:val="000000"/>
@@ -6352,7 +6358,7 @@
       <w:r>
         <w:t xml:space="preserve">Amazon Web Services, "Boto3 documentation," AWS SDK for Python. [Online]. Available: </w:t>
       </w:r>
-      <w:hyperlink w:history="1" r:id="rIdvnstvpjtoobokpa8u1nmv">
+      <w:hyperlink w:history="1" r:id="rIds-dv-ewuizayxj2dv7iia">
         <w:r>
           <w:rPr>
             <w:color w:val="000000"/>
@@ -6373,7 +6379,7 @@
       <w:r>
         <w:t xml:space="preserve">The PostgreSQL Global Development Group, "Backup and restore," PostgreSQL Documentation. [Online]. Available: </w:t>
       </w:r>
-      <w:hyperlink w:history="1" r:id="rIdajeifbpfdlzadcydnkfns">
+      <w:hyperlink w:history="1" r:id="rIdka9hlhuk6odbv3aet0j0l">
         <w:r>
           <w:rPr>
             <w:color w:val="000000"/>
@@ -6404,7 +6410,7 @@
       <w:r>
         <w:t xml:space="preserve">, "pg8000: A pure-Python PostgreSQL driver," Python Package Index. [Online]. Available: </w:t>
       </w:r>
-      <w:hyperlink w:history="1" r:id="rIdzygqinird3wdn7jzlr8li">
+      <w:hyperlink w:history="1" r:id="rIdjzdmwe5q3uflnvrcplujp">
         <w:r>
           <w:rPr>
             <w:color w:val="000000"/>
@@ -6425,7 +6431,7 @@
       <w:r>
         <w:t xml:space="preserve">LocalStack, "LocalStack documentation." [Online]. Available: </w:t>
       </w:r>
-      <w:hyperlink w:history="1" r:id="rIdjqrw2gwzdhszgn0-ounjz">
+      <w:hyperlink w:history="1" r:id="rIdg-hoy7uvcbvvon6yn8fwb">
         <w:r>
           <w:rPr>
             <w:color w:val="000000"/>

</xml_diff>

<commit_message>
Report: subsections and explanations for every figure, new diagrams
Architecture section: light architecture diagram, a workflow diagram, and
subsections for services, workflow, checks and design decisions. Screenshots
grouped into nine subsections, each explaining what its figures show. Test
count updated to 82. The GitHub Pages site is no longer part of the report;
the demo link is the video.
</commit_message>
<xml_diff>
--- a/report/RestoreCheck_DA3_Report.docx
+++ b/report/RestoreCheck_DA3_Report.docx
@@ -736,7 +736,7 @@
         <w:t xml:space="preserve">Infrastructure as code.</w:t>
       </w:r>
       <w:r>
-        <w:t xml:space="preserve"> The whole system, including IAM, networking, the workflow and the dashboard, is one AWS SAM template compiled to CloudFormation [22], [23].</w:t>
+        <w:t xml:space="preserve"> The whole system, including IAM, networking, the workflow and the CloudWatch dashboard, is one AWS SAM template compiled to CloudFormation [22], [23].</w:t>
       </w:r>
     </w:p>
     <w:p>
@@ -799,7 +799,7 @@
         <w:t xml:space="preserve">data</w:t>
       </w:r>
       <w:r>
-        <w:t xml:space="preserve">, however, is optional and must be programmed by the customer: AWS's documentation states that validation can be run programmatically but not from the AWS Backup console. RestoreCheck supplies exactly that missing layer (data-level checks, a per-run report, run history, alerting and a dashboard) as transparent, open-source infrastructure as code. It complements AWS Backup rather than replacing it, and its checker could serve as the validation step for AWS Backup restore tests in future.</w:t>
+        <w:t xml:space="preserve">, however, is optional and must be programmed by the customer: AWS's documentation states that validation can be run programmatically but not from the AWS Backup console. RestoreCheck supplies exactly that missing layer (data-level checks, a per-run report, run history, alerting and a CloudWatch dashboard) as transparent, open-source infrastructure as code. It complements AWS Backup rather than replacing it, and its checker could serve as the validation step for AWS Backup restore tests in future.</w:t>
       </w:r>
     </w:p>
     <w:p>
@@ -891,25 +891,10 @@
           <w:b/>
           <w:bCs/>
         </w:rPr>
-        <w:t xml:space="preserve">Dashboard (project website):</w:t>
-      </w:r>
-      <w:r>
-        <w:t xml:space="preserve"> </w:t>
-      </w:r>
-      <w:hyperlink w:history="1" r:id="rIdu-mjclv9kb2jz0aa_yfjn">
-        <w:r>
-          <w:rPr>
-            <w:color w:val="000000"/>
-            <w:u w:val="single"/>
-          </w:rPr>
-          <w:t xml:space="preserve">https://ranenabner.github.io/restorecheck/</w:t>
-        </w:r>
-      </w:hyperlink>
-      <w:r>
-        <w:t xml:space="preserve">.</w:t>
-      </w:r>
-      <w:r>
-        <w:t xml:space="preserve"> It shows every recorded run: the latest result, restore times, which check caught each broken backup, and each run's full report.</w:t>
+        <w:t xml:space="preserve">Demo video:</w:t>
+      </w:r>
+      <w:r>
+        <w:t xml:space="preserve"> [add the link to the recorded demo]</w:t>
       </w:r>
     </w:p>
     <w:p>
@@ -918,40 +903,33 @@
         <w:jc w:val="both"/>
       </w:pPr>
       <w:r>
+        <w:t xml:space="preserve">The video (about two and a half minutes) shows the system running on AWS: the healthy demo database, one value being corrupted, a snapshot being taken, RestoreCheck restoring that snapshot into a temporary database, the run failing on the canary checksum, the alert email, and the CloudWatch dashboard.</w:t>
+      </w:r>
+    </w:p>
+    <w:p>
+      <w:pPr>
+        <w:pStyle w:val="Heading1"/>
+      </w:pPr>
+      <w:r>
+        <w:t xml:space="preserve">6.  GitHub repository link</w:t>
+      </w:r>
+    </w:p>
+    <w:p>
+      <w:pPr>
+        <w:spacing w:after="140"/>
+        <w:jc w:val="both"/>
+      </w:pPr>
+      <w:r>
         <w:rPr>
           <w:b/>
           <w:bCs/>
         </w:rPr>
-        <w:t xml:space="preserve">Demo video:</w:t>
-      </w:r>
-      <w:r>
-        <w:t xml:space="preserve"> [add the link to the recorded demo]</w:t>
-      </w:r>
-    </w:p>
-    <w:p>
-      <w:pPr>
-        <w:pStyle w:val="Heading1"/>
-      </w:pPr>
-      <w:r>
-        <w:t xml:space="preserve">6.  GitHub repository link</w:t>
-      </w:r>
-    </w:p>
-    <w:p>
-      <w:pPr>
-        <w:spacing w:after="140"/>
-        <w:jc w:val="both"/>
-      </w:pPr>
-      <w:r>
-        <w:rPr>
-          <w:b/>
-          <w:bCs/>
-        </w:rPr>
         <w:t xml:space="preserve">Repository:</w:t>
       </w:r>
       <w:r>
         <w:t xml:space="preserve"> </w:t>
       </w:r>
-      <w:hyperlink w:history="1" r:id="rIdgfhtl4hvrawv-4pepyz8o">
+      <w:hyperlink w:history="1" r:id="rIdrkbwhoof_lufvqgvpzzoh">
         <w:r>
           <w:rPr>
             <w:color w:val="000000"/>
@@ -976,7 +954,7 @@
       <w:r>
         <w:t xml:space="preserve"> Ranen Abner, Sai Charan, and S. Vigneshwari, "RestoreCheck: Automated Backup Recoverability Verification and Disaster-Recovery Testing on AWS," GitHub repository, 2026. [Online]. Available: </w:t>
       </w:r>
-      <w:hyperlink w:history="1" r:id="rIdw84ofit8t1djzhf6lveni">
+      <w:hyperlink w:history="1" r:id="rIdmg64s_rya2bpaoz8ayp85">
         <w:r>
           <w:rPr>
             <w:color w:val="000000"/>
@@ -996,6 +974,15 @@
     </w:p>
     <w:p>
       <w:pPr>
+        <w:spacing w:after="140"/>
+        <w:jc w:val="both"/>
+      </w:pPr>
+      <w:r>
+        <w:t xml:space="preserve">RestoreCheck is a serverless system deployed in one AWS region (ap-southeast-2). Figure 1 shows its components: a scheduled trigger, a Step Functions workflow, two Lambda functions, the source database and its temporary restored copy inside a private network, and four services that store and report each result.</w:t>
+      </w:r>
+    </w:p>
+    <w:p>
+      <w:pPr>
         <w:pBdr>
           <w:top w:val="dashed" w:color="000000" w:sz="6" w:space="10"/>
           <w:left w:val="dashed" w:color="000000" w:sz="6" w:space="10"/>
@@ -1010,7 +997,7 @@
           <w:i/>
           <w:iCs/>
         </w:rPr>
-        <w:t xml:space="preserve">[ Insert Figure 1: export docs/architecture.drawio to PNG at app.diagrams.net (File &gt; Export as &gt; PNG, 200%) ]</w:t>
+        <w:t xml:space="preserve">[ Insert Figure 1: RestoreCheck architecture diagram ]</w:t>
       </w:r>
     </w:p>
     <w:p>
@@ -1025,7 +1012,15 @@
           <w:sz w:val="20"/>
           <w:szCs w:val="20"/>
         </w:rPr>
-        <w:t xml:space="preserve">Figure 1. RestoreCheck architecture on AWS (region ap-southeast-2). Numbers match the steps below.</w:t>
+        <w:t xml:space="preserve">Figure 1. RestoreCheck architecture on AWS. The checker Lambda and the temporary database run inside a private VPC; results flow to DynamoDB, S3, CloudWatch and SNS.</w:t>
+      </w:r>
+    </w:p>
+    <w:p>
+      <w:pPr>
+        <w:pStyle w:val="Heading2"/>
+      </w:pPr>
+      <w:r>
+        <w:t xml:space="preserve">7.1  AWS services</w:t>
       </w:r>
     </w:p>
     <w:p>
@@ -1034,155 +1029,8 @@
         <w:jc w:val="both"/>
       </w:pPr>
       <w:r>
-        <w:t xml:space="preserve">A run proceeds as follows (Figure 1). The workflow is defined in the Amazon States Language [39].</w:t>
-      </w:r>
-    </w:p>
-    <w:p>
-      <w:pPr>
-        <w:pStyle w:val="ListParagraph"/>
-        <w:numPr>
-          <w:ilvl w:val="0"/>
-          <w:numId w:val="3"/>
-        </w:numPr>
-        <w:spacing w:after="80"/>
-      </w:pPr>
-      <w:r>
-        <w:rPr>
-          <w:b/>
-          <w:bCs/>
-        </w:rPr>
-        <w:t xml:space="preserve">Start.</w:t>
-      </w:r>
-      <w:r>
-        <w:t xml:space="preserve"> An Amazon EventBridge schedule (nightly by default) starts a Step Functions execution [40]; runs can also be started on demand.</w:t>
-      </w:r>
-    </w:p>
-    <w:p>
-      <w:pPr>
-        <w:pStyle w:val="ListParagraph"/>
-        <w:numPr>
-          <w:ilvl w:val="0"/>
-          <w:numId w:val="3"/>
-        </w:numPr>
-        <w:spacing w:after="80"/>
-      </w:pPr>
-      <w:r>
-        <w:rPr>
-          <w:b/>
-          <w:bCs/>
-        </w:rPr>
-        <w:t xml:space="preserve">Prepare.</w:t>
-      </w:r>
-      <w:r>
-        <w:t xml:space="preserve"> The verifier Lambda deletes stragglers from earlier runs, finds the newest available snapshot of the source database [41] and starts restoring it into a temporary instance named </w:t>
-      </w:r>
-      <w:r>
-        <w:rPr>
-          <w:rFonts w:ascii="Consolas" w:cs="Consolas" w:eastAsia="Consolas" w:hAnsi="Consolas"/>
-          <w:sz w:val="20"/>
-          <w:szCs w:val="20"/>
-        </w:rPr>
-        <w:t xml:space="preserve">restorecheck-tmp-&lt;timestamp&gt;</w:t>
-      </w:r>
-      <w:r>
-        <w:t xml:space="preserve"> [42], placed in a dedicated subnet group and security group, not publicly accessible, with IAM authentication enabled.</w:t>
-      </w:r>
-    </w:p>
-    <w:p>
-      <w:pPr>
-        <w:pStyle w:val="ListParagraph"/>
-        <w:numPr>
-          <w:ilvl w:val="0"/>
-          <w:numId w:val="3"/>
-        </w:numPr>
-        <w:spacing w:after="80"/>
-      </w:pPr>
-      <w:r>
-        <w:rPr>
-          <w:b/>
-          <w:bCs/>
-        </w:rPr>
-        <w:t xml:space="preserve">Wait.</w:t>
-      </w:r>
-      <w:r>
-        <w:t xml:space="preserve"> The workflow waits one minute and asks the verifier for the instance status [43], repeating until it is available. Unrecoverable states (for example </w:t>
-      </w:r>
-      <w:r>
-        <w:rPr>
-          <w:rFonts w:ascii="Consolas" w:cs="Consolas" w:eastAsia="Consolas" w:hAnsi="Consolas"/>
-          <w:sz w:val="20"/>
-          <w:szCs w:val="20"/>
-        </w:rPr>
-        <w:t xml:space="preserve">inaccessible-encryption-credentials</w:t>
-      </w:r>
-      <w:r>
-        <w:t xml:space="preserve">, the unusable-key case) and restores longer than a configurable limit fail immediately.</w:t>
-      </w:r>
-    </w:p>
-    <w:p>
-      <w:pPr>
-        <w:pStyle w:val="ListParagraph"/>
-        <w:numPr>
-          <w:ilvl w:val="0"/>
-          <w:numId w:val="3"/>
-        </w:numPr>
-        <w:spacing w:after="80"/>
-      </w:pPr>
-      <w:r>
-        <w:rPr>
-          <w:b/>
-          <w:bCs/>
-        </w:rPr>
-        <w:t xml:space="preserve">Verify.</w:t>
-      </w:r>
-      <w:r>
-        <w:t xml:space="preserve"> The checker Lambda, inside the VPC [21], connects to the restored database over TLS with an IAM authentication token and runs the integrity checks [18], [19].</w:t>
-      </w:r>
-    </w:p>
-    <w:p>
-      <w:pPr>
-        <w:pStyle w:val="ListParagraph"/>
-        <w:numPr>
-          <w:ilvl w:val="0"/>
-          <w:numId w:val="3"/>
-        </w:numPr>
-        <w:spacing w:after="80"/>
-      </w:pPr>
-      <w:r>
-        <w:rPr>
-          <w:b/>
-          <w:bCs/>
-        </w:rPr>
-        <w:t xml:space="preserve">Teardown.</w:t>
-      </w:r>
-      <w:r>
-        <w:t xml:space="preserve"> The verifier deletes the temporary instance. Every failure in steps 2 to 4 is caught and routed here; an instance that cannot be deleted yet is retried for up to about 49 minutes.</w:t>
-      </w:r>
-    </w:p>
-    <w:p>
-      <w:pPr>
-        <w:pStyle w:val="ListParagraph"/>
-        <w:numPr>
-          <w:ilvl w:val="0"/>
-          <w:numId w:val="3"/>
-        </w:numPr>
-        <w:spacing w:after="80"/>
-      </w:pPr>
-      <w:r>
-        <w:rPr>
-          <w:b/>
-          <w:bCs/>
-        </w:rPr>
-        <w:t xml:space="preserve">Record.</w:t>
-      </w:r>
-      <w:r>
-        <w:t xml:space="preserve"> The verifier writes a JSON report to S3, a history row to DynamoDB [44], and metrics to CloudWatch [45], and publishes an email alert through SNS when the backup did not pass [46]. Failed runs end in a red Fail state, so they are visible in the Step Functions console.</w:t>
-      </w:r>
-    </w:p>
-    <w:p>
-      <w:pPr>
-        <w:spacing w:after="120"/>
-      </w:pPr>
+        <w:t xml:space="preserve">Table 1 lists the AWS services used and the role each one plays.</w:t>
+      </w:r>
     </w:p>
     <w:tbl>
       <w:tblPr>
@@ -1877,7 +1725,7 @@
                 <w:sz w:val="20"/>
                 <w:szCs w:val="20"/>
               </w:rPr>
-              <w:t xml:space="preserve">Logs, custom metrics and a backup-health dashboard with restore-time (RTO) trends [47]</w:t>
+              <w:t xml:space="preserve">Logs, custom metrics and a backup-health dashboard with restore-time (RTO) trends [39]</w:t>
             </w:r>
           </w:p>
         </w:tc>
@@ -2027,7 +1875,209 @@
         <w:pStyle w:val="Heading2"/>
       </w:pPr>
       <w:r>
-        <w:t xml:space="preserve">7.1  Integrity checks</w:t>
+        <w:t xml:space="preserve">7.2  Verification workflow</w:t>
+      </w:r>
+    </w:p>
+    <w:p>
+      <w:pPr>
+        <w:spacing w:after="140"/>
+        <w:jc w:val="both"/>
+      </w:pPr>
+      <w:r>
+        <w:t xml:space="preserve">Each verification is one execution of the Step Functions workflow in Figure 2, defined in the Amazon States Language [40]. Steps 2 to 4 form a loop that waits for the restore to finish; every error in steps 1, 3 or 5 is routed straight to Teardown, so the temporary instance is always deleted.</w:t>
+      </w:r>
+    </w:p>
+    <w:p>
+      <w:pPr>
+        <w:pBdr>
+          <w:top w:val="dashed" w:color="000000" w:sz="6" w:space="10"/>
+          <w:left w:val="dashed" w:color="000000" w:sz="6" w:space="10"/>
+          <w:bottom w:val="dashed" w:color="000000" w:sz="6" w:space="10"/>
+          <w:right w:val="dashed" w:color="000000" w:sz="6" w:space="10"/>
+        </w:pBdr>
+        <w:spacing w:after="120" w:before="240" w:line="360"/>
+        <w:jc w:val="center"/>
+      </w:pPr>
+      <w:r>
+        <w:rPr>
+          <w:i/>
+          <w:iCs/>
+        </w:rPr>
+        <w:t xml:space="preserve">[ Insert Figure 2: verification workflow diagram ]</w:t>
+      </w:r>
+    </w:p>
+    <w:p>
+      <w:pPr>
+        <w:spacing w:after="240"/>
+        <w:jc w:val="center"/>
+      </w:pPr>
+      <w:r>
+        <w:rPr>
+          <w:i/>
+          <w:iCs/>
+          <w:sz w:val="20"/>
+          <w:szCs w:val="20"/>
+        </w:rPr>
+        <w:t xml:space="preserve">Figure 2. The verification workflow in AWS Step Functions, showing which component performs each step.</w:t>
+      </w:r>
+    </w:p>
+    <w:p>
+      <w:pPr>
+        <w:spacing w:after="140"/>
+        <w:jc w:val="both"/>
+      </w:pPr>
+      <w:r>
+        <w:t xml:space="preserve">In detail, a run proceeds as follows:</w:t>
+      </w:r>
+    </w:p>
+    <w:p>
+      <w:pPr>
+        <w:pStyle w:val="ListParagraph"/>
+        <w:numPr>
+          <w:ilvl w:val="0"/>
+          <w:numId w:val="3"/>
+        </w:numPr>
+        <w:spacing w:after="80"/>
+      </w:pPr>
+      <w:r>
+        <w:rPr>
+          <w:b/>
+          <w:bCs/>
+        </w:rPr>
+        <w:t xml:space="preserve">Start.</w:t>
+      </w:r>
+      <w:r>
+        <w:t xml:space="preserve"> An Amazon EventBridge schedule (nightly by default) starts a Step Functions execution [41]; runs can also be started on demand.</w:t>
+      </w:r>
+    </w:p>
+    <w:p>
+      <w:pPr>
+        <w:pStyle w:val="ListParagraph"/>
+        <w:numPr>
+          <w:ilvl w:val="0"/>
+          <w:numId w:val="3"/>
+        </w:numPr>
+        <w:spacing w:after="80"/>
+      </w:pPr>
+      <w:r>
+        <w:rPr>
+          <w:b/>
+          <w:bCs/>
+        </w:rPr>
+        <w:t xml:space="preserve">Prepare.</w:t>
+      </w:r>
+      <w:r>
+        <w:t xml:space="preserve"> The verifier Lambda deletes stragglers from earlier runs, finds the newest available snapshot of the source database [42] and starts restoring it into a temporary instance named </w:t>
+      </w:r>
+      <w:r>
+        <w:rPr>
+          <w:rFonts w:ascii="Consolas" w:cs="Consolas" w:eastAsia="Consolas" w:hAnsi="Consolas"/>
+          <w:sz w:val="20"/>
+          <w:szCs w:val="20"/>
+        </w:rPr>
+        <w:t xml:space="preserve">restorecheck-tmp-&lt;timestamp&gt;</w:t>
+      </w:r>
+      <w:r>
+        <w:t xml:space="preserve"> [43], placed in a dedicated subnet group and security group, not publicly accessible, with IAM authentication enabled.</w:t>
+      </w:r>
+    </w:p>
+    <w:p>
+      <w:pPr>
+        <w:pStyle w:val="ListParagraph"/>
+        <w:numPr>
+          <w:ilvl w:val="0"/>
+          <w:numId w:val="3"/>
+        </w:numPr>
+        <w:spacing w:after="80"/>
+      </w:pPr>
+      <w:r>
+        <w:rPr>
+          <w:b/>
+          <w:bCs/>
+        </w:rPr>
+        <w:t xml:space="preserve">Wait.</w:t>
+      </w:r>
+      <w:r>
+        <w:t xml:space="preserve"> The workflow waits one minute and asks the verifier for the instance status [44], repeating until it is available. Unrecoverable states (for example </w:t>
+      </w:r>
+      <w:r>
+        <w:rPr>
+          <w:rFonts w:ascii="Consolas" w:cs="Consolas" w:eastAsia="Consolas" w:hAnsi="Consolas"/>
+          <w:sz w:val="20"/>
+          <w:szCs w:val="20"/>
+        </w:rPr>
+        <w:t xml:space="preserve">inaccessible-encryption-credentials</w:t>
+      </w:r>
+      <w:r>
+        <w:t xml:space="preserve">, the unusable-key case) and restores longer than a configurable limit fail immediately.</w:t>
+      </w:r>
+    </w:p>
+    <w:p>
+      <w:pPr>
+        <w:pStyle w:val="ListParagraph"/>
+        <w:numPr>
+          <w:ilvl w:val="0"/>
+          <w:numId w:val="3"/>
+        </w:numPr>
+        <w:spacing w:after="80"/>
+      </w:pPr>
+      <w:r>
+        <w:rPr>
+          <w:b/>
+          <w:bCs/>
+        </w:rPr>
+        <w:t xml:space="preserve">Verify.</w:t>
+      </w:r>
+      <w:r>
+        <w:t xml:space="preserve"> The checker Lambda, inside the VPC [21], connects to the restored database over TLS with an IAM authentication token and runs the integrity checks [18], [19].</w:t>
+      </w:r>
+    </w:p>
+    <w:p>
+      <w:pPr>
+        <w:pStyle w:val="ListParagraph"/>
+        <w:numPr>
+          <w:ilvl w:val="0"/>
+          <w:numId w:val="3"/>
+        </w:numPr>
+        <w:spacing w:after="80"/>
+      </w:pPr>
+      <w:r>
+        <w:rPr>
+          <w:b/>
+          <w:bCs/>
+        </w:rPr>
+        <w:t xml:space="preserve">Teardown.</w:t>
+      </w:r>
+      <w:r>
+        <w:t xml:space="preserve"> The verifier deletes the temporary instance. Every earlier failure is caught and routed here; an instance that cannot be deleted yet is retried for up to about 49 minutes.</w:t>
+      </w:r>
+    </w:p>
+    <w:p>
+      <w:pPr>
+        <w:pStyle w:val="ListParagraph"/>
+        <w:numPr>
+          <w:ilvl w:val="0"/>
+          <w:numId w:val="3"/>
+        </w:numPr>
+        <w:spacing w:after="80"/>
+      </w:pPr>
+      <w:r>
+        <w:rPr>
+          <w:b/>
+          <w:bCs/>
+        </w:rPr>
+        <w:t xml:space="preserve">Record.</w:t>
+      </w:r>
+      <w:r>
+        <w:t xml:space="preserve"> The verifier writes a JSON report to S3, a history row to DynamoDB [45], and metrics to CloudWatch [46], and publishes an email alert through SNS when the backup did not pass [47]. Failed runs end in a red Fail state, so they are visible in the Step Functions console.</w:t>
+      </w:r>
+    </w:p>
+    <w:p>
+      <w:pPr>
+        <w:pStyle w:val="Heading2"/>
+      </w:pPr>
+      <w:r>
+        <w:t xml:space="preserve">7.3  Integrity checks</w:t>
       </w:r>
     </w:p>
     <w:tbl>
@@ -2754,7 +2804,7 @@
         <w:pStyle w:val="Heading2"/>
       </w:pPr>
       <w:r>
-        <w:t xml:space="preserve">7.2  Key design decisions</w:t>
+        <w:t xml:space="preserve">7.4  Key design decisions</w:t>
       </w:r>
     </w:p>
     <w:p>
@@ -2862,7 +2912,24 @@
         <w:jc w:val="both"/>
       </w:pPr>
       <w:r>
-        <w:t xml:space="preserve">Screenshots taken from the deployed system on AWS (ap-southeast-2) on 21–22 October 2026.</w:t>
+        <w:t xml:space="preserve">The screenshots below were taken from the system deployed on AWS (region ap-southeast-2) between 21 and 25 October 2026. They follow a verification run from deployment to result, and then show how results are monitored, how access is restricted and how the code was tested.</w:t>
+      </w:r>
+    </w:p>
+    <w:p>
+      <w:pPr>
+        <w:pStyle w:val="Heading2"/>
+      </w:pPr>
+      <w:r>
+        <w:t xml:space="preserve">8.1  Deployment with AWS CloudFormation</w:t>
+      </w:r>
+    </w:p>
+    <w:p>
+      <w:pPr>
+        <w:spacing w:after="140"/>
+        <w:jc w:val="both"/>
+      </w:pPr>
+      <w:r>
+        <w:t xml:space="preserve">The whole system is deployed from one AWS SAM template, which CloudFormation turns into the stacks in Figure 3. The demo source database is deliberately a separate stack: in real use RestoreCheck would be pointed at an existing production database rather than create one.</w:t>
       </w:r>
     </w:p>
     <w:p>
@@ -2881,7 +2948,7 @@
           <w:i/>
           <w:iCs/>
         </w:rPr>
-        <w:t xml:space="preserve">[ Insert screenshot: CloudFormation: the deployed restorecheck and restorecheck-demo-db stacks ]</w:t>
+        <w:t xml:space="preserve">[ Insert screenshot: AWS CloudFormation: the deployed restorecheck and restorecheck-demo-db stacks ]</w:t>
       </w:r>
     </w:p>
     <w:p>
@@ -2896,7 +2963,24 @@
           <w:sz w:val="20"/>
           <w:szCs w:val="20"/>
         </w:rPr>
-        <w:t xml:space="preserve">Figure 2. CloudFormation: the deployed restorecheck and restorecheck-demo-db stacks</w:t>
+        <w:t xml:space="preserve">Figure 3. AWS CloudFormation: the deployed restorecheck and restorecheck-demo-db stacks</w:t>
+      </w:r>
+    </w:p>
+    <w:p>
+      <w:pPr>
+        <w:pStyle w:val="Heading2"/>
+      </w:pPr>
+      <w:r>
+        <w:t xml:space="preserve">8.2  A verification run in AWS Step Functions</w:t>
+      </w:r>
+    </w:p>
+    <w:p>
+      <w:pPr>
+        <w:spacing w:after="140"/>
+        <w:jc w:val="both"/>
+      </w:pPr>
+      <w:r>
+        <w:t xml:space="preserve">Figure 4 shows a run in progress: the workflow loops through WaitForRestore and CheckRestoreStatus while the snapshot is being restored. Figure 5 shows a complete run of a healthy backup, in which every step succeeded and the execution ended in BackupVerified.</w:t>
       </w:r>
     </w:p>
     <w:p>
@@ -2915,7 +2999,7 @@
           <w:i/>
           <w:iCs/>
         </w:rPr>
-        <w:t xml:space="preserve">[ Insert screenshot: Step Functions: graph view of a PASSED execution, every step green and ending in BackupVerified ]</w:t>
+        <w:t xml:space="preserve">[ Insert screenshot: AWS Step Functions: a run in progress, waiting for the restored instance to become available ]</w:t>
       </w:r>
     </w:p>
     <w:p>
@@ -2930,7 +3014,7 @@
           <w:sz w:val="20"/>
           <w:szCs w:val="20"/>
         </w:rPr>
-        <w:t xml:space="preserve">Figure 3. Step Functions: graph view of a PASSED execution, every step green and ending in BackupVerified</w:t>
+        <w:t xml:space="preserve">Figure 4. AWS Step Functions: a run in progress, waiting for the restored instance to become available</w:t>
       </w:r>
     </w:p>
     <w:p>
@@ -2949,7 +3033,7 @@
           <w:i/>
           <w:iCs/>
         </w:rPr>
-        <w:t xml:space="preserve">[ Insert screenshot: Step Functions: a run in progress, looping through WaitForRestore and CheckRestoreStatus until the restored instance is available ]</w:t>
+        <w:t xml:space="preserve">[ Insert screenshot: AWS Step Functions: a PASSED execution, every step green and ending in BackupVerified ]</w:t>
       </w:r>
     </w:p>
     <w:p>
@@ -2964,7 +3048,24 @@
           <w:sz w:val="20"/>
           <w:szCs w:val="20"/>
         </w:rPr>
-        <w:t xml:space="preserve">Figure 4. Step Functions: a run in progress, looping through WaitForRestore and CheckRestoreStatus until the restored instance is available</w:t>
+        <w:t xml:space="preserve">Figure 5. AWS Step Functions: a PASSED execution, every step green and ending in BackupVerified</w:t>
+      </w:r>
+    </w:p>
+    <w:p>
+      <w:pPr>
+        <w:pStyle w:val="Heading2"/>
+      </w:pPr>
+      <w:r>
+        <w:t xml:space="preserve">8.3  The temporary restored database</w:t>
+      </w:r>
+    </w:p>
+    <w:p>
+      <w:pPr>
+        <w:spacing w:after="140"/>
+        <w:jc w:val="both"/>
+      </w:pPr>
+      <w:r>
+        <w:t xml:space="preserve">During a run the verifier restores the newest snapshot into a temporary instance named restorecheck-tmp-&lt;timestamp&gt;, which appears beside the source database (Figure 6). It is not publicly accessible, only the checker can reach it, and it is deleted at the end of every run.</w:t>
       </w:r>
     </w:p>
     <w:p>
@@ -2983,7 +3084,7 @@
           <w:i/>
           <w:iCs/>
         </w:rPr>
-        <w:t xml:space="preserve">[ Insert screenshot: Step Functions: the FAILED corrupt-data execution, ending in the red BackupNotVerified state ]</w:t>
+        <w:t xml:space="preserve">[ Insert screenshot: Amazon RDS during a run: the temporary restorecheck-tmp-* instance being created beside the source database ]</w:t>
       </w:r>
     </w:p>
     <w:p>
@@ -2998,7 +3099,24 @@
           <w:sz w:val="20"/>
           <w:szCs w:val="20"/>
         </w:rPr>
-        <w:t xml:space="preserve">Figure 5. Step Functions: the FAILED corrupt-data execution, ending in the red BackupNotVerified state</w:t>
+        <w:t xml:space="preserve">Figure 6. Amazon RDS during a run: the temporary restorecheck-tmp-* instance being created beside the source database</w:t>
+      </w:r>
+    </w:p>
+    <w:p>
+      <w:pPr>
+        <w:pStyle w:val="Heading2"/>
+      </w:pPr>
+      <w:r>
+        <w:t xml:space="preserve">8.4  Detecting a corrupted backup</w:t>
+      </w:r>
+    </w:p>
+    <w:p>
+      <w:pPr>
+        <w:spacing w:after="140"/>
+        <w:jc w:val="both"/>
+      </w:pPr>
+      <w:r>
+        <w:t xml:space="preserve">For the corrupt-data scenario, one value in the canary table was changed before the snapshot was taken. The run failed and ended in the red BackupNotVerified state (Figure 7). The output of the RunIntegrityChecks step (Figure 8) shows why: the instance, connection, tables, row counts and test queries all passed, and only the canary checksum did not match.</w:t>
       </w:r>
     </w:p>
     <w:p>
@@ -3017,7 +3135,7 @@
           <w:i/>
           <w:iCs/>
         </w:rPr>
-        <w:t xml:space="preserve">[ Insert screenshot: Output of the RunIntegrityChecks step in the corrupt-data run: canary_checksum failed while every other check passed ]</w:t>
+        <w:t xml:space="preserve">[ Insert screenshot: AWS Step Functions: the FAILED corrupt-data execution, ending in BackupNotVerified ]</w:t>
       </w:r>
     </w:p>
     <w:p>
@@ -3032,7 +3150,7 @@
           <w:sz w:val="20"/>
           <w:szCs w:val="20"/>
         </w:rPr>
-        <w:t xml:space="preserve">Figure 6. Output of the RunIntegrityChecks step in the corrupt-data run: canary_checksum failed while every other check passed</w:t>
+        <w:t xml:space="preserve">Figure 7. AWS Step Functions: the FAILED corrupt-data execution, ending in BackupNotVerified</w:t>
       </w:r>
     </w:p>
     <w:p>
@@ -3051,7 +3169,7 @@
           <w:i/>
           <w:iCs/>
         </w:rPr>
-        <w:t xml:space="preserve">[ Insert screenshot: RDS console during a run: the temporary restorecheck-tmp-* instance beside the source database ]</w:t>
+        <w:t xml:space="preserve">[ Insert screenshot: Output of the RunIntegrityChecks step in the corrupt-data run: canary_checksum failed while every other check passed ]</w:t>
       </w:r>
     </w:p>
     <w:p>
@@ -3066,7 +3184,24 @@
           <w:sz w:val="20"/>
           <w:szCs w:val="20"/>
         </w:rPr>
-        <w:t xml:space="preserve">Figure 7. RDS console during a run: the temporary restorecheck-tmp-* instance beside the source database</w:t>
+        <w:t xml:space="preserve">Figure 8. Output of the RunIntegrityChecks step in the corrupt-data run: canary_checksum failed while every other check passed</w:t>
+      </w:r>
+    </w:p>
+    <w:p>
+      <w:pPr>
+        <w:pStyle w:val="Heading2"/>
+      </w:pPr>
+      <w:r>
+        <w:t xml:space="preserve">8.5  Alerting with Amazon SNS</w:t>
+      </w:r>
+    </w:p>
+    <w:p>
+      <w:pPr>
+        <w:spacing w:after="140"/>
+        <w:jc w:val="both"/>
+      </w:pPr>
+      <w:r>
+        <w:t xml:space="preserve">When a backup fails verification, the verifier publishes a message to an SNS topic, which emails the team (Figure 9). The message names the backup, the failed check, whether the temporary copy was deleted, and the location of the full report. Healthy runs send nothing.</w:t>
       </w:r>
     </w:p>
     <w:p>
@@ -3085,7 +3220,7 @@
           <w:i/>
           <w:iCs/>
         </w:rPr>
-        <w:t xml:space="preserve">[ Insert screenshot: The SNS alert email received for the corrupt-data backup, naming the failed check ]</w:t>
+        <w:t xml:space="preserve">[ Insert screenshot: The Amazon SNS alert email for the corrupt-data backup ]</w:t>
       </w:r>
     </w:p>
     <w:p>
@@ -3100,7 +3235,24 @@
           <w:sz w:val="20"/>
           <w:szCs w:val="20"/>
         </w:rPr>
-        <w:t xml:space="preserve">Figure 8. The SNS alert email received for the corrupt-data backup, naming the failed check</w:t>
+        <w:t xml:space="preserve">Figure 9. The Amazon SNS alert email for the corrupt-data backup</w:t>
+      </w:r>
+    </w:p>
+    <w:p>
+      <w:pPr>
+        <w:pStyle w:val="Heading2"/>
+      </w:pPr>
+      <w:r>
+        <w:t xml:space="preserve">8.6  Run history and reports</w:t>
+      </w:r>
+    </w:p>
+    <w:p>
+      <w:pPr>
+        <w:spacing w:after="140"/>
+        <w:jc w:val="both"/>
+      </w:pPr>
+      <w:r>
+        <w:t xml:space="preserve">Every run adds one item to the DynamoDB results table (Figure 10), keyed by database and run time, and writes a detailed JSON report to S3 (Figure 11). Together they form a complete audit trail of every verification.</w:t>
       </w:r>
     </w:p>
     <w:p>
@@ -3119,7 +3271,7 @@
           <w:i/>
           <w:iCs/>
         </w:rPr>
-        <w:t xml:space="preserve">[ Insert screenshot: DynamoDB: run history with PASSED, FAILED and ERROR runs ]</w:t>
+        <w:t xml:space="preserve">[ Insert screenshot: Amazon DynamoDB: run history with PASSED, FAILED and ERROR runs ]</w:t>
       </w:r>
     </w:p>
     <w:p>
@@ -3134,7 +3286,7 @@
           <w:sz w:val="20"/>
           <w:szCs w:val="20"/>
         </w:rPr>
-        <w:t xml:space="preserve">Figure 9. DynamoDB: run history with PASSED, FAILED and ERROR runs</w:t>
+        <w:t xml:space="preserve">Figure 10. Amazon DynamoDB: run history with PASSED, FAILED and ERROR runs</w:t>
       </w:r>
     </w:p>
     <w:p>
@@ -3153,7 +3305,7 @@
           <w:i/>
           <w:iCs/>
         </w:rPr>
-        <w:t xml:space="preserve">[ Insert screenshot: S3: the detailed JSON verification report of the corrupt-data run ]</w:t>
+        <w:t xml:space="preserve">[ Insert screenshot: Amazon S3: the detailed JSON report of the corrupt-data run ]</w:t>
       </w:r>
     </w:p>
     <w:p>
@@ -3168,7 +3320,24 @@
           <w:sz w:val="20"/>
           <w:szCs w:val="20"/>
         </w:rPr>
-        <w:t xml:space="preserve">Figure 10. S3: the detailed JSON verification report of the corrupt-data run</w:t>
+        <w:t xml:space="preserve">Figure 11. Amazon S3: the detailed JSON report of the corrupt-data run</w:t>
+      </w:r>
+    </w:p>
+    <w:p>
+      <w:pPr>
+        <w:pStyle w:val="Heading2"/>
+      </w:pPr>
+      <w:r>
+        <w:t xml:space="preserve">8.7  Monitoring with Amazon CloudWatch</w:t>
+      </w:r>
+    </w:p>
+    <w:p>
+      <w:pPr>
+        <w:spacing w:after="140"/>
+        <w:jc w:val="both"/>
+      </w:pPr>
+      <w:r>
+        <w:t xml:space="preserve">The CloudWatch dashboard (Figure 12) tracks whether each backup was verified, how long each restore took (the recovery time objective), the number of successful and failed runs, and Lambda errors. The single verifier error near 13:00 is the expected "no snapshot" error of the no-backup scenario, which is how that ERROR is detected.</w:t>
       </w:r>
     </w:p>
     <w:p>
@@ -3187,7 +3356,7 @@
           <w:i/>
           <w:iCs/>
         </w:rPr>
-        <w:t xml:space="preserve">[ Insert screenshot: CloudWatch: the restorecheck-backup-health dashboard over the scenario runs (21 October, UTC). The single verifier Lambda error near 13:00 is the expected "no snapshot" error of the no-backup scenario, which is how that ERROR is detected ]</w:t>
+        <w:t xml:space="preserve">[ Insert screenshot: Amazon CloudWatch: the restorecheck-backup-health dashboard over the scenario runs (21 October, UTC) ]</w:t>
       </w:r>
     </w:p>
     <w:p>
@@ -3202,7 +3371,24 @@
           <w:sz w:val="20"/>
           <w:szCs w:val="20"/>
         </w:rPr>
-        <w:t xml:space="preserve">Figure 11. CloudWatch: the restorecheck-backup-health dashboard over the scenario runs (21 October, UTC). The single verifier Lambda error near 13:00 is the expected "no snapshot" error of the no-backup scenario, which is how that ERROR is detected</w:t>
+        <w:t xml:space="preserve">Figure 12. Amazon CloudWatch: the restorecheck-backup-health dashboard over the scenario runs (21 October, UTC)</w:t>
+      </w:r>
+    </w:p>
+    <w:p>
+      <w:pPr>
+        <w:pStyle w:val="Heading2"/>
+      </w:pPr>
+      <w:r>
+        <w:t xml:space="preserve">8.8  Least-privilege IAM policies</w:t>
+      </w:r>
+    </w:p>
+    <w:p>
+      <w:pPr>
+        <w:spacing w:after="140"/>
+        <w:jc w:val="both"/>
+      </w:pPr>
+      <w:r>
+        <w:t xml:space="preserve">Each Lambda function has its own custom JSON policy. The verifier's policy (Figure 13) allows restoring and deleting only instances whose names start with restorecheck-tmp-, and writing only to this stack's table, bucket and topic. The checker's policy (Figure 14) allows little more than attaching to the VPC and logging in to the database as one read-only user.</w:t>
       </w:r>
     </w:p>
     <w:p>
@@ -3221,7 +3407,7 @@
           <w:i/>
           <w:iCs/>
         </w:rPr>
-        <w:t xml:space="preserve">[ Insert screenshot: IAM: the verifier's custom least-privilege JSON policy ]</w:t>
+        <w:t xml:space="preserve">[ Insert screenshot: AWS IAM: the verifier's custom least-privilege JSON policy ]</w:t>
       </w:r>
     </w:p>
     <w:p>
@@ -3236,7 +3422,7 @@
           <w:sz w:val="20"/>
           <w:szCs w:val="20"/>
         </w:rPr>
-        <w:t xml:space="preserve">Figure 12. IAM: the verifier's custom least-privilege JSON policy</w:t>
+        <w:t xml:space="preserve">Figure 13. AWS IAM: the verifier's custom least-privilege JSON policy</w:t>
       </w:r>
     </w:p>
     <w:p>
@@ -3255,7 +3441,7 @@
           <w:i/>
           <w:iCs/>
         </w:rPr>
-        <w:t xml:space="preserve">[ Insert screenshot: IAM: the checker's custom JSON policy, allowing database login as one user only ]</w:t>
+        <w:t xml:space="preserve">[ Insert screenshot: AWS IAM: the checker's custom JSON policy, allowing database login as one user only ]</w:t>
       </w:r>
     </w:p>
     <w:p>
@@ -3270,7 +3456,24 @@
           <w:sz w:val="20"/>
           <w:szCs w:val="20"/>
         </w:rPr>
-        <w:t xml:space="preserve">Figure 13. IAM: the checker's custom JSON policy, allowing database login as one user only</w:t>
+        <w:t xml:space="preserve">Figure 14. AWS IAM: the checker's custom JSON policy, allowing database login as one user only</w:t>
+      </w:r>
+    </w:p>
+    <w:p>
+      <w:pPr>
+        <w:pStyle w:val="Heading2"/>
+      </w:pPr>
+      <w:r>
+        <w:t xml:space="preserve">8.9  Automated testing</w:t>
+      </w:r>
+    </w:p>
+    <w:p>
+      <w:pPr>
+        <w:spacing w:after="140"/>
+        <w:jc w:val="both"/>
+      </w:pPr>
+      <w:r>
+        <w:t xml:space="preserve">All 82 automated tests pass (Figure 15). They run against a local fake of AWS, so the suite is free to run and needs no AWS account (see the Results section).</w:t>
       </w:r>
     </w:p>
     <w:p>
@@ -3289,7 +3492,7 @@
           <w:i/>
           <w:iCs/>
         </w:rPr>
-        <w:t xml:space="preserve">[ Insert screenshot: The RestoreCheck dashboard on GitHub Pages: latest result, restore time per run and the integrity checks of every run ]</w:t>
+        <w:t xml:space="preserve">[ Insert screenshot: Automated test suite (pytest): 82 tests passed ]</w:t>
       </w:r>
     </w:p>
     <w:p>
@@ -3304,41 +3507,7 @@
           <w:sz w:val="20"/>
           <w:szCs w:val="20"/>
         </w:rPr>
-        <w:t xml:space="preserve">Figure 14. The RestoreCheck dashboard on GitHub Pages: latest result, restore time per run and the integrity checks of every run</w:t>
-      </w:r>
-    </w:p>
-    <w:p>
-      <w:pPr>
-        <w:pBdr>
-          <w:top w:val="dashed" w:color="000000" w:sz="6" w:space="10"/>
-          <w:left w:val="dashed" w:color="000000" w:sz="6" w:space="10"/>
-          <w:bottom w:val="dashed" w:color="000000" w:sz="6" w:space="10"/>
-          <w:right w:val="dashed" w:color="000000" w:sz="6" w:space="10"/>
-        </w:pBdr>
-        <w:spacing w:after="120" w:before="240" w:line="360"/>
-        <w:jc w:val="center"/>
-      </w:pPr>
-      <w:r>
-        <w:rPr>
-          <w:i/>
-          <w:iCs/>
-        </w:rPr>
-        <w:t xml:space="preserve">[ Insert screenshot: Automated test suite output (pytest): 76 tests passed ]</w:t>
-      </w:r>
-    </w:p>
-    <w:p>
-      <w:pPr>
-        <w:spacing w:after="240"/>
-        <w:jc w:val="center"/>
-      </w:pPr>
-      <w:r>
-        <w:rPr>
-          <w:i/>
-          <w:iCs/>
-          <w:sz w:val="20"/>
-          <w:szCs w:val="20"/>
-        </w:rPr>
-        <w:t xml:space="preserve">Figure 15. Automated test suite output (pytest): 76 tests passed</w:t>
+        <w:t xml:space="preserve">Figure 15. Automated test suite (pytest): 82 tests passed</w:t>
       </w:r>
     </w:p>
     <w:p>
@@ -4986,7 +5155,7 @@
         <w:jc w:val="both"/>
       </w:pPr>
       <w:r>
-        <w:t xml:space="preserve">The code is covered by 76 automated tests (pytest), run against an in-process fake of AWS (moto [50]) and a scripted fake database. Key guarantees were mutation-tested: deliberately removing the teardown call, removing a Catch rule from the workflow, disabling IAM database authentication or the concurrent-run protection each makes the tests fail. The templates pass cfn-lint and the official SAM translator. Testing on AWS also found two real defects, both fixed: the straggler sweep could delete an instance belonging to a concurrent run, and redeploying without the alert-email parameter would silently remove the email subscription.</w:t>
+        <w:t xml:space="preserve">The code is covered by 82 automated tests (pytest), run against an in-process fake of AWS (moto [50]) and a scripted fake database. Key guarantees were mutation-tested: deliberately removing the teardown call, removing a Catch rule from the workflow, disabling IAM database authentication or the concurrent-run protection each makes the tests fail. The templates pass cfn-lint and the official SAM translator. Testing on AWS also found two real defects, both fixed: the straggler sweep could delete an instance belonging to a concurrent run, and redeploying without the alert-email parameter would silently remove the email subscription.</w:t>
       </w:r>
     </w:p>
     <w:p>
@@ -5035,7 +5204,7 @@
         <w:t xml:space="preserve">Future work.</w:t>
       </w:r>
       <w:r>
-        <w:t xml:space="preserve"> Verifying EC2/EBS volume snapshots and other engines; multi-region restore testing; deriving expectations automatically from the source database; using the checker as the validation step of AWS Backup restore testing; moving the schedule to EventBridge Scheduler; and a live version of the dashboard, served from S3 and CloudFront and reading DynamoDB directly.</w:t>
+        <w:t xml:space="preserve"> Verifying EC2/EBS volume snapshots and other engines; multi-region restore testing; deriving expectations automatically from the source database; using the checker as the validation step of AWS Backup restore testing; moving the schedule to EventBridge Scheduler; and a web interface for browsing the run history.</w:t>
       </w:r>
     </w:p>
     <w:p>
@@ -5057,7 +5226,7 @@
       <w:r>
         <w:t xml:space="preserve">Amazon Web Services, "Data protection in Amazon S3," Amazon S3 User Guide. [Online]. Available: </w:t>
       </w:r>
-      <w:hyperlink w:history="1" r:id="rIdnrqi9yp0-aamqjcvugxlg">
+      <w:hyperlink w:history="1" r:id="rIdag6sd7zm7weiqlnxmvszf">
         <w:r>
           <w:rPr>
             <w:color w:val="000000"/>
@@ -5078,7 +5247,7 @@
       <w:r>
         <w:t xml:space="preserve">Cybersecurity and Infrastructure Security Agency, "#StopRansomware guide." [Online]. Available: </w:t>
       </w:r>
-      <w:hyperlink w:history="1" r:id="rIdad7j-mknpf61yuf_qfuj3">
+      <w:hyperlink w:history="1" r:id="rIdwafzbz4d0uhy5votgdzev">
         <w:r>
           <w:rPr>
             <w:color w:val="000000"/>
@@ -5109,7 +5278,7 @@
       <w:r>
         <w:t xml:space="preserve">, 2003. [Online]. Available: </w:t>
       </w:r>
-      <w:hyperlink w:history="1" r:id="rIdxroeeefkdboz2bxsr5-di">
+      <w:hyperlink w:history="1" r:id="rId5lrbfnpeukv5fhvq5mkrp">
         <w:r>
           <w:rPr>
             <w:color w:val="000000"/>
@@ -5130,7 +5299,7 @@
       <w:r>
         <w:t xml:space="preserve">Amazon Web Services, "Shared responsibility model." [Online]. Available: </w:t>
       </w:r>
-      <w:hyperlink w:history="1" r:id="rIdzx58zf9lsszq9zrc1gaj6">
+      <w:hyperlink w:history="1" r:id="rIdx1ep1v_mfe1bz3r6wc0zr">
         <w:r>
           <w:rPr>
             <w:color w:val="000000"/>
@@ -5164,7 +5333,7 @@
       <w:r>
         <w:t xml:space="preserve">doi: </w:t>
       </w:r>
-      <w:hyperlink w:history="1" r:id="rIdcqi2h2aoecagrdeu_o0yq">
+      <w:hyperlink w:history="1" r:id="rIdblrsf_dmptwark4uu1phb">
         <w:r>
           <w:rPr>
             <w:color w:val="000000"/>
@@ -5179,7 +5348,7 @@
       <w:r>
         <w:t xml:space="preserve"> Free conference version: </w:t>
       </w:r>
-      <w:hyperlink w:history="1" r:id="rIdpeuggsq2i1qumo53hum8s">
+      <w:hyperlink w:history="1" r:id="rIdedk7fklzbkcmnde22hgkq">
         <w:r>
           <w:rPr>
             <w:color w:val="000000"/>
@@ -5200,7 +5369,7 @@
       <w:r>
         <w:t xml:space="preserve">Amazon Web Services, "Encrypting Amazon RDS resources," Amazon RDS User Guide. [Online]. Available: </w:t>
       </w:r>
-      <w:hyperlink w:history="1" r:id="rIdi9gp3imni1yv1ptadobbn">
+      <w:hyperlink w:history="1" r:id="rIdchh_npntv7kocexm7lbwm">
         <w:r>
           <w:rPr>
             <w:color w:val="000000"/>
@@ -5221,7 +5390,7 @@
       <w:r>
         <w:t xml:space="preserve">GitLab Inc., "Postmortem of database outage of January 31," GitLab Blog, Feb. 2017. [Online]. Available: </w:t>
       </w:r>
-      <w:hyperlink w:history="1" r:id="rIdwtm09edrm9rvrm5fvdyrt">
+      <w:hyperlink w:history="1" r:id="rIdewaf8ilnquofz3tqrm0z4">
         <w:r>
           <w:rPr>
             <w:color w:val="000000"/>
@@ -5242,7 +5411,7 @@
       <w:r>
         <w:t xml:space="preserve">Amazon Web Services, "REL09-BP04 Perform periodic recovery of the data to verify backup integrity and processes," AWS Well-Architected Framework. [Online]. Available: </w:t>
       </w:r>
-      <w:hyperlink w:history="1" r:id="rIda5jxb0lprxozp8uhxjkau">
+      <w:hyperlink w:history="1" r:id="rIdoby8ohidxcgq35gyydcqp">
         <w:r>
           <w:rPr>
             <w:color w:val="000000"/>
@@ -5263,7 +5432,7 @@
       <w:r>
         <w:t xml:space="preserve">Amazon Web Services, "Reliability pillar," AWS Well-Architected Framework. [Online]. Available: </w:t>
       </w:r>
-      <w:hyperlink w:history="1" r:id="rIdd_hlxiy488lfhp9czp9is">
+      <w:hyperlink w:history="1" r:id="rIdgq0dmvdhz-x3r2foztmmr">
         <w:r>
           <w:rPr>
             <w:color w:val="000000"/>
@@ -5287,7 +5456,7 @@
       <w:r>
         <w:t xml:space="preserve">doi: </w:t>
       </w:r>
-      <w:hyperlink w:history="1" r:id="rIdzajzvyxdxzqpaq098oihc">
+      <w:hyperlink w:history="1" r:id="rIdkni8q9xwxmx9ut2vxm7t1">
         <w:r>
           <w:rPr>
             <w:color w:val="000000"/>
@@ -5314,7 +5483,7 @@
       <w:r>
         <w:t xml:space="preserve">doi: </w:t>
       </w:r>
-      <w:hyperlink w:history="1" r:id="rIdn7cuwyulwuns8bbpd0t-4">
+      <w:hyperlink w:history="1" r:id="rIdogdzcn7uc_svqlao8tnfo">
         <w:r>
           <w:rPr>
             <w:color w:val="000000"/>
@@ -5345,7 +5514,7 @@
       <w:r>
         <w:t xml:space="preserve">, ISO/IEC 27031:2011. [Online]. Available: </w:t>
       </w:r>
-      <w:hyperlink w:history="1" r:id="rId-njg-ge455zirxfeab6bk">
+      <w:hyperlink w:history="1" r:id="rIdbjkbxw_pnpizghdcqqlhm">
         <w:r>
           <w:rPr>
             <w:color w:val="000000"/>
@@ -5366,7 +5535,7 @@
       <w:r>
         <w:t xml:space="preserve">Amazon Web Services, "Lambda quotas," AWS Lambda Developer Guide. [Online]. Available: </w:t>
       </w:r>
-      <w:hyperlink w:history="1" r:id="rIdnduzrx_5nnqe0hhwc1bwg">
+      <w:hyperlink w:history="1" r:id="rId7ka6rae-gukij374bae91">
         <w:r>
           <w:rPr>
             <w:color w:val="000000"/>
@@ -5387,7 +5556,7 @@
       <w:r>
         <w:t xml:space="preserve">Amazon Web Services, "What is Step Functions?," AWS Step Functions Developer Guide. [Online]. Available: </w:t>
       </w:r>
-      <w:hyperlink w:history="1" r:id="rIdzb2wrz0bzdhqdxqvl4eca">
+      <w:hyperlink w:history="1" r:id="rIdzm51yiyysmh3zrtvqwh5u">
         <w:r>
           <w:rPr>
             <w:color w:val="000000"/>
@@ -5408,7 +5577,7 @@
       <w:r>
         <w:t xml:space="preserve">Amazon Web Services, "Handling errors in Step Functions workflows," AWS Step Functions Developer Guide. [Online]. Available: </w:t>
       </w:r>
-      <w:hyperlink w:history="1" r:id="rIdcm9ztuh0wunyrin9nbtxh">
+      <w:hyperlink w:history="1" r:id="rIdrif1nvwxt4aftc4emcfgo">
         <w:r>
           <w:rPr>
             <w:color w:val="000000"/>
@@ -5429,7 +5598,7 @@
       <w:r>
         <w:t xml:space="preserve">Amazon Web Services, "Security best practices in IAM," AWS IAM User Guide. [Online]. Available: </w:t>
       </w:r>
-      <w:hyperlink w:history="1" r:id="rId1jxuprg_91x2d2hbbgxou">
+      <w:hyperlink w:history="1" r:id="rIdp7rsq15jyohju2r5-ze8n">
         <w:r>
           <w:rPr>
             <w:color w:val="000000"/>
@@ -5450,7 +5619,7 @@
       <w:r>
         <w:t xml:space="preserve">Amazon Web Services, "IAM JSON policy reference," AWS IAM User Guide. [Online]. Available: </w:t>
       </w:r>
-      <w:hyperlink w:history="1" r:id="rId57fwcroe4oipa1hwa7wj0">
+      <w:hyperlink w:history="1" r:id="rIdz8zyktdfedn1tuhgzvdim">
         <w:r>
           <w:rPr>
             <w:color w:val="000000"/>
@@ -5471,7 +5640,7 @@
       <w:r>
         <w:t xml:space="preserve">Amazon Web Services, "IAM database authentication for MariaDB, MySQL, and PostgreSQL," Amazon RDS User Guide. [Online]. Available: </w:t>
       </w:r>
-      <w:hyperlink w:history="1" r:id="rIdix4j6gkhhkwybejtsxzcr">
+      <w:hyperlink w:history="1" r:id="rIdxsrolz0jjveysew9oay-a">
         <w:r>
           <w:rPr>
             <w:color w:val="000000"/>
@@ -5492,7 +5661,7 @@
       <w:r>
         <w:t xml:space="preserve">Amazon Web Services, "Using SSL/TLS to encrypt a connection to a DB instance or cluster," Amazon RDS User Guide. [Online]. Available: </w:t>
       </w:r>
-      <w:hyperlink w:history="1" r:id="rIdsfx87aarp6tzgvqvmdfvl">
+      <w:hyperlink w:history="1" r:id="rIdyznytbmplypx9ktlfpz2h">
         <w:r>
           <w:rPr>
             <w:color w:val="000000"/>
@@ -5513,7 +5682,7 @@
       <w:r>
         <w:t xml:space="preserve">Amazon Web Services, "Control traffic to your AWS resources using security groups," Amazon VPC User Guide. [Online]. Available: </w:t>
       </w:r>
-      <w:hyperlink w:history="1" r:id="rId3hwk7lupx4e7aldbirkae">
+      <w:hyperlink w:history="1" r:id="rIdafs0qd6jisseindjptiyv">
         <w:r>
           <w:rPr>
             <w:color w:val="000000"/>
@@ -5534,7 +5703,7 @@
       <w:r>
         <w:t xml:space="preserve">Amazon Web Services, "Giving Lambda event functions access to resources in an Amazon VPC," AWS Lambda Developer Guide. [Online]. Available: </w:t>
       </w:r>
-      <w:hyperlink w:history="1" r:id="rIdm66usbyzlmg-gsr5a4bip">
+      <w:hyperlink w:history="1" r:id="rId84iqhbbuxbeopoz77hsmn">
         <w:r>
           <w:rPr>
             <w:color w:val="000000"/>
@@ -5555,7 +5724,7 @@
       <w:r>
         <w:t xml:space="preserve">Amazon Web Services, "What is the AWS Serverless Application Model (AWS SAM)?," AWS SAM Developer Guide. [Online]. Available: </w:t>
       </w:r>
-      <w:hyperlink w:history="1" r:id="rIdvwzovollue0zzykk2_vec">
+      <w:hyperlink w:history="1" r:id="rIdzwb5anyfthmualbdo2qyf">
         <w:r>
           <w:rPr>
             <w:color w:val="000000"/>
@@ -5576,7 +5745,7 @@
       <w:r>
         <w:t xml:space="preserve">Amazon Web Services, "What is CloudFormation?," AWS CloudFormation User Guide. [Online]. Available: </w:t>
       </w:r>
-      <w:hyperlink w:history="1" r:id="rId3gbrejlc2hrwopmpp9hqg">
+      <w:hyperlink w:history="1" r:id="rIdzv9rn55pzpowhz_unxzom">
         <w:r>
           <w:rPr>
             <w:color w:val="000000"/>
@@ -5597,7 +5766,7 @@
       <w:r>
         <w:t xml:space="preserve">United Nations, "Goal 9: Build resilient infrastructure, promote inclusive and sustainable industrialization and foster innovation." [Online]. Available: </w:t>
       </w:r>
-      <w:hyperlink w:history="1" r:id="rId4-muczbtee1csy64vhoiv">
+      <w:hyperlink w:history="1" r:id="rIdifx4cyztplmqhraywvj6n">
         <w:r>
           <w:rPr>
             <w:color w:val="000000"/>
@@ -5618,7 +5787,7 @@
       <w:r>
         <w:t xml:space="preserve">United Nations, "Goal 11: Make cities and human settlements inclusive, safe, resilient and sustainable." [Online]. Available: </w:t>
       </w:r>
-      <w:hyperlink w:history="1" r:id="rIdemgd7rcp0skcd8strde_9">
+      <w:hyperlink w:history="1" r:id="rIdfkml0jyado-xgugkjkpi-">
         <w:r>
           <w:rPr>
             <w:color w:val="000000"/>
@@ -5649,7 +5818,7 @@
       <w:r>
         <w:t xml:space="preserve">, 2010. [Online]. Available: </w:t>
       </w:r>
-      <w:hyperlink w:history="1" r:id="rIdcivop1yybuqqosndktqkt">
+      <w:hyperlink w:history="1" r:id="rIdp9ru8xdpifprcnviza-6q">
         <w:r>
           <w:rPr>
             <w:color w:val="000000"/>
@@ -5683,7 +5852,7 @@
       <w:r>
         <w:t xml:space="preserve">doi: </w:t>
       </w:r>
-      <w:hyperlink w:history="1" r:id="rIdedofsoc1sindav4hqgxbf">
+      <w:hyperlink w:history="1" r:id="rIdm1fagw72mo3fj61nfmvw3">
         <w:r>
           <w:rPr>
             <w:color w:val="000000"/>
@@ -5720,7 +5889,7 @@
       <w:r>
         <w:t xml:space="preserve">doi: </w:t>
       </w:r>
-      <w:hyperlink w:history="1" r:id="rIdn9mxfnr2pgsun59tbbjv4">
+      <w:hyperlink w:history="1" r:id="rIdvijxmmfze60ndebybsu43">
         <w:r>
           <w:rPr>
             <w:color w:val="000000"/>
@@ -5757,7 +5926,7 @@
       <w:r>
         <w:t xml:space="preserve">doi: </w:t>
       </w:r>
-      <w:hyperlink w:history="1" r:id="rIdfmgfvzdhu8aimp4t7tdso">
+      <w:hyperlink w:history="1" r:id="rIdwknu5apfvbp9nr4omvdcu">
         <w:r>
           <w:rPr>
             <w:color w:val="000000"/>
@@ -5791,7 +5960,7 @@
       <w:r>
         <w:t xml:space="preserve">, 2008. [Online]. Available: </w:t>
       </w:r>
-      <w:hyperlink w:history="1" r:id="rIdjpdez4zejrpvz1p4mvk2j">
+      <w:hyperlink w:history="1" r:id="rIdyqxe1v_qc08flnlcnhmhi">
         <w:r>
           <w:rPr>
             <w:color w:val="000000"/>
@@ -5822,7 +5991,7 @@
       <w:r>
         <w:t xml:space="preserve">, 2007. [Online]. Available: </w:t>
       </w:r>
-      <w:hyperlink w:history="1" r:id="rIddqwudqmalua1skjq9n7ng">
+      <w:hyperlink w:history="1" r:id="rIdsachskvygl-qjnidfwss4">
         <w:r>
           <w:rPr>
             <w:color w:val="000000"/>
@@ -5856,7 +6025,7 @@
       <w:r>
         <w:t xml:space="preserve">doi: </w:t>
       </w:r>
-      <w:hyperlink w:history="1" r:id="rIdwaohxjrwimhaurarvjuf5">
+      <w:hyperlink w:history="1" r:id="rId8hmuvefhd0vtwzqriuxc-">
         <w:r>
           <w:rPr>
             <w:color w:val="000000"/>
@@ -5890,7 +6059,7 @@
       <w:r>
         <w:t xml:space="preserve">, 2014. [Online]. Available: </w:t>
       </w:r>
-      <w:hyperlink w:history="1" r:id="rId3e3-wktbmvc13sx50_ra7">
+      <w:hyperlink w:history="1" r:id="rIdi_wqh9phbtip3wdcfrgdd">
         <w:r>
           <w:rPr>
             <w:color w:val="000000"/>
@@ -5924,7 +6093,7 @@
       <w:r>
         <w:t xml:space="preserve">doi: </w:t>
       </w:r>
-      <w:hyperlink w:history="1" r:id="rIddoonnujk9v0dkmlcctfto">
+      <w:hyperlink w:history="1" r:id="rIdajyosiphnn-ycvyio3ng-">
         <w:r>
           <w:rPr>
             <w:color w:val="000000"/>
@@ -5961,7 +6130,7 @@
       <w:r>
         <w:t xml:space="preserve">doi: </w:t>
       </w:r>
-      <w:hyperlink w:history="1" r:id="rIdmyg9x2bd5af33znmpdb06">
+      <w:hyperlink w:history="1" r:id="rIdeyjrm_txgeae4jjhq_nsl">
         <w:r>
           <w:rPr>
             <w:color w:val="000000"/>
@@ -5995,7 +6164,7 @@
       <w:r>
         <w:t xml:space="preserve">, B. Beyer, C. Jones, J. Petoff, and N. R. Murphy, Eds. Sebastopol, CA, USA: O'Reilly Media, 2016, ch. 26. [Online]. Available: </w:t>
       </w:r>
-      <w:hyperlink w:history="1" r:id="rIdrqf44r76dnwzkskdkzlpr">
+      <w:hyperlink w:history="1" r:id="rIdomkkcpdl_srmym59ttbb6">
         <w:r>
           <w:rPr>
             <w:color w:val="000000"/>
@@ -6016,7 +6185,7 @@
       <w:r>
         <w:t xml:space="preserve">Amazon Web Services, "Restore testing," AWS Backup Developer Guide. [Online]. Available: </w:t>
       </w:r>
-      <w:hyperlink w:history="1" r:id="rIdlqddjg6hlg8y2stisykdb">
+      <w:hyperlink w:history="1" r:id="rId0gply1z3ickoebkjmisok">
         <w:r>
           <w:rPr>
             <w:color w:val="000000"/>
@@ -6037,7 +6206,7 @@
       <w:r>
         <w:t xml:space="preserve">Amazon Web Services, "What is AWS Backup?," AWS Backup Developer Guide. [Online]. Available: </w:t>
       </w:r>
-      <w:hyperlink w:history="1" r:id="rIdkl-nbydzj2tcjau4g_fn7">
+      <w:hyperlink w:history="1" r:id="rIde2beesl38i1izrjryyscz">
         <w:r>
           <w:rPr>
             <w:color w:val="000000"/>
@@ -6056,9 +6225,30 @@
         <w:t xml:space="preserve">[39] </w:t>
       </w:r>
       <w:r>
+        <w:t xml:space="preserve">Amazon Web Services, "Using Amazon CloudWatch dashboards," Amazon CloudWatch User Guide. [Online]. Available: </w:t>
+      </w:r>
+      <w:hyperlink w:history="1" r:id="rIdmxev1ydr8vwmpba1xz1z9">
+        <w:r>
+          <w:rPr>
+            <w:color w:val="000000"/>
+            <w:u w:val="single"/>
+          </w:rPr>
+          <w:t xml:space="preserve">https://docs.aws.amazon.com/AmazonCloudWatch/latest/monitoring/CloudWatch_Dashboards.html</w:t>
+        </w:r>
+      </w:hyperlink>
+    </w:p>
+    <w:p>
+      <w:pPr>
+        <w:spacing w:after="100"/>
+        <w:ind w:left="567" w:hanging="567"/>
+      </w:pPr>
+      <w:r>
+        <w:t xml:space="preserve">[40] </w:t>
+      </w:r>
+      <w:r>
         <w:t xml:space="preserve">Amazon Web Services, "Amazon States Language." [Online]. Available: </w:t>
       </w:r>
-      <w:hyperlink w:history="1" r:id="rIdui0awdlm0bx8ips3uzzcj">
+      <w:hyperlink w:history="1" r:id="rIdi-yoo4h4g2srbtnxnfzmu">
         <w:r>
           <w:rPr>
             <w:color w:val="000000"/>
@@ -6074,12 +6264,12 @@
         <w:ind w:left="567" w:hanging="567"/>
       </w:pPr>
       <w:r>
-        <w:t xml:space="preserve">[40] </w:t>
+        <w:t xml:space="preserve">[41] </w:t>
       </w:r>
       <w:r>
         <w:t xml:space="preserve">Amazon Web Services, "Creating a scheduled rule (legacy) in Amazon EventBridge," Amazon EventBridge User Guide. [Online]. Available: </w:t>
       </w:r>
-      <w:hyperlink w:history="1" r:id="rIdfvzteq_7nz4wvgxhnwjyq">
+      <w:hyperlink w:history="1" r:id="rIdjijiqr2cmnwrnjczvqlc4">
         <w:r>
           <w:rPr>
             <w:color w:val="000000"/>
@@ -6095,12 +6285,12 @@
         <w:ind w:left="567" w:hanging="567"/>
       </w:pPr>
       <w:r>
-        <w:t xml:space="preserve">[41] </w:t>
+        <w:t xml:space="preserve">[42] </w:t>
       </w:r>
       <w:r>
         <w:t xml:space="preserve">Amazon Web Services, "Introduction to backups," Amazon RDS User Guide. [Online]. Available: </w:t>
       </w:r>
-      <w:hyperlink w:history="1" r:id="rIdz6kfawzhzcz9f_mbbieqf">
+      <w:hyperlink w:history="1" r:id="rIdda3lqeaanfde6szihgse9">
         <w:r>
           <w:rPr>
             <w:color w:val="000000"/>
@@ -6116,12 +6306,12 @@
         <w:ind w:left="567" w:hanging="567"/>
       </w:pPr>
       <w:r>
-        <w:t xml:space="preserve">[42] </w:t>
+        <w:t xml:space="preserve">[43] </w:t>
       </w:r>
       <w:r>
         <w:t xml:space="preserve">Amazon Web Services, "Restoring to a DB instance," Amazon RDS User Guide. [Online]. Available: </w:t>
       </w:r>
-      <w:hyperlink w:history="1" r:id="rIdsrd8sdoiwmqyrosic7qqe">
+      <w:hyperlink w:history="1" r:id="rId1q8z6tplqgtljjbg4z_pj">
         <w:r>
           <w:rPr>
             <w:color w:val="000000"/>
@@ -6137,12 +6327,12 @@
         <w:ind w:left="567" w:hanging="567"/>
       </w:pPr>
       <w:r>
-        <w:t xml:space="preserve">[43] </w:t>
+        <w:t xml:space="preserve">[44] </w:t>
       </w:r>
       <w:r>
         <w:t xml:space="preserve">Amazon Web Services, "Viewing instance status," Amazon RDS User Guide. [Online]. Available: </w:t>
       </w:r>
-      <w:hyperlink w:history="1" r:id="rIdw_dhiijyp32f_ea1vxevc">
+      <w:hyperlink w:history="1" r:id="rIdaxby4hebuxdwcz3rg-mm4">
         <w:r>
           <w:rPr>
             <w:color w:val="000000"/>
@@ -6158,12 +6348,12 @@
         <w:ind w:left="567" w:hanging="567"/>
       </w:pPr>
       <w:r>
-        <w:t xml:space="preserve">[44] </w:t>
+        <w:t xml:space="preserve">[45] </w:t>
       </w:r>
       <w:r>
         <w:t xml:space="preserve">Amazon Web Services, "Core components of Amazon DynamoDB," Amazon DynamoDB Developer Guide. [Online]. Available: </w:t>
       </w:r>
-      <w:hyperlink w:history="1" r:id="rIdld3ku50gxplt5zptl3di2">
+      <w:hyperlink w:history="1" r:id="rIdf9p9cbxczjbdu45dxtbll">
         <w:r>
           <w:rPr>
             <w:color w:val="000000"/>
@@ -6179,12 +6369,12 @@
         <w:ind w:left="567" w:hanging="567"/>
       </w:pPr>
       <w:r>
-        <w:t xml:space="preserve">[45] </w:t>
+        <w:t xml:space="preserve">[46] </w:t>
       </w:r>
       <w:r>
         <w:t xml:space="preserve">Amazon Web Services, "Publish custom metrics (PutMetricData / EMF)," Amazon CloudWatch User Guide. [Online]. Available: </w:t>
       </w:r>
-      <w:hyperlink w:history="1" r:id="rIdqihesm0cnx304pwuuf7p7">
+      <w:hyperlink w:history="1" r:id="rIdhovoif7hcbdunvjmiq948">
         <w:r>
           <w:rPr>
             <w:color w:val="000000"/>
@@ -6200,12 +6390,12 @@
         <w:ind w:left="567" w:hanging="567"/>
       </w:pPr>
       <w:r>
-        <w:t xml:space="preserve">[46] </w:t>
+        <w:t xml:space="preserve">[47] </w:t>
       </w:r>
       <w:r>
         <w:t xml:space="preserve">Amazon Web Services, "Amazon SNS email subscription setup and management," Amazon SNS Developer Guide. [Online]. Available: </w:t>
       </w:r>
-      <w:hyperlink w:history="1" r:id="rIdh-dtagxybfbw_d2nlckoz">
+      <w:hyperlink w:history="1" r:id="rIdtloc1osn74ilktu5fioqp">
         <w:r>
           <w:rPr>
             <w:color w:val="000000"/>
@@ -6221,33 +6411,12 @@
         <w:ind w:left="567" w:hanging="567"/>
       </w:pPr>
       <w:r>
-        <w:t xml:space="preserve">[47] </w:t>
-      </w:r>
-      <w:r>
-        <w:t xml:space="preserve">Amazon Web Services, "Using Amazon CloudWatch dashboards," Amazon CloudWatch User Guide. [Online]. Available: </w:t>
-      </w:r>
-      <w:hyperlink w:history="1" r:id="rIdo66ucj4p-wz3x78ko-9lu">
-        <w:r>
-          <w:rPr>
-            <w:color w:val="000000"/>
-            <w:u w:val="single"/>
-          </w:rPr>
-          <w:t xml:space="preserve">https://docs.aws.amazon.com/AmazonCloudWatch/latest/monitoring/CloudWatch_Dashboards.html</w:t>
-        </w:r>
-      </w:hyperlink>
-    </w:p>
-    <w:p>
-      <w:pPr>
-        <w:spacing w:after="100"/>
-        <w:ind w:left="567" w:hanging="567"/>
-      </w:pPr>
-      <w:r>
         <w:t xml:space="preserve">[48] </w:t>
       </w:r>
       <w:r>
         <w:t xml:space="preserve">Amazon Web Services, "Service control policies (SCPs)," AWS Organizations User Guide. [Online]. Available: </w:t>
       </w:r>
-      <w:hyperlink w:history="1" r:id="rIdoseqxaicn5vw-qg_9lxes">
+      <w:hyperlink w:history="1" r:id="rIddh9qk98rljbbvkpxlqntx">
         <w:r>
           <w:rPr>
             <w:color w:val="000000"/>
@@ -6268,7 +6437,7 @@
       <w:r>
         <w:t xml:space="preserve">Amazon Web Services, "Disaster recovery (DR) objectives," AWS Well-Architected Framework. [Online]. Available: </w:t>
       </w:r>
-      <w:hyperlink w:history="1" r:id="rIdxzuatzjglh8p-0r21iryt">
+      <w:hyperlink w:history="1" r:id="rId1jfo92l5dr_0sal0ombyp">
         <w:r>
           <w:rPr>
             <w:color w:val="000000"/>
@@ -6289,7 +6458,7 @@
       <w:r>
         <w:t xml:space="preserve">Moto contributors, "Moto: Mock AWS services." [Online]. Available: </w:t>
       </w:r>
-      <w:hyperlink w:history="1" r:id="rIdf5xijwlfnslslpwynyqb6">
+      <w:hyperlink w:history="1" r:id="rIdzng2b06rd69fj5z6iaifh">
         <w:r>
           <w:rPr>
             <w:color w:val="000000"/>
@@ -6313,7 +6482,7 @@
       <w:r>
         <w:t xml:space="preserve">doi: </w:t>
       </w:r>
-      <w:hyperlink w:history="1" r:id="rIdh6-0sqybn2bgc8rys6ml4">
+      <w:hyperlink w:history="1" r:id="rIdqfe7zskwftozohtlmvrob">
         <w:r>
           <w:rPr>
             <w:color w:val="000000"/>
@@ -6337,7 +6506,7 @@
       <w:r>
         <w:t xml:space="preserve">Amazon Web Services, "Disaster recovery of workloads on AWS: Recovery in the cloud," AWS Whitepaper. [Online]. Available: </w:t>
       </w:r>
-      <w:hyperlink w:history="1" r:id="rIdioropuvaxi_cxnrxhiyvc">
+      <w:hyperlink w:history="1" r:id="rId9gv9ryanoefkmx-ucwlwp">
         <w:r>
           <w:rPr>
             <w:color w:val="000000"/>
@@ -6358,7 +6527,7 @@
       <w:r>
         <w:t xml:space="preserve">Amazon Web Services, "Boto3 documentation," AWS SDK for Python. [Online]. Available: </w:t>
       </w:r>
-      <w:hyperlink w:history="1" r:id="rIds-dv-ewuizayxj2dv7iia">
+      <w:hyperlink w:history="1" r:id="rIdq7ehg6blpuajwwzf6ybu1">
         <w:r>
           <w:rPr>
             <w:color w:val="000000"/>
@@ -6379,7 +6548,7 @@
       <w:r>
         <w:t xml:space="preserve">The PostgreSQL Global Development Group, "Backup and restore," PostgreSQL Documentation. [Online]. Available: </w:t>
       </w:r>
-      <w:hyperlink w:history="1" r:id="rIdka9hlhuk6odbv3aet0j0l">
+      <w:hyperlink w:history="1" r:id="rIdwfxt0ztridiezmdn8onfs">
         <w:r>
           <w:rPr>
             <w:color w:val="000000"/>
@@ -6410,7 +6579,7 @@
       <w:r>
         <w:t xml:space="preserve">, "pg8000: A pure-Python PostgreSQL driver," Python Package Index. [Online]. Available: </w:t>
       </w:r>
-      <w:hyperlink w:history="1" r:id="rIdjzdmwe5q3uflnvrcplujp">
+      <w:hyperlink w:history="1" r:id="rIdu4hqcxtdfo13sjet4pfjo">
         <w:r>
           <w:rPr>
             <w:color w:val="000000"/>
@@ -6431,7 +6600,7 @@
       <w:r>
         <w:t xml:space="preserve">LocalStack, "LocalStack documentation." [Online]. Available: </w:t>
       </w:r>
-      <w:hyperlink w:history="1" r:id="rIdg-hoy7uvcbvvon6yn8fwb">
+      <w:hyperlink w:history="1" r:id="rIday81jfmj9xny8ls9dxpjr">
         <w:r>
           <w:rPr>
             <w:color w:val="000000"/>

</xml_diff>